<commit_message>
Illustrate KB Library and link article navigation
</commit_message>
<xml_diff>
--- a/docs/KB Library.docx
+++ b/docs/KB Library.docx
@@ -29,28 +29,43 @@
       </w:r>
     </w:p>
     <w:p>
+      <w:r>
+        <w:t>Use the orange KB buttons to jump to an article, then Back to index to return. In Microsoft Word, hold Ctrl while clicking a link if required by your settings. Screenshots illustrate the launcher controls; versions and available apps may change.</w:t>
+      </w:r>
+    </w:p>
+    <w:p>
+      <w:bookmarkStart w:id="1" w:name="KB_Index"/>
       <w:pPr>
         <w:pStyle w:val="Heading1"/>
       </w:pPr>
       <w:r>
         <w:t>Article index</w:t>
       </w:r>
+      <w:bookmarkEnd w:id="1"/>
     </w:p>
     <w:tbl>
       <w:tblPr>
         <w:tblStyle w:val="TableGrid"/>
         <w:tblW w:type="auto" w:w="0"/>
+        <w:tblLayout w:type="fixed"/>
         <w:tblLook w:firstColumn="1" w:firstRow="1" w:lastColumn="0" w:lastRow="0" w:noHBand="0" w:noVBand="1" w:val="04A0"/>
       </w:tblPr>
       <w:tblGrid>
-        <w:gridCol w:w="4896"/>
-        <w:gridCol w:w="4896"/>
+        <w:gridCol w:w="2376"/>
+        <w:gridCol w:w="7416"/>
       </w:tblGrid>
       <w:tr>
         <w:tc>
           <w:tcPr>
-            <w:tcW w:type="dxa" w:w="4896"/>
+            <w:tcW w:type="dxa" w:w="2376"/>
+            <w:vAlign w:val="center"/>
             <w:shd w:fill="EDE8E2"/>
+            <w:tcBorders>
+              <w:top w:val="single" w:sz="4" w:color="D9D9D9"/>
+              <w:left w:val="single" w:sz="4" w:color="D9D9D9"/>
+              <w:bottom w:val="single" w:sz="4" w:color="D9D9D9"/>
+              <w:right w:val="single" w:sz="4" w:color="D9D9D9"/>
+            </w:tcBorders>
           </w:tcPr>
           <w:p>
             <w:r>
@@ -64,8 +79,15 @@
         </w:tc>
         <w:tc>
           <w:tcPr>
-            <w:tcW w:type="dxa" w:w="4896"/>
+            <w:tcW w:type="dxa" w:w="7416"/>
+            <w:vAlign w:val="center"/>
             <w:shd w:fill="EDE8E2"/>
+            <w:tcBorders>
+              <w:top w:val="single" w:sz="4" w:color="D9D9D9"/>
+              <w:left w:val="single" w:sz="4" w:color="D9D9D9"/>
+              <w:bottom w:val="single" w:sz="4" w:color="D9D9D9"/>
+              <w:right w:val="single" w:sz="4" w:color="D9D9D9"/>
+            </w:tcBorders>
           </w:tcPr>
           <w:p>
             <w:r>
@@ -81,384 +103,612 @@
       <w:tr>
         <w:tc>
           <w:tcPr>
-            <w:tcW w:type="dxa" w:w="4896"/>
+            <w:tcW w:type="dxa" w:w="2376"/>
+            <w:vAlign w:val="center"/>
             <w:shd w:fill="F5F5F5"/>
+            <w:tcBorders>
+              <w:top w:val="single" w:sz="4" w:color="D9D9D9"/>
+              <w:left w:val="single" w:sz="4" w:color="D9D9D9"/>
+              <w:bottom w:val="single" w:sz="4" w:color="D9D9D9"/>
+              <w:right w:val="single" w:sz="4" w:color="D9D9D9"/>
+            </w:tcBorders>
           </w:tcPr>
           <w:p>
-            <w:r>
-              <w:rPr>
-                <w:b w:val="0"/>
-                <w:sz w:val="20"/>
-              </w:rPr>
-              <w:t>Launcher-KB1</w:t>
-            </w:r>
+            <w:hyperlink w:anchor="Launcher_KB1" w:history="1">
+              <w:r>
+                <w:rPr>
+                  <w:color w:val="FFFFFF"/>
+                  <w:shd w:fill="CC5500"/>
+                  <w:b/>
+                </w:rPr>
+                <w:t xml:space="preserve">  Launcher‑KB1  </w:t>
+              </w:r>
+            </w:hyperlink>
           </w:p>
         </w:tc>
         <w:tc>
           <w:tcPr>
-            <w:tcW w:type="dxa" w:w="4896"/>
+            <w:tcW w:type="dxa" w:w="7416"/>
+            <w:vAlign w:val="center"/>
             <w:shd w:fill="F5F5F5"/>
+            <w:tcBorders>
+              <w:top w:val="single" w:sz="4" w:color="D9D9D9"/>
+              <w:left w:val="single" w:sz="4" w:color="D9D9D9"/>
+              <w:bottom w:val="single" w:sz="4" w:color="D9D9D9"/>
+              <w:right w:val="single" w:sz="4" w:color="D9D9D9"/>
+            </w:tcBorders>
           </w:tcPr>
           <w:p>
-            <w:r>
-              <w:rPr>
-                <w:b w:val="0"/>
-                <w:sz w:val="20"/>
-              </w:rPr>
-              <w:t>Install the launcher</w:t>
-            </w:r>
+            <w:hyperlink w:anchor="Launcher_KB1" w:history="1">
+              <w:r>
+                <w:rPr>
+                  <w:color w:val="9B4300"/>
+                  <w:u w:val="single"/>
+                </w:rPr>
+                <w:t xml:space="preserve">Install the launcher</w:t>
+              </w:r>
+            </w:hyperlink>
           </w:p>
         </w:tc>
       </w:tr>
       <w:tr>
         <w:tc>
           <w:tcPr>
-            <w:tcW w:type="dxa" w:w="4896"/>
+            <w:tcW w:type="dxa" w:w="2376"/>
+            <w:vAlign w:val="center"/>
             <w:shd w:fill="FFFFFF"/>
+            <w:tcBorders>
+              <w:top w:val="single" w:sz="4" w:color="D9D9D9"/>
+              <w:left w:val="single" w:sz="4" w:color="D9D9D9"/>
+              <w:bottom w:val="single" w:sz="4" w:color="D9D9D9"/>
+              <w:right w:val="single" w:sz="4" w:color="D9D9D9"/>
+            </w:tcBorders>
           </w:tcPr>
           <w:p>
-            <w:r>
-              <w:rPr>
-                <w:b w:val="0"/>
-                <w:sz w:val="20"/>
-              </w:rPr>
-              <w:t>Launcher-KB2</w:t>
-            </w:r>
+            <w:hyperlink w:anchor="Launcher_KB2" w:history="1">
+              <w:r>
+                <w:rPr>
+                  <w:color w:val="FFFFFF"/>
+                  <w:shd w:fill="CC5500"/>
+                  <w:b/>
+                </w:rPr>
+                <w:t xml:space="preserve">  Launcher‑KB2  </w:t>
+              </w:r>
+            </w:hyperlink>
           </w:p>
         </w:tc>
         <w:tc>
           <w:tcPr>
-            <w:tcW w:type="dxa" w:w="4896"/>
+            <w:tcW w:type="dxa" w:w="7416"/>
+            <w:vAlign w:val="center"/>
             <w:shd w:fill="FFFFFF"/>
+            <w:tcBorders>
+              <w:top w:val="single" w:sz="4" w:color="D9D9D9"/>
+              <w:left w:val="single" w:sz="4" w:color="D9D9D9"/>
+              <w:bottom w:val="single" w:sz="4" w:color="D9D9D9"/>
+              <w:right w:val="single" w:sz="4" w:color="D9D9D9"/>
+            </w:tcBorders>
           </w:tcPr>
           <w:p>
-            <w:r>
-              <w:rPr>
-                <w:b w:val="0"/>
-                <w:sz w:val="20"/>
-              </w:rPr>
-              <w:t>Install and update applications</w:t>
-            </w:r>
+            <w:hyperlink w:anchor="Launcher_KB2" w:history="1">
+              <w:r>
+                <w:rPr>
+                  <w:color w:val="9B4300"/>
+                  <w:u w:val="single"/>
+                </w:rPr>
+                <w:t xml:space="preserve">Install and update applications</w:t>
+              </w:r>
+            </w:hyperlink>
           </w:p>
         </w:tc>
       </w:tr>
       <w:tr>
         <w:tc>
           <w:tcPr>
-            <w:tcW w:type="dxa" w:w="4896"/>
+            <w:tcW w:type="dxa" w:w="2376"/>
+            <w:vAlign w:val="center"/>
             <w:shd w:fill="F5F5F5"/>
+            <w:tcBorders>
+              <w:top w:val="single" w:sz="4" w:color="D9D9D9"/>
+              <w:left w:val="single" w:sz="4" w:color="D9D9D9"/>
+              <w:bottom w:val="single" w:sz="4" w:color="D9D9D9"/>
+              <w:right w:val="single" w:sz="4" w:color="D9D9D9"/>
+            </w:tcBorders>
           </w:tcPr>
           <w:p>
-            <w:r>
-              <w:rPr>
-                <w:b w:val="0"/>
-                <w:sz w:val="20"/>
-              </w:rPr>
-              <w:t>Launcher-KB3</w:t>
-            </w:r>
+            <w:hyperlink w:anchor="Launcher_KB3" w:history="1">
+              <w:r>
+                <w:rPr>
+                  <w:color w:val="FFFFFF"/>
+                  <w:shd w:fill="CC5500"/>
+                  <w:b/>
+                </w:rPr>
+                <w:t xml:space="preserve">  Launcher‑KB3  </w:t>
+              </w:r>
+            </w:hyperlink>
           </w:p>
         </w:tc>
         <w:tc>
           <w:tcPr>
-            <w:tcW w:type="dxa" w:w="4896"/>
+            <w:tcW w:type="dxa" w:w="7416"/>
+            <w:vAlign w:val="center"/>
             <w:shd w:fill="F5F5F5"/>
+            <w:tcBorders>
+              <w:top w:val="single" w:sz="4" w:color="D9D9D9"/>
+              <w:left w:val="single" w:sz="4" w:color="D9D9D9"/>
+              <w:bottom w:val="single" w:sz="4" w:color="D9D9D9"/>
+              <w:right w:val="single" w:sz="4" w:color="D9D9D9"/>
+            </w:tcBorders>
           </w:tcPr>
           <w:p>
-            <w:r>
-              <w:rPr>
-                <w:b w:val="0"/>
-                <w:sz w:val="20"/>
-              </w:rPr>
-              <w:t>Profile and social account suggestions</w:t>
-            </w:r>
+            <w:hyperlink w:anchor="Launcher_KB3" w:history="1">
+              <w:r>
+                <w:rPr>
+                  <w:color w:val="9B4300"/>
+                  <w:u w:val="single"/>
+                </w:rPr>
+                <w:t xml:space="preserve">Profile and social account suggestions</w:t>
+              </w:r>
+            </w:hyperlink>
           </w:p>
         </w:tc>
       </w:tr>
       <w:tr>
         <w:tc>
           <w:tcPr>
-            <w:tcW w:type="dxa" w:w="4896"/>
+            <w:tcW w:type="dxa" w:w="2376"/>
+            <w:vAlign w:val="center"/>
             <w:shd w:fill="FFFFFF"/>
+            <w:tcBorders>
+              <w:top w:val="single" w:sz="4" w:color="D9D9D9"/>
+              <w:left w:val="single" w:sz="4" w:color="D9D9D9"/>
+              <w:bottom w:val="single" w:sz="4" w:color="D9D9D9"/>
+              <w:right w:val="single" w:sz="4" w:color="D9D9D9"/>
+            </w:tcBorders>
           </w:tcPr>
           <w:p>
-            <w:r>
-              <w:rPr>
-                <w:b w:val="0"/>
-                <w:sz w:val="20"/>
-              </w:rPr>
-              <w:t>Launcher-KB4</w:t>
-            </w:r>
+            <w:hyperlink w:anchor="Launcher_KB4" w:history="1">
+              <w:r>
+                <w:rPr>
+                  <w:color w:val="FFFFFF"/>
+                  <w:shd w:fill="CC5500"/>
+                  <w:b/>
+                </w:rPr>
+                <w:t xml:space="preserve">  Launcher‑KB4  </w:t>
+              </w:r>
+            </w:hyperlink>
           </w:p>
         </w:tc>
         <w:tc>
           <w:tcPr>
-            <w:tcW w:type="dxa" w:w="4896"/>
+            <w:tcW w:type="dxa" w:w="7416"/>
+            <w:vAlign w:val="center"/>
             <w:shd w:fill="FFFFFF"/>
+            <w:tcBorders>
+              <w:top w:val="single" w:sz="4" w:color="D9D9D9"/>
+              <w:left w:val="single" w:sz="4" w:color="D9D9D9"/>
+              <w:bottom w:val="single" w:sz="4" w:color="D9D9D9"/>
+              <w:right w:val="single" w:sz="4" w:color="D9D9D9"/>
+            </w:tcBorders>
           </w:tcPr>
           <w:p>
-            <w:r>
-              <w:rPr>
-                <w:b w:val="0"/>
-                <w:sz w:val="20"/>
-              </w:rPr>
-              <w:t>TMApps sign in and app access</w:t>
-            </w:r>
+            <w:hyperlink w:anchor="Launcher_KB4" w:history="1">
+              <w:r>
+                <w:rPr>
+                  <w:color w:val="9B4300"/>
+                  <w:u w:val="single"/>
+                </w:rPr>
+                <w:t xml:space="preserve">TMApps sign in and app access</w:t>
+              </w:r>
+            </w:hyperlink>
           </w:p>
         </w:tc>
       </w:tr>
       <w:tr>
         <w:tc>
           <w:tcPr>
-            <w:tcW w:type="dxa" w:w="4896"/>
+            <w:tcW w:type="dxa" w:w="2376"/>
+            <w:vAlign w:val="center"/>
             <w:shd w:fill="F5F5F5"/>
+            <w:tcBorders>
+              <w:top w:val="single" w:sz="4" w:color="D9D9D9"/>
+              <w:left w:val="single" w:sz="4" w:color="D9D9D9"/>
+              <w:bottom w:val="single" w:sz="4" w:color="D9D9D9"/>
+              <w:right w:val="single" w:sz="4" w:color="D9D9D9"/>
+            </w:tcBorders>
           </w:tcPr>
           <w:p>
-            <w:r>
-              <w:rPr>
-                <w:b w:val="0"/>
-                <w:sz w:val="20"/>
-              </w:rPr>
-              <w:t>Launcher-KB5</w:t>
-            </w:r>
+            <w:hyperlink w:anchor="Launcher_KB5" w:history="1">
+              <w:r>
+                <w:rPr>
+                  <w:color w:val="FFFFFF"/>
+                  <w:shd w:fill="CC5500"/>
+                  <w:b/>
+                </w:rPr>
+                <w:t xml:space="preserve">  Launcher‑KB5  </w:t>
+              </w:r>
+            </w:hyperlink>
           </w:p>
         </w:tc>
         <w:tc>
           <w:tcPr>
-            <w:tcW w:type="dxa" w:w="4896"/>
+            <w:tcW w:type="dxa" w:w="7416"/>
+            <w:vAlign w:val="center"/>
             <w:shd w:fill="F5F5F5"/>
+            <w:tcBorders>
+              <w:top w:val="single" w:sz="4" w:color="D9D9D9"/>
+              <w:left w:val="single" w:sz="4" w:color="D9D9D9"/>
+              <w:bottom w:val="single" w:sz="4" w:color="D9D9D9"/>
+              <w:right w:val="single" w:sz="4" w:color="D9D9D9"/>
+            </w:tcBorders>
           </w:tcPr>
           <w:p>
-            <w:r>
-              <w:rPr>
-                <w:b w:val="0"/>
-                <w:sz w:val="20"/>
-              </w:rPr>
-              <w:t>Choose your appearance</w:t>
-            </w:r>
+            <w:hyperlink w:anchor="Launcher_KB5" w:history="1">
+              <w:r>
+                <w:rPr>
+                  <w:color w:val="9B4300"/>
+                  <w:u w:val="single"/>
+                </w:rPr>
+                <w:t xml:space="preserve">Choose your appearance</w:t>
+              </w:r>
+            </w:hyperlink>
           </w:p>
         </w:tc>
       </w:tr>
       <w:tr>
         <w:tc>
           <w:tcPr>
-            <w:tcW w:type="dxa" w:w="4896"/>
+            <w:tcW w:type="dxa" w:w="2376"/>
+            <w:vAlign w:val="center"/>
             <w:shd w:fill="FFFFFF"/>
+            <w:tcBorders>
+              <w:top w:val="single" w:sz="4" w:color="D9D9D9"/>
+              <w:left w:val="single" w:sz="4" w:color="D9D9D9"/>
+              <w:bottom w:val="single" w:sz="4" w:color="D9D9D9"/>
+              <w:right w:val="single" w:sz="4" w:color="D9D9D9"/>
+            </w:tcBorders>
           </w:tcPr>
           <w:p>
-            <w:r>
-              <w:rPr>
-                <w:b w:val="0"/>
-                <w:sz w:val="20"/>
-              </w:rPr>
-              <w:t>Launcher-KB6</w:t>
-            </w:r>
+            <w:hyperlink w:anchor="Launcher_KB6" w:history="1">
+              <w:r>
+                <w:rPr>
+                  <w:color w:val="FFFFFF"/>
+                  <w:shd w:fill="CC5500"/>
+                  <w:b/>
+                </w:rPr>
+                <w:t xml:space="preserve">  Launcher‑KB6  </w:t>
+              </w:r>
+            </w:hyperlink>
           </w:p>
         </w:tc>
         <w:tc>
           <w:tcPr>
-            <w:tcW w:type="dxa" w:w="4896"/>
+            <w:tcW w:type="dxa" w:w="7416"/>
+            <w:vAlign w:val="center"/>
             <w:shd w:fill="FFFFFF"/>
+            <w:tcBorders>
+              <w:top w:val="single" w:sz="4" w:color="D9D9D9"/>
+              <w:left w:val="single" w:sz="4" w:color="D9D9D9"/>
+              <w:bottom w:val="single" w:sz="4" w:color="D9D9D9"/>
+              <w:right w:val="single" w:sz="4" w:color="D9D9D9"/>
+            </w:tcBorders>
           </w:tcPr>
           <w:p>
-            <w:r>
-              <w:rPr>
-                <w:b w:val="0"/>
-                <w:sz w:val="20"/>
-              </w:rPr>
-              <w:t>Reduce resource usage</w:t>
-            </w:r>
+            <w:hyperlink w:anchor="Launcher_KB6" w:history="1">
+              <w:r>
+                <w:rPr>
+                  <w:color w:val="9B4300"/>
+                  <w:u w:val="single"/>
+                </w:rPr>
+                <w:t xml:space="preserve">Reduce resource usage</w:t>
+              </w:r>
+            </w:hyperlink>
           </w:p>
         </w:tc>
       </w:tr>
       <w:tr>
         <w:tc>
           <w:tcPr>
-            <w:tcW w:type="dxa" w:w="4896"/>
+            <w:tcW w:type="dxa" w:w="2376"/>
+            <w:vAlign w:val="center"/>
             <w:shd w:fill="F5F5F5"/>
+            <w:tcBorders>
+              <w:top w:val="single" w:sz="4" w:color="D9D9D9"/>
+              <w:left w:val="single" w:sz="4" w:color="D9D9D9"/>
+              <w:bottom w:val="single" w:sz="4" w:color="D9D9D9"/>
+              <w:right w:val="single" w:sz="4" w:color="D9D9D9"/>
+            </w:tcBorders>
           </w:tcPr>
           <w:p>
-            <w:r>
-              <w:rPr>
-                <w:b w:val="0"/>
-                <w:sz w:val="20"/>
-              </w:rPr>
-              <w:t>Launcher-KB7</w:t>
-            </w:r>
+            <w:hyperlink w:anchor="Launcher_KB7" w:history="1">
+              <w:r>
+                <w:rPr>
+                  <w:color w:val="FFFFFF"/>
+                  <w:shd w:fill="CC5500"/>
+                  <w:b/>
+                </w:rPr>
+                <w:t xml:space="preserve">  Launcher‑KB7  </w:t>
+              </w:r>
+            </w:hyperlink>
           </w:p>
         </w:tc>
         <w:tc>
           <w:tcPr>
-            <w:tcW w:type="dxa" w:w="4896"/>
+            <w:tcW w:type="dxa" w:w="7416"/>
+            <w:vAlign w:val="center"/>
             <w:shd w:fill="F5F5F5"/>
+            <w:tcBorders>
+              <w:top w:val="single" w:sz="4" w:color="D9D9D9"/>
+              <w:left w:val="single" w:sz="4" w:color="D9D9D9"/>
+              <w:bottom w:val="single" w:sz="4" w:color="D9D9D9"/>
+              <w:right w:val="single" w:sz="4" w:color="D9D9D9"/>
+            </w:tcBorders>
           </w:tcPr>
           <w:p>
-            <w:r>
-              <w:rPr>
-                <w:b w:val="0"/>
-                <w:sz w:val="20"/>
-              </w:rPr>
-              <w:t>Review and submit a crash report</w:t>
-            </w:r>
+            <w:hyperlink w:anchor="Launcher_KB7" w:history="1">
+              <w:r>
+                <w:rPr>
+                  <w:color w:val="9B4300"/>
+                  <w:u w:val="single"/>
+                </w:rPr>
+                <w:t xml:space="preserve">Review and submit a crash report</w:t>
+              </w:r>
+            </w:hyperlink>
           </w:p>
         </w:tc>
       </w:tr>
       <w:tr>
         <w:tc>
           <w:tcPr>
-            <w:tcW w:type="dxa" w:w="4896"/>
+            <w:tcW w:type="dxa" w:w="2376"/>
+            <w:vAlign w:val="center"/>
             <w:shd w:fill="FFFFFF"/>
+            <w:tcBorders>
+              <w:top w:val="single" w:sz="4" w:color="D9D9D9"/>
+              <w:left w:val="single" w:sz="4" w:color="D9D9D9"/>
+              <w:bottom w:val="single" w:sz="4" w:color="D9D9D9"/>
+              <w:right w:val="single" w:sz="4" w:color="D9D9D9"/>
+            </w:tcBorders>
           </w:tcPr>
           <w:p>
-            <w:r>
-              <w:rPr>
-                <w:b w:val="0"/>
-                <w:sz w:val="20"/>
-              </w:rPr>
-              <w:t>Launcher-KB8</w:t>
-            </w:r>
+            <w:hyperlink w:anchor="Launcher_KB8" w:history="1">
+              <w:r>
+                <w:rPr>
+                  <w:color w:val="FFFFFF"/>
+                  <w:shd w:fill="CC5500"/>
+                  <w:b/>
+                </w:rPr>
+                <w:t xml:space="preserve">  Launcher‑KB8  </w:t>
+              </w:r>
+            </w:hyperlink>
           </w:p>
         </w:tc>
         <w:tc>
           <w:tcPr>
-            <w:tcW w:type="dxa" w:w="4896"/>
+            <w:tcW w:type="dxa" w:w="7416"/>
+            <w:vAlign w:val="center"/>
             <w:shd w:fill="FFFFFF"/>
+            <w:tcBorders>
+              <w:top w:val="single" w:sz="4" w:color="D9D9D9"/>
+              <w:left w:val="single" w:sz="4" w:color="D9D9D9"/>
+              <w:bottom w:val="single" w:sz="4" w:color="D9D9D9"/>
+              <w:right w:val="single" w:sz="4" w:color="D9D9D9"/>
+            </w:tcBorders>
           </w:tcPr>
           <w:p>
-            <w:r>
-              <w:rPr>
-                <w:b w:val="0"/>
-                <w:sz w:val="20"/>
-              </w:rPr>
-              <w:t>Get help and request changes</w:t>
-            </w:r>
+            <w:hyperlink w:anchor="Launcher_KB8" w:history="1">
+              <w:r>
+                <w:rPr>
+                  <w:color w:val="9B4300"/>
+                  <w:u w:val="single"/>
+                </w:rPr>
+                <w:t xml:space="preserve">Get help and request changes</w:t>
+              </w:r>
+            </w:hyperlink>
           </w:p>
         </w:tc>
       </w:tr>
       <w:tr>
         <w:tc>
           <w:tcPr>
-            <w:tcW w:type="dxa" w:w="4896"/>
+            <w:tcW w:type="dxa" w:w="2376"/>
+            <w:vAlign w:val="center"/>
             <w:shd w:fill="F5F5F5"/>
+            <w:tcBorders>
+              <w:top w:val="single" w:sz="4" w:color="D9D9D9"/>
+              <w:left w:val="single" w:sz="4" w:color="D9D9D9"/>
+              <w:bottom w:val="single" w:sz="4" w:color="D9D9D9"/>
+              <w:right w:val="single" w:sz="4" w:color="D9D9D9"/>
+            </w:tcBorders>
           </w:tcPr>
           <w:p>
-            <w:r>
-              <w:rPr>
-                <w:b w:val="0"/>
-                <w:sz w:val="20"/>
-              </w:rPr>
-              <w:t>Launcher-KB9</w:t>
-            </w:r>
+            <w:hyperlink w:anchor="Launcher_KB9" w:history="1">
+              <w:r>
+                <w:rPr>
+                  <w:color w:val="FFFFFF"/>
+                  <w:shd w:fill="CC5500"/>
+                  <w:b/>
+                </w:rPr>
+                <w:t xml:space="preserve">  Launcher‑KB9  </w:t>
+              </w:r>
+            </w:hyperlink>
           </w:p>
         </w:tc>
         <w:tc>
           <w:tcPr>
-            <w:tcW w:type="dxa" w:w="4896"/>
+            <w:tcW w:type="dxa" w:w="7416"/>
+            <w:vAlign w:val="center"/>
             <w:shd w:fill="F5F5F5"/>
+            <w:tcBorders>
+              <w:top w:val="single" w:sz="4" w:color="D9D9D9"/>
+              <w:left w:val="single" w:sz="4" w:color="D9D9D9"/>
+              <w:bottom w:val="single" w:sz="4" w:color="D9D9D9"/>
+              <w:right w:val="single" w:sz="4" w:color="D9D9D9"/>
+            </w:tcBorders>
           </w:tcPr>
           <w:p>
-            <w:r>
-              <w:rPr>
-                <w:b w:val="0"/>
-                <w:sz w:val="20"/>
-              </w:rPr>
-              <w:t>App details and galleries</w:t>
-            </w:r>
+            <w:hyperlink w:anchor="Launcher_KB9" w:history="1">
+              <w:r>
+                <w:rPr>
+                  <w:color w:val="9B4300"/>
+                  <w:u w:val="single"/>
+                </w:rPr>
+                <w:t xml:space="preserve">App details and galleries</w:t>
+              </w:r>
+            </w:hyperlink>
           </w:p>
         </w:tc>
       </w:tr>
       <w:tr>
         <w:tc>
           <w:tcPr>
-            <w:tcW w:type="dxa" w:w="4896"/>
+            <w:tcW w:type="dxa" w:w="2376"/>
+            <w:vAlign w:val="center"/>
             <w:shd w:fill="FFFFFF"/>
+            <w:tcBorders>
+              <w:top w:val="single" w:sz="4" w:color="D9D9D9"/>
+              <w:left w:val="single" w:sz="4" w:color="D9D9D9"/>
+              <w:bottom w:val="single" w:sz="4" w:color="D9D9D9"/>
+              <w:right w:val="single" w:sz="4" w:color="D9D9D9"/>
+            </w:tcBorders>
           </w:tcPr>
           <w:p>
-            <w:r>
-              <w:rPr>
-                <w:b w:val="0"/>
-                <w:sz w:val="20"/>
-              </w:rPr>
-              <w:t>Launcher-KB10</w:t>
-            </w:r>
+            <w:hyperlink w:anchor="Launcher_KB10" w:history="1">
+              <w:r>
+                <w:rPr>
+                  <w:color w:val="FFFFFF"/>
+                  <w:shd w:fill="CC5500"/>
+                  <w:b/>
+                </w:rPr>
+                <w:t xml:space="preserve">  Launcher‑KB10  </w:t>
+              </w:r>
+            </w:hyperlink>
           </w:p>
         </w:tc>
         <w:tc>
           <w:tcPr>
-            <w:tcW w:type="dxa" w:w="4896"/>
+            <w:tcW w:type="dxa" w:w="7416"/>
+            <w:vAlign w:val="center"/>
             <w:shd w:fill="FFFFFF"/>
+            <w:tcBorders>
+              <w:top w:val="single" w:sz="4" w:color="D9D9D9"/>
+              <w:left w:val="single" w:sz="4" w:color="D9D9D9"/>
+              <w:bottom w:val="single" w:sz="4" w:color="D9D9D9"/>
+              <w:right w:val="single" w:sz="4" w:color="D9D9D9"/>
+            </w:tcBorders>
           </w:tcPr>
           <w:p>
-            <w:r>
-              <w:rPr>
-                <w:b w:val="0"/>
-                <w:sz w:val="20"/>
-              </w:rPr>
-              <w:t>Privacy and local data</w:t>
-            </w:r>
+            <w:hyperlink w:anchor="Launcher_KB10" w:history="1">
+              <w:r>
+                <w:rPr>
+                  <w:color w:val="9B4300"/>
+                  <w:u w:val="single"/>
+                </w:rPr>
+                <w:t xml:space="preserve">Privacy and local data</w:t>
+              </w:r>
+            </w:hyperlink>
           </w:p>
         </w:tc>
       </w:tr>
       <w:tr>
         <w:tc>
           <w:tcPr>
-            <w:tcW w:type="dxa" w:w="4896"/>
+            <w:tcW w:type="dxa" w:w="2376"/>
+            <w:vAlign w:val="center"/>
             <w:shd w:fill="F5F5F5"/>
+            <w:tcBorders>
+              <w:top w:val="single" w:sz="4" w:color="D9D9D9"/>
+              <w:left w:val="single" w:sz="4" w:color="D9D9D9"/>
+              <w:bottom w:val="single" w:sz="4" w:color="D9D9D9"/>
+              <w:right w:val="single" w:sz="4" w:color="D9D9D9"/>
+            </w:tcBorders>
           </w:tcPr>
           <w:p>
-            <w:r>
-              <w:rPr>
-                <w:b w:val="0"/>
-                <w:sz w:val="20"/>
-              </w:rPr>
-              <w:t>Launcher-KB11</w:t>
-            </w:r>
+            <w:hyperlink w:anchor="Launcher_KB11" w:history="1">
+              <w:r>
+                <w:rPr>
+                  <w:color w:val="FFFFFF"/>
+                  <w:shd w:fill="CC5500"/>
+                  <w:b/>
+                </w:rPr>
+                <w:t xml:space="preserve">  Launcher‑KB11  </w:t>
+              </w:r>
+            </w:hyperlink>
           </w:p>
         </w:tc>
         <w:tc>
           <w:tcPr>
-            <w:tcW w:type="dxa" w:w="4896"/>
+            <w:tcW w:type="dxa" w:w="7416"/>
+            <w:vAlign w:val="center"/>
             <w:shd w:fill="F5F5F5"/>
+            <w:tcBorders>
+              <w:top w:val="single" w:sz="4" w:color="D9D9D9"/>
+              <w:left w:val="single" w:sz="4" w:color="D9D9D9"/>
+              <w:bottom w:val="single" w:sz="4" w:color="D9D9D9"/>
+              <w:right w:val="single" w:sz="4" w:color="D9D9D9"/>
+            </w:tcBorders>
           </w:tcPr>
           <w:p>
-            <w:r>
-              <w:rPr>
-                <w:b w:val="0"/>
-                <w:sz w:val="20"/>
-              </w:rPr>
-              <w:t>Search settings and knowledge articles</w:t>
-            </w:r>
+            <w:hyperlink w:anchor="Launcher_KB11" w:history="1">
+              <w:r>
+                <w:rPr>
+                  <w:color w:val="9B4300"/>
+                  <w:u w:val="single"/>
+                </w:rPr>
+                <w:t xml:space="preserve">Search settings and knowledge articles</w:t>
+              </w:r>
+            </w:hyperlink>
           </w:p>
         </w:tc>
       </w:tr>
       <w:tr>
         <w:tc>
           <w:tcPr>
-            <w:tcW w:type="dxa" w:w="4896"/>
+            <w:tcW w:type="dxa" w:w="2376"/>
+            <w:vAlign w:val="center"/>
             <w:shd w:fill="FFFFFF"/>
+            <w:tcBorders>
+              <w:top w:val="single" w:sz="4" w:color="D9D9D9"/>
+              <w:left w:val="single" w:sz="4" w:color="D9D9D9"/>
+              <w:bottom w:val="single" w:sz="4" w:color="D9D9D9"/>
+              <w:right w:val="single" w:sz="4" w:color="D9D9D9"/>
+            </w:tcBorders>
           </w:tcPr>
           <w:p>
-            <w:r>
-              <w:rPr>
-                <w:b w:val="0"/>
-                <w:sz w:val="20"/>
-              </w:rPr>
-              <w:t>Launcher-KB12</w:t>
-            </w:r>
+            <w:hyperlink w:anchor="Launcher_KB12" w:history="1">
+              <w:r>
+                <w:rPr>
+                  <w:color w:val="FFFFFF"/>
+                  <w:shd w:fill="CC5500"/>
+                  <w:b/>
+                </w:rPr>
+                <w:t xml:space="preserve">  Launcher‑KB12  </w:t>
+              </w:r>
+            </w:hyperlink>
           </w:p>
         </w:tc>
         <w:tc>
           <w:tcPr>
-            <w:tcW w:type="dxa" w:w="4896"/>
+            <w:tcW w:type="dxa" w:w="7416"/>
+            <w:vAlign w:val="center"/>
             <w:shd w:fill="FFFFFF"/>
+            <w:tcBorders>
+              <w:top w:val="single" w:sz="4" w:color="D9D9D9"/>
+              <w:left w:val="single" w:sz="4" w:color="D9D9D9"/>
+              <w:bottom w:val="single" w:sz="4" w:color="D9D9D9"/>
+              <w:right w:val="single" w:sz="4" w:color="D9D9D9"/>
+            </w:tcBorders>
           </w:tcPr>
           <w:p>
-            <w:r>
-              <w:rPr>
-                <w:b w:val="0"/>
-                <w:sz w:val="20"/>
-              </w:rPr>
-              <w:t>Troubleshoot platform compatibility</w:t>
-            </w:r>
+            <w:hyperlink w:anchor="Launcher_KB12" w:history="1">
+              <w:r>
+                <w:rPr>
+                  <w:color w:val="9B4300"/>
+                  <w:u w:val="single"/>
+                </w:rPr>
+                <w:t xml:space="preserve">Troubleshoot platform compatibility</w:t>
+              </w:r>
+            </w:hyperlink>
           </w:p>
         </w:tc>
       </w:tr>
@@ -469,20 +719,29 @@
       </w:r>
     </w:p>
     <w:p>
+      <w:bookmarkStart w:id="2" w:name="Launcher_KB1"/>
       <w:pPr>
         <w:pStyle w:val="Heading1"/>
       </w:pPr>
       <w:r>
         <w:t>Launcher KB1 Install the launcher</w:t>
       </w:r>
+      <w:bookmarkEnd w:id="2"/>
     </w:p>
     <w:p>
       <w:pPr>
         <w:keepNext/>
       </w:pPr>
-      <w:r>
-        <w:t>Reference Launcher-KB1</w:t>
-      </w:r>
+      <w:hyperlink w:anchor="KB_Index" w:history="1">
+        <w:r>
+          <w:rPr>
+            <w:color w:val="FFFFFF"/>
+            <w:shd w:fill="CC5500"/>
+            <w:b/>
+          </w:rPr>
+          <w:t xml:space="preserve">  Back to index  </w:t>
+        </w:r>
+      </w:hyperlink>
     </w:p>
     <w:p>
       <w:pPr>
@@ -497,24 +756,114 @@
         <w:keepNext w:val="0"/>
       </w:pPr>
       <w:r>
-        <w:t>On Linux make the AppImage executable; if FUSE is unavailable use --appimage-extract-and-run. Launcher OS support is separate from the apps in its library. See Launcher-KB2 and Launcher-KB12.</w:t>
+        <w:t xml:space="preserve">On Linux make the AppImage executable; if FUSE is unavailable use --appimage-extract-and-run. Launcher OS support is separate from the apps in its library. See </w:t>
+      </w:r>
+      <w:hyperlink w:anchor="Launcher_KB2" w:history="1">
+        <w:r>
+          <w:rPr>
+            <w:color w:val="FFFFFF"/>
+            <w:shd w:fill="CC5500"/>
+            <w:b/>
+          </w:rPr>
+          <w:t xml:space="preserve">  Launcher‑KB2  </w:t>
+        </w:r>
+      </w:hyperlink>
+      <w:r>
+        <w:t xml:space="preserve"> and </w:t>
+      </w:r>
+      <w:hyperlink w:anchor="Launcher_KB12" w:history="1">
+        <w:r>
+          <w:rPr>
+            <w:color w:val="FFFFFF"/>
+            <w:shd w:fill="CC5500"/>
+            <w:b/>
+          </w:rPr>
+          <w:t xml:space="preserve">  Launcher‑KB12  </w:t>
+        </w:r>
+      </w:hyperlink>
+      <w:r>
+        <w:t>.</w:t>
       </w:r>
     </w:p>
     <w:p>
+      <w:pPr>
+        <w:keepNext/>
+        <w:jc w:val="center"/>
+      </w:pPr>
+      <w:r>
+        <w:drawing>
+          <wp:inline xmlns:a="http://schemas.openxmlformats.org/drawingml/2006/main" xmlns:pic="http://schemas.openxmlformats.org/drawingml/2006/picture">
+            <wp:extent cx="6035040" cy="4091553"/>
+            <wp:docPr id="1" name="Picture 1"/>
+            <wp:cNvGraphicFramePr>
+              <a:graphicFrameLocks noChangeAspect="1"/>
+            </wp:cNvGraphicFramePr>
+            <a:graphic>
+              <a:graphicData uri="http://schemas.openxmlformats.org/drawingml/2006/picture">
+                <pic:pic>
+                  <pic:nvPicPr>
+                    <pic:cNvPr id="0" name="image.png"/>
+                    <pic:cNvPicPr/>
+                  </pic:nvPicPr>
+                  <pic:blipFill>
+                    <a:blip r:embed="rId9"/>
+                    <a:stretch>
+                      <a:fillRect/>
+                    </a:stretch>
+                  </pic:blipFill>
+                  <pic:spPr>
+                    <a:xfrm>
+                      <a:off x="0" y="0"/>
+                      <a:ext cx="6035040" cy="4091553"/>
+                    </a:xfrm>
+                    <a:prstGeom prst="rect"/>
+                  </pic:spPr>
+                </pic:pic>
+              </a:graphicData>
+            </a:graphic>
+          </wp:inline>
+        </w:drawing>
+      </w:r>
+    </w:p>
+    <w:p>
+      <w:pPr>
+        <w:pStyle w:val="Caption"/>
+        <w:keepNext w:val="0"/>
+        <w:spacing w:after="240"/>
+      </w:pPr>
+      <w:r>
+        <w:t>The application library after opening the launcher. Available apps depend on your operating system.</w:t>
+      </w:r>
+    </w:p>
+    <w:p>
+      <w:r>
+        <w:br w:type="page"/>
+      </w:r>
+    </w:p>
+    <w:p>
+      <w:bookmarkStart w:id="3" w:name="Launcher_KB2"/>
       <w:pPr>
         <w:pStyle w:val="Heading1"/>
       </w:pPr>
       <w:r>
         <w:t>Launcher KB2 Install and update applications</w:t>
       </w:r>
+      <w:bookmarkEnd w:id="3"/>
     </w:p>
     <w:p>
       <w:pPr>
         <w:keepNext/>
       </w:pPr>
-      <w:r>
-        <w:t>Reference Launcher-KB2</w:t>
-      </w:r>
+      <w:hyperlink w:anchor="KB_Index" w:history="1">
+        <w:r>
+          <w:rPr>
+            <w:color w:val="FFFFFF"/>
+            <w:shd w:fill="CC5500"/>
+            <w:b/>
+          </w:rPr>
+          <w:t xml:space="preserve">  Back to index  </w:t>
+        </w:r>
+      </w:hyperlink>
     </w:p>
     <w:p>
       <w:pPr>
@@ -537,24 +886,114 @@
         <w:keepNext w:val="0"/>
       </w:pPr>
       <w:r>
-        <w:t>See Launcher-KB1 and Launcher-KB10.</w:t>
+        <w:t xml:space="preserve">See </w:t>
+      </w:r>
+      <w:hyperlink w:anchor="Launcher_KB1" w:history="1">
+        <w:r>
+          <w:rPr>
+            <w:color w:val="FFFFFF"/>
+            <w:shd w:fill="CC5500"/>
+            <w:b/>
+          </w:rPr>
+          <w:t xml:space="preserve">  Launcher‑KB1  </w:t>
+        </w:r>
+      </w:hyperlink>
+      <w:r>
+        <w:t xml:space="preserve"> and </w:t>
+      </w:r>
+      <w:hyperlink w:anchor="Launcher_KB10" w:history="1">
+        <w:r>
+          <w:rPr>
+            <w:color w:val="FFFFFF"/>
+            <w:shd w:fill="CC5500"/>
+            <w:b/>
+          </w:rPr>
+          <w:t xml:space="preserve">  Launcher‑KB10  </w:t>
+        </w:r>
+      </w:hyperlink>
+      <w:r>
+        <w:t>.</w:t>
       </w:r>
     </w:p>
     <w:p>
+      <w:pPr>
+        <w:keepNext/>
+        <w:jc w:val="center"/>
+      </w:pPr>
+      <w:r>
+        <w:drawing>
+          <wp:inline xmlns:a="http://schemas.openxmlformats.org/drawingml/2006/main" xmlns:pic="http://schemas.openxmlformats.org/drawingml/2006/picture">
+            <wp:extent cx="5486400" cy="3310128"/>
+            <wp:docPr id="2" name="Picture 2"/>
+            <wp:cNvGraphicFramePr>
+              <a:graphicFrameLocks noChangeAspect="1"/>
+            </wp:cNvGraphicFramePr>
+            <a:graphic>
+              <a:graphicData uri="http://schemas.openxmlformats.org/drawingml/2006/picture">
+                <pic:pic>
+                  <pic:nvPicPr>
+                    <pic:cNvPr id="0" name="image.png"/>
+                    <pic:cNvPicPr/>
+                  </pic:nvPicPr>
+                  <pic:blipFill>
+                    <a:blip r:embed="rId10"/>
+                    <a:stretch>
+                      <a:fillRect/>
+                    </a:stretch>
+                  </pic:blipFill>
+                  <pic:spPr>
+                    <a:xfrm>
+                      <a:off x="0" y="0"/>
+                      <a:ext cx="5486400" cy="3310128"/>
+                    </a:xfrm>
+                    <a:prstGeom prst="rect"/>
+                  </pic:spPr>
+                </pic:pic>
+              </a:graphicData>
+            </a:graphic>
+          </wp:inline>
+        </w:drawing>
+      </w:r>
+    </w:p>
+    <w:p>
+      <w:pPr>
+        <w:pStyle w:val="Caption"/>
+        <w:keepNext w:val="0"/>
+        <w:spacing w:after="240"/>
+      </w:pPr>
+      <w:r>
+        <w:t>App installation offers a destination folder, startup and desktop shortcut options on Windows.</w:t>
+      </w:r>
+    </w:p>
+    <w:p>
+      <w:r>
+        <w:br w:type="page"/>
+      </w:r>
+    </w:p>
+    <w:p>
+      <w:bookmarkStart w:id="4" w:name="Launcher_KB3"/>
       <w:pPr>
         <w:pStyle w:val="Heading1"/>
       </w:pPr>
       <w:r>
         <w:t>Launcher KB3 Profile and social account suggestions</w:t>
       </w:r>
+      <w:bookmarkEnd w:id="4"/>
     </w:p>
     <w:p>
       <w:pPr>
         <w:keepNext/>
       </w:pPr>
-      <w:r>
-        <w:t>Reference Launcher-KB3</w:t>
-      </w:r>
+      <w:hyperlink w:anchor="KB_Index" w:history="1">
+        <w:r>
+          <w:rPr>
+            <w:color w:val="FFFFFF"/>
+            <w:shd w:fill="CC5500"/>
+            <w:b/>
+          </w:rPr>
+          <w:t xml:space="preserve">  Back to index  </w:t>
+        </w:r>
+      </w:hyperlink>
     </w:p>
     <w:p>
       <w:pPr>
@@ -569,24 +1008,109 @@
         <w:keepNext w:val="0"/>
       </w:pPr>
       <w:r>
-        <w:t>Provider passwords and API keys stay in each app. See Launcher-KB4 and Launcher-KB10.</w:t>
+        <w:t xml:space="preserve">Provider passwords and API keys stay in each app. See </w:t>
+      </w:r>
+      <w:hyperlink w:anchor="Launcher_KB4" w:history="1">
+        <w:r>
+          <w:rPr>
+            <w:color w:val="FFFFFF"/>
+            <w:shd w:fill="CC5500"/>
+            <w:b/>
+          </w:rPr>
+          <w:t xml:space="preserve">  Launcher‑KB4  </w:t>
+        </w:r>
+      </w:hyperlink>
+      <w:r>
+        <w:t xml:space="preserve"> and </w:t>
+      </w:r>
+      <w:hyperlink w:anchor="Launcher_KB10" w:history="1">
+        <w:r>
+          <w:rPr>
+            <w:color w:val="FFFFFF"/>
+            <w:shd w:fill="CC5500"/>
+            <w:b/>
+          </w:rPr>
+          <w:t xml:space="preserve">  Launcher‑KB10  </w:t>
+        </w:r>
+      </w:hyperlink>
+      <w:r>
+        <w:t>.</w:t>
       </w:r>
     </w:p>
     <w:p>
+      <w:pPr>
+        <w:keepNext/>
+        <w:jc w:val="center"/>
+      </w:pPr>
+      <w:r>
+        <w:drawing>
+          <wp:inline xmlns:a="http://schemas.openxmlformats.org/drawingml/2006/main" xmlns:pic="http://schemas.openxmlformats.org/drawingml/2006/picture">
+            <wp:extent cx="5029200" cy="4266438"/>
+            <wp:docPr id="3" name="Picture 3"/>
+            <wp:cNvGraphicFramePr>
+              <a:graphicFrameLocks noChangeAspect="1"/>
+            </wp:cNvGraphicFramePr>
+            <a:graphic>
+              <a:graphicData uri="http://schemas.openxmlformats.org/drawingml/2006/picture">
+                <pic:pic>
+                  <pic:nvPicPr>
+                    <pic:cNvPr id="0" name="image.png"/>
+                    <pic:cNvPicPr/>
+                  </pic:nvPicPr>
+                  <pic:blipFill>
+                    <a:blip r:embed="rId11"/>
+                    <a:stretch>
+                      <a:fillRect/>
+                    </a:stretch>
+                  </pic:blipFill>
+                  <pic:spPr>
+                    <a:xfrm>
+                      <a:off x="0" y="0"/>
+                      <a:ext cx="5029200" cy="4266438"/>
+                    </a:xfrm>
+                    <a:prstGeom prst="rect"/>
+                  </pic:spPr>
+                </pic:pic>
+              </a:graphicData>
+            </a:graphic>
+          </wp:inline>
+        </w:drawing>
+      </w:r>
+    </w:p>
+    <w:p>
+      <w:pPr>
+        <w:pStyle w:val="Caption"/>
+        <w:keepNext w:val="0"/>
+        <w:spacing w:after="240"/>
+      </w:pPr>
+      <w:r>
+        <w:t>The optional profile shares suggestions with Mail. Provider authentication is still completed in the app.</w:t>
+      </w:r>
+    </w:p>
+    <w:p>
+      <w:bookmarkStart w:id="5" w:name="Launcher_KB4"/>
       <w:pPr>
         <w:pStyle w:val="Heading1"/>
       </w:pPr>
       <w:r>
         <w:t>Launcher KB4 TMApps sign in and app access</w:t>
       </w:r>
+      <w:bookmarkEnd w:id="5"/>
     </w:p>
     <w:p>
       <w:pPr>
         <w:keepNext/>
       </w:pPr>
-      <w:r>
-        <w:t>Reference Launcher-KB4</w:t>
-      </w:r>
+      <w:hyperlink w:anchor="KB_Index" w:history="1">
+        <w:r>
+          <w:rPr>
+            <w:color w:val="FFFFFF"/>
+            <w:shd w:fill="CC5500"/>
+            <w:b/>
+          </w:rPr>
+          <w:t xml:space="preserve">  Back to index  </w:t>
+        </w:r>
+      </w:hyperlink>
     </w:p>
     <w:p>
       <w:pPr>
@@ -601,24 +1125,64 @@
         <w:keepNext w:val="0"/>
       </w:pPr>
       <w:r>
-        <w:t>Apps must implement the session handoff before they can reuse sign-in. Revoking app access stops future handoffs. See Launcher-KB3 and Launcher-KB10.</w:t>
+        <w:t xml:space="preserve">Apps must implement the session handoff before they can reuse sign-in. Revoking app access stops future handoffs. See </w:t>
+      </w:r>
+      <w:hyperlink w:anchor="Launcher_KB3" w:history="1">
+        <w:r>
+          <w:rPr>
+            <w:color w:val="FFFFFF"/>
+            <w:shd w:fill="CC5500"/>
+            <w:b/>
+          </w:rPr>
+          <w:t xml:space="preserve">  Launcher‑KB3  </w:t>
+        </w:r>
+      </w:hyperlink>
+      <w:r>
+        <w:t xml:space="preserve"> and </w:t>
+      </w:r>
+      <w:hyperlink w:anchor="Launcher_KB10" w:history="1">
+        <w:r>
+          <w:rPr>
+            <w:color w:val="FFFFFF"/>
+            <w:shd w:fill="CC5500"/>
+            <w:b/>
+          </w:rPr>
+          <w:t xml:space="preserve">  Launcher‑KB10  </w:t>
+        </w:r>
+      </w:hyperlink>
+      <w:r>
+        <w:t>.</w:t>
       </w:r>
     </w:p>
     <w:p>
+      <w:r>
+        <w:br w:type="page"/>
+      </w:r>
+    </w:p>
+    <w:p>
+      <w:bookmarkStart w:id="6" w:name="Launcher_KB5"/>
       <w:pPr>
         <w:pStyle w:val="Heading1"/>
       </w:pPr>
       <w:r>
         <w:t>Launcher KB5 Choose your appearance</w:t>
       </w:r>
+      <w:bookmarkEnd w:id="6"/>
     </w:p>
     <w:p>
       <w:pPr>
         <w:keepNext/>
       </w:pPr>
-      <w:r>
-        <w:t>Reference Launcher-KB5</w:t>
-      </w:r>
+      <w:hyperlink w:anchor="KB_Index" w:history="1">
+        <w:r>
+          <w:rPr>
+            <w:color w:val="FFFFFF"/>
+            <w:shd w:fill="CC5500"/>
+            <w:b/>
+          </w:rPr>
+          <w:t xml:space="preserve">  Back to index  </w:t>
+        </w:r>
+      </w:hyperlink>
     </w:p>
     <w:p>
       <w:pPr>
@@ -633,24 +1197,101 @@
         <w:keepNext w:val="0"/>
       </w:pPr>
       <w:r>
-        <w:t>Save keeps your changes and Cancel restores the previous appearance. See Launcher-KB11.</w:t>
+        <w:t xml:space="preserve">Save keeps your changes and Cancel restores the previous appearance. See </w:t>
+      </w:r>
+      <w:hyperlink w:anchor="Launcher_KB11" w:history="1">
+        <w:r>
+          <w:rPr>
+            <w:color w:val="FFFFFF"/>
+            <w:shd w:fill="CC5500"/>
+            <w:b/>
+          </w:rPr>
+          <w:t xml:space="preserve">  Launcher‑KB11  </w:t>
+        </w:r>
+      </w:hyperlink>
+      <w:r>
+        <w:t>.</w:t>
       </w:r>
     </w:p>
     <w:p>
+      <w:pPr>
+        <w:keepNext/>
+        <w:jc w:val="center"/>
+      </w:pPr>
+      <w:r>
+        <w:drawing>
+          <wp:inline xmlns:a="http://schemas.openxmlformats.org/drawingml/2006/main" xmlns:pic="http://schemas.openxmlformats.org/drawingml/2006/picture">
+            <wp:extent cx="5303520" cy="3915766"/>
+            <wp:docPr id="4" name="Picture 4"/>
+            <wp:cNvGraphicFramePr>
+              <a:graphicFrameLocks noChangeAspect="1"/>
+            </wp:cNvGraphicFramePr>
+            <a:graphic>
+              <a:graphicData uri="http://schemas.openxmlformats.org/drawingml/2006/picture">
+                <pic:pic>
+                  <pic:nvPicPr>
+                    <pic:cNvPr id="0" name="image.png"/>
+                    <pic:cNvPicPr/>
+                  </pic:nvPicPr>
+                  <pic:blipFill>
+                    <a:blip r:embed="rId12"/>
+                    <a:stretch>
+                      <a:fillRect/>
+                    </a:stretch>
+                  </pic:blipFill>
+                  <pic:spPr>
+                    <a:xfrm>
+                      <a:off x="0" y="0"/>
+                      <a:ext cx="5303520" cy="3915766"/>
+                    </a:xfrm>
+                    <a:prstGeom prst="rect"/>
+                  </pic:spPr>
+                </pic:pic>
+              </a:graphicData>
+            </a:graphic>
+          </wp:inline>
+        </w:drawing>
+      </w:r>
+    </w:p>
+    <w:p>
+      <w:pPr>
+        <w:pStyle w:val="Caption"/>
+        <w:keepNext w:val="0"/>
+        <w:spacing w:after="240"/>
+      </w:pPr>
+      <w:r>
+        <w:t>Appearance controls with the Grey palette selected. Save keeps your chosen layout and colours.</w:t>
+      </w:r>
+    </w:p>
+    <w:p>
+      <w:r>
+        <w:br w:type="page"/>
+      </w:r>
+    </w:p>
+    <w:p>
+      <w:bookmarkStart w:id="7" w:name="Launcher_KB6"/>
       <w:pPr>
         <w:pStyle w:val="Heading1"/>
       </w:pPr>
       <w:r>
         <w:t>Launcher KB6 Reduce resource usage</w:t>
       </w:r>
+      <w:bookmarkEnd w:id="7"/>
     </w:p>
     <w:p>
       <w:pPr>
         <w:keepNext/>
       </w:pPr>
-      <w:r>
-        <w:t>Reference Launcher-KB6</w:t>
-      </w:r>
+      <w:hyperlink w:anchor="KB_Index" w:history="1">
+        <w:r>
+          <w:rPr>
+            <w:color w:val="FFFFFF"/>
+            <w:shd w:fill="CC5500"/>
+            <w:b/>
+          </w:rPr>
+          <w:t xml:space="preserve">  Back to index  </w:t>
+        </w:r>
+      </w:hyperlink>
     </w:p>
     <w:p>
       <w:pPr>
@@ -673,24 +1314,109 @@
         <w:keepNext w:val="0"/>
       </w:pPr>
       <w:r>
-        <w:t>Functional and resource checks run in the release workflow. See Launcher-KB5 and Launcher-KB9.</w:t>
+        <w:t xml:space="preserve">Functional and resource checks run in the release workflow. See </w:t>
+      </w:r>
+      <w:hyperlink w:anchor="Launcher_KB5" w:history="1">
+        <w:r>
+          <w:rPr>
+            <w:color w:val="FFFFFF"/>
+            <w:shd w:fill="CC5500"/>
+            <w:b/>
+          </w:rPr>
+          <w:t xml:space="preserve">  Launcher‑KB5  </w:t>
+        </w:r>
+      </w:hyperlink>
+      <w:r>
+        <w:t xml:space="preserve"> and </w:t>
+      </w:r>
+      <w:hyperlink w:anchor="Launcher_KB9" w:history="1">
+        <w:r>
+          <w:rPr>
+            <w:color w:val="FFFFFF"/>
+            <w:shd w:fill="CC5500"/>
+            <w:b/>
+          </w:rPr>
+          <w:t xml:space="preserve">  Launcher‑KB9  </w:t>
+        </w:r>
+      </w:hyperlink>
+      <w:r>
+        <w:t>.</w:t>
       </w:r>
     </w:p>
     <w:p>
+      <w:pPr>
+        <w:keepNext/>
+        <w:jc w:val="center"/>
+      </w:pPr>
+      <w:r>
+        <w:drawing>
+          <wp:inline xmlns:a="http://schemas.openxmlformats.org/drawingml/2006/main" xmlns:pic="http://schemas.openxmlformats.org/drawingml/2006/picture">
+            <wp:extent cx="2103120" cy="1577339"/>
+            <wp:docPr id="5" name="Picture 5"/>
+            <wp:cNvGraphicFramePr>
+              <a:graphicFrameLocks noChangeAspect="1"/>
+            </wp:cNvGraphicFramePr>
+            <a:graphic>
+              <a:graphicData uri="http://schemas.openxmlformats.org/drawingml/2006/picture">
+                <pic:pic>
+                  <pic:nvPicPr>
+                    <pic:cNvPr id="0" name="image.png"/>
+                    <pic:cNvPicPr/>
+                  </pic:nvPicPr>
+                  <pic:blipFill>
+                    <a:blip r:embed="rId13"/>
+                    <a:stretch>
+                      <a:fillRect/>
+                    </a:stretch>
+                  </pic:blipFill>
+                  <pic:spPr>
+                    <a:xfrm>
+                      <a:off x="0" y="0"/>
+                      <a:ext cx="2103120" cy="1577339"/>
+                    </a:xfrm>
+                    <a:prstGeom prst="rect"/>
+                  </pic:spPr>
+                </pic:pic>
+              </a:graphicData>
+            </a:graphic>
+          </wp:inline>
+        </w:drawing>
+      </w:r>
+    </w:p>
+    <w:p>
+      <w:pPr>
+        <w:pStyle w:val="Caption"/>
+        <w:keepNext w:val="0"/>
+        <w:spacing w:after="240"/>
+      </w:pPr>
+      <w:r>
+        <w:t>Choose Quit from the tray menu to release launcher memory.</w:t>
+      </w:r>
+    </w:p>
+    <w:p>
+      <w:bookmarkStart w:id="8" w:name="Launcher_KB7"/>
       <w:pPr>
         <w:pStyle w:val="Heading1"/>
       </w:pPr>
       <w:r>
         <w:t>Launcher KB7 Review and submit a crash report</w:t>
       </w:r>
+      <w:bookmarkEnd w:id="8"/>
     </w:p>
     <w:p>
       <w:pPr>
         <w:keepNext/>
       </w:pPr>
-      <w:r>
-        <w:t>Reference Launcher-KB7</w:t>
-      </w:r>
+      <w:hyperlink w:anchor="KB_Index" w:history="1">
+        <w:r>
+          <w:rPr>
+            <w:color w:val="FFFFFF"/>
+            <w:shd w:fill="CC5500"/>
+            <w:b/>
+          </w:rPr>
+          <w:t xml:space="preserve">  Back to index  </w:t>
+        </w:r>
+      </w:hyperlink>
     </w:p>
     <w:p>
       <w:pPr>
@@ -713,24 +1439,64 @@
         <w:keepNext w:val="0"/>
       </w:pPr>
       <w:r>
-        <w:t>See Launcher-KB8 and Launcher-KB10.</w:t>
+        <w:t xml:space="preserve">See </w:t>
+      </w:r>
+      <w:hyperlink w:anchor="Launcher_KB8" w:history="1">
+        <w:r>
+          <w:rPr>
+            <w:color w:val="FFFFFF"/>
+            <w:shd w:fill="CC5500"/>
+            <w:b/>
+          </w:rPr>
+          <w:t xml:space="preserve">  Launcher‑KB8  </w:t>
+        </w:r>
+      </w:hyperlink>
+      <w:r>
+        <w:t xml:space="preserve"> and </w:t>
+      </w:r>
+      <w:hyperlink w:anchor="Launcher_KB10" w:history="1">
+        <w:r>
+          <w:rPr>
+            <w:color w:val="FFFFFF"/>
+            <w:shd w:fill="CC5500"/>
+            <w:b/>
+          </w:rPr>
+          <w:t xml:space="preserve">  Launcher‑KB10  </w:t>
+        </w:r>
+      </w:hyperlink>
+      <w:r>
+        <w:t>.</w:t>
       </w:r>
     </w:p>
     <w:p>
+      <w:r>
+        <w:br w:type="page"/>
+      </w:r>
+    </w:p>
+    <w:p>
+      <w:bookmarkStart w:id="9" w:name="Launcher_KB8"/>
       <w:pPr>
         <w:pStyle w:val="Heading1"/>
       </w:pPr>
       <w:r>
         <w:t>Launcher KB8 Get help and request changes</w:t>
       </w:r>
+      <w:bookmarkEnd w:id="9"/>
     </w:p>
     <w:p>
       <w:pPr>
         <w:keepNext/>
       </w:pPr>
-      <w:r>
-        <w:t>Reference Launcher-KB8</w:t>
-      </w:r>
+      <w:hyperlink w:anchor="KB_Index" w:history="1">
+        <w:r>
+          <w:rPr>
+            <w:color w:val="FFFFFF"/>
+            <w:shd w:fill="CC5500"/>
+            <w:b/>
+          </w:rPr>
+          <w:t xml:space="preserve">  Back to index  </w:t>
+        </w:r>
+      </w:hyperlink>
     </w:p>
     <w:p>
       <w:pPr>
@@ -745,24 +1511,101 @@
         <w:keepNext w:val="0"/>
       </w:pPr>
       <w:r>
-        <w:t>Do not include passwords, keys, mail content or private project files. See Launcher-KB7.</w:t>
+        <w:t xml:space="preserve">Do not include passwords, keys, mail content or private project files. See </w:t>
+      </w:r>
+      <w:hyperlink w:anchor="Launcher_KB7" w:history="1">
+        <w:r>
+          <w:rPr>
+            <w:color w:val="FFFFFF"/>
+            <w:shd w:fill="CC5500"/>
+            <w:b/>
+          </w:rPr>
+          <w:t xml:space="preserve">  Launcher‑KB7  </w:t>
+        </w:r>
+      </w:hyperlink>
+      <w:r>
+        <w:t>.</w:t>
       </w:r>
     </w:p>
     <w:p>
+      <w:pPr>
+        <w:keepNext/>
+        <w:jc w:val="center"/>
+      </w:pPr>
+      <w:r>
+        <w:drawing>
+          <wp:inline xmlns:a="http://schemas.openxmlformats.org/drawingml/2006/main" xmlns:pic="http://schemas.openxmlformats.org/drawingml/2006/picture">
+            <wp:extent cx="4937760" cy="4443984"/>
+            <wp:docPr id="6" name="Picture 6"/>
+            <wp:cNvGraphicFramePr>
+              <a:graphicFrameLocks noChangeAspect="1"/>
+            </wp:cNvGraphicFramePr>
+            <a:graphic>
+              <a:graphicData uri="http://schemas.openxmlformats.org/drawingml/2006/picture">
+                <pic:pic>
+                  <pic:nvPicPr>
+                    <pic:cNvPr id="0" name="image.png"/>
+                    <pic:cNvPicPr/>
+                  </pic:nvPicPr>
+                  <pic:blipFill>
+                    <a:blip r:embed="rId14"/>
+                    <a:stretch>
+                      <a:fillRect/>
+                    </a:stretch>
+                  </pic:blipFill>
+                  <pic:spPr>
+                    <a:xfrm>
+                      <a:off x="0" y="0"/>
+                      <a:ext cx="4937760" cy="4443984"/>
+                    </a:xfrm>
+                    <a:prstGeom prst="rect"/>
+                  </pic:spPr>
+                </pic:pic>
+              </a:graphicData>
+            </a:graphic>
+          </wp:inline>
+        </w:drawing>
+      </w:r>
+    </w:p>
+    <w:p>
+      <w:pPr>
+        <w:pStyle w:val="Caption"/>
+        <w:keepNext w:val="0"/>
+        <w:spacing w:after="240"/>
+      </w:pPr>
+      <w:r>
+        <w:t>Help provides the KB Library and actions for GitHub support forms.</w:t>
+      </w:r>
+    </w:p>
+    <w:p>
+      <w:r>
+        <w:br w:type="page"/>
+      </w:r>
+    </w:p>
+    <w:p>
+      <w:bookmarkStart w:id="10" w:name="Launcher_KB9"/>
       <w:pPr>
         <w:pStyle w:val="Heading1"/>
       </w:pPr>
       <w:r>
         <w:t>Launcher KB9 App details and galleries</w:t>
       </w:r>
+      <w:bookmarkEnd w:id="10"/>
     </w:p>
     <w:p>
       <w:pPr>
         <w:keepNext/>
       </w:pPr>
-      <w:r>
-        <w:t>Reference Launcher-KB9</w:t>
-      </w:r>
+      <w:hyperlink w:anchor="KB_Index" w:history="1">
+        <w:r>
+          <w:rPr>
+            <w:color w:val="FFFFFF"/>
+            <w:shd w:fill="CC5500"/>
+            <w:b/>
+          </w:rPr>
+          <w:t xml:space="preserve">  Back to index  </w:t>
+        </w:r>
+      </w:hyperlink>
     </w:p>
     <w:p>
       <w:pPr>
@@ -777,24 +1620,101 @@
         <w:keepNext w:val="0"/>
       </w:pPr>
       <w:r>
-        <w:t>Media is loaded only when details are opened; videos never play automatically. See Launcher-KB6.</w:t>
+        <w:t xml:space="preserve">Media is loaded only when details are opened; videos never play automatically. See </w:t>
+      </w:r>
+      <w:hyperlink w:anchor="Launcher_KB6" w:history="1">
+        <w:r>
+          <w:rPr>
+            <w:color w:val="FFFFFF"/>
+            <w:shd w:fill="CC5500"/>
+            <w:b/>
+          </w:rPr>
+          <w:t xml:space="preserve">  Launcher‑KB6  </w:t>
+        </w:r>
+      </w:hyperlink>
+      <w:r>
+        <w:t>.</w:t>
       </w:r>
     </w:p>
     <w:p>
+      <w:pPr>
+        <w:keepNext/>
+        <w:jc w:val="center"/>
+      </w:pPr>
+      <w:r>
+        <w:drawing>
+          <wp:inline xmlns:a="http://schemas.openxmlformats.org/drawingml/2006/main" xmlns:pic="http://schemas.openxmlformats.org/drawingml/2006/picture">
+            <wp:extent cx="4937760" cy="4672355"/>
+            <wp:docPr id="7" name="Picture 7"/>
+            <wp:cNvGraphicFramePr>
+              <a:graphicFrameLocks noChangeAspect="1"/>
+            </wp:cNvGraphicFramePr>
+            <a:graphic>
+              <a:graphicData uri="http://schemas.openxmlformats.org/drawingml/2006/picture">
+                <pic:pic>
+                  <pic:nvPicPr>
+                    <pic:cNvPr id="0" name="image.png"/>
+                    <pic:cNvPicPr/>
+                  </pic:nvPicPr>
+                  <pic:blipFill>
+                    <a:blip r:embed="rId15"/>
+                    <a:stretch>
+                      <a:fillRect/>
+                    </a:stretch>
+                  </pic:blipFill>
+                  <pic:spPr>
+                    <a:xfrm>
+                      <a:off x="0" y="0"/>
+                      <a:ext cx="4937760" cy="4672355"/>
+                    </a:xfrm>
+                    <a:prstGeom prst="rect"/>
+                  </pic:spPr>
+                </pic:pic>
+              </a:graphicData>
+            </a:graphic>
+          </wp:inline>
+        </w:drawing>
+      </w:r>
+    </w:p>
+    <w:p>
+      <w:pPr>
+        <w:pStyle w:val="Caption"/>
+        <w:keepNext w:val="0"/>
+        <w:spacing w:after="240"/>
+      </w:pPr>
+      <w:r>
+        <w:t>App details show version information and release notes. Media slots remain unpublished until assets are supplied.</w:t>
+      </w:r>
+    </w:p>
+    <w:p>
+      <w:r>
+        <w:br w:type="page"/>
+      </w:r>
+    </w:p>
+    <w:p>
+      <w:bookmarkStart w:id="11" w:name="Launcher_KB10"/>
       <w:pPr>
         <w:pStyle w:val="Heading1"/>
       </w:pPr>
       <w:r>
         <w:t>Launcher KB10 Privacy and local data</w:t>
       </w:r>
+      <w:bookmarkEnd w:id="11"/>
     </w:p>
     <w:p>
       <w:pPr>
         <w:keepNext/>
       </w:pPr>
-      <w:r>
-        <w:t>Reference Launcher-KB10</w:t>
-      </w:r>
+      <w:hyperlink w:anchor="KB_Index" w:history="1">
+        <w:r>
+          <w:rPr>
+            <w:color w:val="FFFFFF"/>
+            <w:shd w:fill="CC5500"/>
+            <w:b/>
+          </w:rPr>
+          <w:t xml:space="preserve">  Back to index  </w:t>
+        </w:r>
+      </w:hyperlink>
     </w:p>
     <w:p>
       <w:pPr>
@@ -809,24 +1729,114 @@
         <w:keepNext w:val="0"/>
       </w:pPr>
       <w:r>
-        <w:t>Uninstall choices apply to the selected app; external projects are kept. See Launcher-KB3 and Launcher-KB7.</w:t>
+        <w:t xml:space="preserve">Uninstall choices apply to the selected app; external projects are kept. See </w:t>
+      </w:r>
+      <w:hyperlink w:anchor="Launcher_KB3" w:history="1">
+        <w:r>
+          <w:rPr>
+            <w:color w:val="FFFFFF"/>
+            <w:shd w:fill="CC5500"/>
+            <w:b/>
+          </w:rPr>
+          <w:t xml:space="preserve">  Launcher‑KB3  </w:t>
+        </w:r>
+      </w:hyperlink>
+      <w:r>
+        <w:t xml:space="preserve"> and </w:t>
+      </w:r>
+      <w:hyperlink w:anchor="Launcher_KB7" w:history="1">
+        <w:r>
+          <w:rPr>
+            <w:color w:val="FFFFFF"/>
+            <w:shd w:fill="CC5500"/>
+            <w:b/>
+          </w:rPr>
+          <w:t xml:space="preserve">  Launcher‑KB7  </w:t>
+        </w:r>
+      </w:hyperlink>
+      <w:r>
+        <w:t>.</w:t>
       </w:r>
     </w:p>
     <w:p>
+      <w:pPr>
+        <w:keepNext/>
+        <w:jc w:val="center"/>
+      </w:pPr>
+      <w:r>
+        <w:drawing>
+          <wp:inline xmlns:a="http://schemas.openxmlformats.org/drawingml/2006/main" xmlns:pic="http://schemas.openxmlformats.org/drawingml/2006/picture">
+            <wp:extent cx="5303520" cy="3270504"/>
+            <wp:docPr id="8" name="Picture 8"/>
+            <wp:cNvGraphicFramePr>
+              <a:graphicFrameLocks noChangeAspect="1"/>
+            </wp:cNvGraphicFramePr>
+            <a:graphic>
+              <a:graphicData uri="http://schemas.openxmlformats.org/drawingml/2006/picture">
+                <pic:pic>
+                  <pic:nvPicPr>
+                    <pic:cNvPr id="0" name="image.png"/>
+                    <pic:cNvPicPr/>
+                  </pic:nvPicPr>
+                  <pic:blipFill>
+                    <a:blip r:embed="rId16"/>
+                    <a:stretch>
+                      <a:fillRect/>
+                    </a:stretch>
+                  </pic:blipFill>
+                  <pic:spPr>
+                    <a:xfrm>
+                      <a:off x="0" y="0"/>
+                      <a:ext cx="5303520" cy="3270504"/>
+                    </a:xfrm>
+                    <a:prstGeom prst="rect"/>
+                  </pic:spPr>
+                </pic:pic>
+              </a:graphicData>
+            </a:graphic>
+          </wp:inline>
+        </w:drawing>
+      </w:r>
+    </w:p>
+    <w:p>
+      <w:pPr>
+        <w:pStyle w:val="Caption"/>
+        <w:keepNext w:val="0"/>
+        <w:spacing w:after="240"/>
+      </w:pPr>
+      <w:r>
+        <w:t>The uninstall dialog lets you choose whether the selected app keeps its standard local data.</w:t>
+      </w:r>
+    </w:p>
+    <w:p>
+      <w:r>
+        <w:br w:type="page"/>
+      </w:r>
+    </w:p>
+    <w:p>
+      <w:bookmarkStart w:id="12" w:name="Launcher_KB11"/>
       <w:pPr>
         <w:pStyle w:val="Heading1"/>
       </w:pPr>
       <w:r>
         <w:t>Launcher KB11 Search settings and knowledge articles</w:t>
       </w:r>
+      <w:bookmarkEnd w:id="12"/>
     </w:p>
     <w:p>
       <w:pPr>
         <w:keepNext/>
       </w:pPr>
-      <w:r>
-        <w:t>Reference Launcher-KB11</w:t>
-      </w:r>
+      <w:hyperlink w:anchor="KB_Index" w:history="1">
+        <w:r>
+          <w:rPr>
+            <w:color w:val="FFFFFF"/>
+            <w:shd w:fill="CC5500"/>
+            <w:b/>
+          </w:rPr>
+          <w:t xml:space="preserve">  Back to index  </w:t>
+        </w:r>
+      </w:hyperlink>
     </w:p>
     <w:p>
       <w:pPr>
@@ -841,24 +1851,109 @@
         <w:keepNext w:val="0"/>
       </w:pPr>
       <w:r>
-        <w:t>Search supports KB numbers such as Launcher-KB6. See Launcher-KB5.</w:t>
+        <w:t xml:space="preserve">Search supports KB numbers such as </w:t>
+      </w:r>
+      <w:hyperlink w:anchor="Launcher_KB6" w:history="1">
+        <w:r>
+          <w:rPr>
+            <w:color w:val="FFFFFF"/>
+            <w:shd w:fill="CC5500"/>
+            <w:b/>
+          </w:rPr>
+          <w:t xml:space="preserve">  Launcher‑KB6  </w:t>
+        </w:r>
+      </w:hyperlink>
+      <w:r>
+        <w:t xml:space="preserve">. See </w:t>
+      </w:r>
+      <w:hyperlink w:anchor="Launcher_KB5" w:history="1">
+        <w:r>
+          <w:rPr>
+            <w:color w:val="FFFFFF"/>
+            <w:shd w:fill="CC5500"/>
+            <w:b/>
+          </w:rPr>
+          <w:t xml:space="preserve">  Launcher‑KB5  </w:t>
+        </w:r>
+      </w:hyperlink>
+      <w:r>
+        <w:t>.</w:t>
       </w:r>
     </w:p>
     <w:p>
+      <w:pPr>
+        <w:keepNext/>
+        <w:jc w:val="center"/>
+      </w:pPr>
+      <w:r>
+        <w:drawing>
+          <wp:inline xmlns:a="http://schemas.openxmlformats.org/drawingml/2006/main" xmlns:pic="http://schemas.openxmlformats.org/drawingml/2006/picture">
+            <wp:extent cx="5303520" cy="3632911"/>
+            <wp:docPr id="9" name="Picture 9"/>
+            <wp:cNvGraphicFramePr>
+              <a:graphicFrameLocks noChangeAspect="1"/>
+            </wp:cNvGraphicFramePr>
+            <a:graphic>
+              <a:graphicData uri="http://schemas.openxmlformats.org/drawingml/2006/picture">
+                <pic:pic>
+                  <pic:nvPicPr>
+                    <pic:cNvPr id="0" name="image.png"/>
+                    <pic:cNvPicPr/>
+                  </pic:nvPicPr>
+                  <pic:blipFill>
+                    <a:blip r:embed="rId17"/>
+                    <a:stretch>
+                      <a:fillRect/>
+                    </a:stretch>
+                  </pic:blipFill>
+                  <pic:spPr>
+                    <a:xfrm>
+                      <a:off x="0" y="0"/>
+                      <a:ext cx="5303520" cy="3632911"/>
+                    </a:xfrm>
+                    <a:prstGeom prst="rect"/>
+                  </pic:spPr>
+                </pic:pic>
+              </a:graphicData>
+            </a:graphic>
+          </wp:inline>
+        </w:drawing>
+      </w:r>
+    </w:p>
+    <w:p>
+      <w:pPr>
+        <w:pStyle w:val="Caption"/>
+        <w:keepNext w:val="0"/>
+        <w:spacing w:after="240"/>
+      </w:pPr>
+      <w:r>
+        <w:t>Search by keywords or a KB number to find relevant knowledge articles.</w:t>
+      </w:r>
+    </w:p>
+    <w:p>
+      <w:bookmarkStart w:id="13" w:name="Launcher_KB12"/>
       <w:pPr>
         <w:pStyle w:val="Heading1"/>
       </w:pPr>
       <w:r>
         <w:t>Launcher KB12 Troubleshoot platform compatibility</w:t>
       </w:r>
+      <w:bookmarkEnd w:id="13"/>
     </w:p>
     <w:p>
       <w:pPr>
         <w:keepNext/>
       </w:pPr>
-      <w:r>
-        <w:t>Reference Launcher-KB12</w:t>
-      </w:r>
+      <w:hyperlink w:anchor="KB_Index" w:history="1">
+        <w:r>
+          <w:rPr>
+            <w:color w:val="FFFFFF"/>
+            <w:shd w:fill="CC5500"/>
+            <w:b/>
+          </w:rPr>
+          <w:t xml:space="preserve">  Back to index  </w:t>
+        </w:r>
+      </w:hyperlink>
     </w:p>
     <w:p>
       <w:pPr>
@@ -873,7 +1968,33 @@
         <w:keepNext w:val="0"/>
       </w:pPr>
       <w:r>
-        <w:t>Linux tray support depends on the desktop. See Launcher-KB1 and Launcher-KB7.</w:t>
+        <w:t xml:space="preserve">Linux tray support depends on the desktop. See </w:t>
+      </w:r>
+      <w:hyperlink w:anchor="Launcher_KB1" w:history="1">
+        <w:r>
+          <w:rPr>
+            <w:color w:val="FFFFFF"/>
+            <w:shd w:fill="CC5500"/>
+            <w:b/>
+          </w:rPr>
+          <w:t xml:space="preserve">  Launcher‑KB1  </w:t>
+        </w:r>
+      </w:hyperlink>
+      <w:r>
+        <w:t xml:space="preserve"> and </w:t>
+      </w:r>
+      <w:hyperlink w:anchor="Launcher_KB7" w:history="1">
+        <w:r>
+          <w:rPr>
+            <w:color w:val="FFFFFF"/>
+            <w:shd w:fill="CC5500"/>
+            <w:b/>
+          </w:rPr>
+          <w:t xml:space="preserve">  Launcher‑KB7  </w:t>
+        </w:r>
+      </w:hyperlink>
+      <w:r>
+        <w:t>.</w:t>
       </w:r>
     </w:p>
     <w:p>
@@ -890,7 +2011,7 @@
       </w:r>
     </w:p>
     <w:sectPr>
-      <w:footerReference w:type="default" r:id="rId9"/>
+      <w:footerReference w:type="default" r:id="rId18"/>
       <w:pgSz w:w="12240" w:h="15840"/>
       <w:pgMar w:top="1152" w:right="1224" w:bottom="1152" w:left="1224" w:header="720" w:footer="720" w:gutter="0"/>
       <w:cols w:space="720"/>
@@ -1347,7 +2468,7 @@
       <w:rFonts w:asciiTheme="majorHAnsi" w:eastAsiaTheme="majorEastAsia" w:hAnsiTheme="majorHAnsi" w:cstheme="majorBidi" w:ascii="Calibri" w:hAnsi="Calibri"/>
       <w:b/>
       <w:bCs/>
-      <w:color w:val="9B4300"/>
+      <w:color w:val="000000"/>
       <w:sz w:val="32"/>
       <w:szCs w:val="28"/>
     </w:rPr>
@@ -1371,7 +2492,7 @@
       <w:rFonts w:asciiTheme="majorHAnsi" w:eastAsiaTheme="majorEastAsia" w:hAnsiTheme="majorHAnsi" w:cstheme="majorBidi" w:ascii="Calibri" w:hAnsi="Calibri"/>
       <w:b/>
       <w:bCs/>
-      <w:color w:val="9B4300"/>
+      <w:color w:val="000000"/>
       <w:sz w:val="32"/>
       <w:szCs w:val="26"/>
     </w:rPr>
@@ -1671,7 +2792,7 @@
       <w:rFonts w:asciiTheme="majorHAnsi" w:eastAsiaTheme="majorEastAsia" w:hAnsiTheme="majorHAnsi" w:cstheme="majorBidi"/>
       <w:i/>
       <w:iCs/>
-      <w:color w:val="4F81BD" w:themeColor="accent1"/>
+      <w:color w:val="000000"/>
       <w:spacing w:val="15"/>
       <w:sz w:val="24"/>
       <w:szCs w:val="24"/>
@@ -2079,7 +3200,7 @@
     <w:rPr>
       <w:b/>
       <w:bCs/>
-      <w:color w:val="4F81BD" w:themeColor="accent1"/>
+      <w:color w:val="555555"/>
       <w:sz w:val="18"/>
       <w:szCs w:val="18"/>
     </w:rPr>

</xml_diff>

<commit_message>
Apply illustrated KB, report privacy and packaged release checks
</commit_message>
<xml_diff>
--- a/docs/KB Library.docx
+++ b/docs/KB Library.docx
@@ -29,236 +29,238 @@
       </w:r>
     </w:p>
     <w:p>
+      <w:bookmarkStart w:id="0" w:name="KB_Index"/>
       <w:pPr>
         <w:pStyle w:val="Heading1"/>
       </w:pPr>
       <w:r>
         <w:t>Article index</w:t>
       </w:r>
+      <w:bookmarkEnd w:id="0"/>
     </w:p>
     <w:p>
       <w:pPr>
         <w:spacing w:after="80"/>
       </w:pPr>
-      <w:r>
-        <w:rPr>
-          <w:b/>
-        </w:rPr>
-        <w:t xml:space="preserve">Cut-KB1  </w:t>
-      </w:r>
-      <w:r>
-        <w:t>Create a project and import media</w:t>
-      </w:r>
+      <w:hyperlink w:anchor="Cut_KB1">
+        <w:r>
+          <w:rPr>
+            <w:color w:val="9C2430"/>
+            <w:u w:val="single"/>
+          </w:rPr>
+          <w:t>Cut-KB1  Create a project and import media</w:t>
+        </w:r>
+      </w:hyperlink>
     </w:p>
     <w:p>
       <w:pPr>
         <w:spacing w:after="80"/>
       </w:pPr>
-      <w:r>
-        <w:rPr>
-          <w:b/>
-        </w:rPr>
-        <w:t xml:space="preserve">Cut-KB2  </w:t>
-      </w:r>
-      <w:r>
-        <w:t>Edit stacked timeline tracks</w:t>
-      </w:r>
+      <w:hyperlink w:anchor="Cut_KB2">
+        <w:r>
+          <w:rPr>
+            <w:color w:val="9C2430"/>
+            <w:u w:val="single"/>
+          </w:rPr>
+          <w:t>Cut-KB2  Edit stacked timeline tracks</w:t>
+        </w:r>
+      </w:hyperlink>
     </w:p>
     <w:p>
       <w:pPr>
         <w:spacing w:after="80"/>
       </w:pPr>
-      <w:r>
-        <w:rPr>
-          <w:b/>
-        </w:rPr>
-        <w:t xml:space="preserve">Cut-KB3  </w:t>
-      </w:r>
-      <w:r>
-        <w:t>Configure timecode zoom and shortcuts</w:t>
-      </w:r>
+      <w:hyperlink w:anchor="Cut_KB3">
+        <w:r>
+          <w:rPr>
+            <w:color w:val="9C2430"/>
+            <w:u w:val="single"/>
+          </w:rPr>
+          <w:t>Cut-KB3  Configure timecode zoom and shortcuts</w:t>
+        </w:r>
+      </w:hyperlink>
     </w:p>
     <w:p>
       <w:pPr>
         <w:spacing w:after="80"/>
       </w:pPr>
-      <w:r>
-        <w:rPr>
-          <w:b/>
-        </w:rPr>
-        <w:t xml:space="preserve">Cut-KB4  </w:t>
-      </w:r>
-      <w:r>
-        <w:t>Arrange the workspace and preview monitor</w:t>
-      </w:r>
+      <w:hyperlink w:anchor="Cut_KB4">
+        <w:r>
+          <w:rPr>
+            <w:color w:val="9C2430"/>
+            <w:u w:val="single"/>
+          </w:rPr>
+          <w:t>Cut-KB4  Arrange the workspace and preview monitor</w:t>
+        </w:r>
+      </w:hyperlink>
     </w:p>
     <w:p>
       <w:pPr>
         <w:spacing w:after="80"/>
       </w:pPr>
-      <w:r>
-        <w:rPr>
-          <w:b/>
-        </w:rPr>
-        <w:t xml:space="preserve">Cut-KB5  </w:t>
-      </w:r>
-      <w:r>
-        <w:t>Correct colour and save grading profiles</w:t>
-      </w:r>
+      <w:hyperlink w:anchor="Cut_KB5">
+        <w:r>
+          <w:rPr>
+            <w:color w:val="9C2430"/>
+            <w:u w:val="single"/>
+          </w:rPr>
+          <w:t>Cut-KB5  Correct colour and save grading profiles</w:t>
+        </w:r>
+      </w:hyperlink>
     </w:p>
     <w:p>
       <w:pPr>
         <w:spacing w:after="80"/>
       </w:pPr>
-      <w:r>
-        <w:rPr>
-          <w:b/>
-        </w:rPr>
-        <w:t xml:space="preserve">Cut-KB6  </w:t>
-      </w:r>
-      <w:r>
-        <w:t>Crop mask key and blur footage</w:t>
-      </w:r>
+      <w:hyperlink w:anchor="Cut_KB6">
+        <w:r>
+          <w:rPr>
+            <w:color w:val="9C2430"/>
+            <w:u w:val="single"/>
+          </w:rPr>
+          <w:t>Cut-KB6  Crop mask key and blur footage</w:t>
+        </w:r>
+      </w:hyperlink>
     </w:p>
     <w:p>
       <w:pPr>
         <w:spacing w:after="80"/>
       </w:pPr>
-      <w:r>
-        <w:rPr>
-          <w:b/>
-        </w:rPr>
-        <w:t xml:space="preserve">Cut-KB7  </w:t>
-      </w:r>
-      <w:r>
-        <w:t>Animate movement track subjects and adjust speed</w:t>
-      </w:r>
+      <w:hyperlink w:anchor="Cut_KB7">
+        <w:r>
+          <w:rPr>
+            <w:color w:val="9C2430"/>
+            <w:u w:val="single"/>
+          </w:rPr>
+          <w:t>Cut-KB7  Animate movement track subjects and adjust speed</w:t>
+        </w:r>
+      </w:hyperlink>
     </w:p>
     <w:p>
       <w:pPr>
         <w:spacing w:after="80"/>
       </w:pPr>
-      <w:r>
-        <w:rPr>
-          <w:b/>
-        </w:rPr>
-        <w:t xml:space="preserve">Cut-KB8  </w:t>
-      </w:r>
-      <w:r>
-        <w:t>Mix audio record voice and reduce noise</w:t>
-      </w:r>
+      <w:hyperlink w:anchor="Cut_KB8">
+        <w:r>
+          <w:rPr>
+            <w:color w:val="9C2430"/>
+            <w:u w:val="single"/>
+          </w:rPr>
+          <w:t>Cut-KB8  Mix audio record voice and reduce noise</w:t>
+        </w:r>
+      </w:hyperlink>
     </w:p>
     <w:p>
       <w:pPr>
         <w:spacing w:after="80"/>
       </w:pPr>
-      <w:r>
-        <w:rPr>
-          <w:b/>
-        </w:rPr>
-        <w:t xml:space="preserve">Cut-KB9  </w:t>
-      </w:r>
-      <w:r>
-        <w:t>Save projects recover edits and keep backups</w:t>
-      </w:r>
+      <w:hyperlink w:anchor="Cut_KB9">
+        <w:r>
+          <w:rPr>
+            <w:color w:val="9C2430"/>
+            <w:u w:val="single"/>
+          </w:rPr>
+          <w:t>Cut-KB9  Save projects recover edits and keep backups</w:t>
+        </w:r>
+      </w:hyperlink>
     </w:p>
     <w:p>
       <w:pPr>
         <w:spacing w:after="80"/>
       </w:pPr>
-      <w:r>
-        <w:rPr>
-          <w:b/>
-        </w:rPr>
-        <w:t xml:space="preserve">Cut-KB10  </w:t>
-      </w:r>
-      <w:r>
-        <w:t>Generate edit and style captions</w:t>
-      </w:r>
+      <w:hyperlink w:anchor="Cut_KB10">
+        <w:r>
+          <w:rPr>
+            <w:color w:val="9C2430"/>
+            <w:u w:val="single"/>
+          </w:rPr>
+          <w:t>Cut-KB10  Generate edit and style captions</w:t>
+        </w:r>
+      </w:hyperlink>
     </w:p>
     <w:p>
       <w:pPr>
         <w:spacing w:after="80"/>
       </w:pPr>
-      <w:r>
-        <w:rPr>
-          <w:b/>
-        </w:rPr>
-        <w:t xml:space="preserve">Cut-KB11  </w:t>
-      </w:r>
-      <w:r>
-        <w:t>Build templates intros and asset collections</w:t>
-      </w:r>
+      <w:hyperlink w:anchor="Cut_KB11">
+        <w:r>
+          <w:rPr>
+            <w:color w:val="9C2430"/>
+            <w:u w:val="single"/>
+          </w:rPr>
+          <w:t>Cut-KB11  Build templates intros and asset collections</w:t>
+        </w:r>
+      </w:hyperlink>
     </w:p>
     <w:p>
       <w:pPr>
         <w:spacing w:after="80"/>
       </w:pPr>
-      <w:r>
-        <w:rPr>
-          <w:b/>
-        </w:rPr>
-        <w:t xml:space="preserve">Cut-KB12  </w:t>
-      </w:r>
-      <w:r>
-        <w:t>Export video audio GIFs and thumbnails</w:t>
-      </w:r>
+      <w:hyperlink w:anchor="Cut_KB12">
+        <w:r>
+          <w:rPr>
+            <w:color w:val="9C2430"/>
+            <w:u w:val="single"/>
+          </w:rPr>
+          <w:t>Cut-KB12  Export video audio GIFs and thumbnails</w:t>
+        </w:r>
+      </w:hyperlink>
     </w:p>
     <w:p>
       <w:pPr>
         <w:spacing w:after="80"/>
       </w:pPr>
-      <w:r>
-        <w:rPr>
-          <w:b/>
-        </w:rPr>
-        <w:t xml:space="preserve">Cut-KB13  </w:t>
-      </w:r>
-      <w:r>
-        <w:t>Understand quality HDR and performance</w:t>
-      </w:r>
+      <w:hyperlink w:anchor="Cut_KB13">
+        <w:r>
+          <w:rPr>
+            <w:color w:val="9C2430"/>
+            <w:u w:val="single"/>
+          </w:rPr>
+          <w:t>Cut-KB13  Understand quality HDR and performance</w:t>
+        </w:r>
+      </w:hyperlink>
     </w:p>
     <w:p>
       <w:pPr>
         <w:spacing w:after="80"/>
       </w:pPr>
-      <w:r>
-        <w:rPr>
-          <w:b/>
-        </w:rPr>
-        <w:t xml:space="preserve">Cut-KB14  </w:t>
-      </w:r>
-      <w:r>
-        <w:t>Connect services and check recording matches</w:t>
-      </w:r>
+      <w:hyperlink w:anchor="Cut_KB14">
+        <w:r>
+          <w:rPr>
+            <w:color w:val="9C2430"/>
+            <w:u w:val="single"/>
+          </w:rPr>
+          <w:t>Cut-KB14  Connect services and check recording matches</w:t>
+        </w:r>
+      </w:hyperlink>
     </w:p>
     <w:p>
       <w:pPr>
         <w:spacing w:after="80"/>
       </w:pPr>
-      <w:r>
-        <w:rPr>
-          <w:b/>
-        </w:rPr>
-        <w:t xml:space="preserve">Cut-KB15  </w:t>
-      </w:r>
-      <w:r>
-        <w:t>Manage storage appearance and workspace profiles</w:t>
-      </w:r>
+      <w:hyperlink w:anchor="Cut_KB15">
+        <w:r>
+          <w:rPr>
+            <w:color w:val="9C2430"/>
+            <w:u w:val="single"/>
+          </w:rPr>
+          <w:t>Cut-KB15  Manage storage appearance and workspace profiles</w:t>
+        </w:r>
+      </w:hyperlink>
     </w:p>
     <w:p>
       <w:pPr>
         <w:spacing w:after="80"/>
       </w:pPr>
-      <w:r>
-        <w:rPr>
-          <w:b/>
-        </w:rPr>
-        <w:t xml:space="preserve">Cut-KB16  </w:t>
-      </w:r>
-      <w:r>
-        <w:t>Find help report issues and review crashes</w:t>
-      </w:r>
+      <w:hyperlink w:anchor="Cut_KB16">
+        <w:r>
+          <w:rPr>
+            <w:color w:val="9C2430"/>
+            <w:u w:val="single"/>
+          </w:rPr>
+          <w:t>Cut-KB16  Find help report issues and review crashes</w:t>
+        </w:r>
+      </w:hyperlink>
     </w:p>
     <w:p>
       <w:r>
@@ -266,11 +268,57 @@
       </w:r>
     </w:p>
     <w:p>
+      <w:bookmarkStart w:id="1" w:name="Cut_KB1"/>
       <w:pPr>
         <w:pStyle w:val="Heading1"/>
       </w:pPr>
       <w:r>
         <w:t>Cut-KB1 Create a project and import media</w:t>
+      </w:r>
+      <w:bookmarkEnd w:id="1"/>
+    </w:p>
+    <w:p>
+      <w:r>
+        <w:drawing>
+          <wp:inline xmlns:a="http://schemas.openxmlformats.org/drawingml/2006/main" xmlns:pic="http://schemas.openxmlformats.org/drawingml/2006/picture">
+            <wp:extent cx="6217920" cy="4145280"/>
+            <wp:docPr id="1" name="Picture 1"/>
+            <wp:cNvGraphicFramePr>
+              <a:graphicFrameLocks noChangeAspect="1"/>
+            </wp:cNvGraphicFramePr>
+            <a:graphic>
+              <a:graphicData uri="http://schemas.openxmlformats.org/drawingml/2006/picture">
+                <pic:pic>
+                  <pic:nvPicPr>
+                    <pic:cNvPr id="0" name="editing-studio.png"/>
+                    <pic:cNvPicPr/>
+                  </pic:nvPicPr>
+                  <pic:blipFill>
+                    <a:blip r:embed="rId9"/>
+                    <a:stretch>
+                      <a:fillRect/>
+                    </a:stretch>
+                  </pic:blipFill>
+                  <pic:spPr>
+                    <a:xfrm>
+                      <a:off x="0" y="0"/>
+                      <a:ext cx="6217920" cy="4145280"/>
+                    </a:xfrm>
+                    <a:prstGeom prst="rect"/>
+                  </pic:spPr>
+                </pic:pic>
+              </a:graphicData>
+            </a:graphic>
+          </wp:inline>
+        </w:drawing>
+      </w:r>
+    </w:p>
+    <w:p>
+      <w:r>
+        <w:rPr>
+          <w:sz w:val="18"/>
+        </w:rPr>
+        <w:t>Figure 1. Editing studio with synthetic demo footage, a video overlay and an editable caption.</w:t>
       </w:r>
     </w:p>
     <w:p>
@@ -291,16 +339,53 @@
         <w:rPr>
           <w:sz w:val="20"/>
         </w:rPr>
-        <w:t>Related articles  Cut-KB2, Cut-KB9</w:t>
+        <w:t xml:space="preserve">Related articles  </w:t>
       </w:r>
+      <w:hyperlink w:anchor="Cut_KB2">
+        <w:r>
+          <w:rPr>
+            <w:color w:val="9C2430"/>
+            <w:u w:val="single"/>
+          </w:rPr>
+          <w:t>Cut-KB2</w:t>
+        </w:r>
+      </w:hyperlink>
+      <w:r>
+        <w:rPr>
+          <w:sz w:val="20"/>
+        </w:rPr>
+        <w:t xml:space="preserve">  |  </w:t>
+      </w:r>
+      <w:hyperlink w:anchor="Cut_KB9">
+        <w:r>
+          <w:rPr>
+            <w:color w:val="9C2430"/>
+            <w:u w:val="single"/>
+          </w:rPr>
+          <w:t>Cut-KB9</w:t>
+        </w:r>
+      </w:hyperlink>
     </w:p>
     <w:p>
+      <w:hyperlink w:anchor="KB_Index">
+        <w:r>
+          <w:rPr>
+            <w:color w:val="9C2430"/>
+            <w:u w:val="single"/>
+          </w:rPr>
+          <w:t>Back to index</w:t>
+        </w:r>
+      </w:hyperlink>
+    </w:p>
+    <w:p>
+      <w:bookmarkStart w:id="2" w:name="Cut_KB2"/>
       <w:pPr>
         <w:pStyle w:val="Heading1"/>
       </w:pPr>
       <w:r>
         <w:t>Cut-KB2 Edit stacked timeline tracks</w:t>
       </w:r>
+      <w:bookmarkEnd w:id="2"/>
     </w:p>
     <w:p>
       <w:r>
@@ -320,16 +405,53 @@
         <w:rPr>
           <w:sz w:val="20"/>
         </w:rPr>
-        <w:t>Related articles  Cut-KB3, Cut-KB10</w:t>
+        <w:t xml:space="preserve">Related articles  </w:t>
       </w:r>
+      <w:hyperlink w:anchor="Cut_KB3">
+        <w:r>
+          <w:rPr>
+            <w:color w:val="9C2430"/>
+            <w:u w:val="single"/>
+          </w:rPr>
+          <w:t>Cut-KB3</w:t>
+        </w:r>
+      </w:hyperlink>
+      <w:r>
+        <w:rPr>
+          <w:sz w:val="20"/>
+        </w:rPr>
+        <w:t xml:space="preserve">  |  </w:t>
+      </w:r>
+      <w:hyperlink w:anchor="Cut_KB10">
+        <w:r>
+          <w:rPr>
+            <w:color w:val="9C2430"/>
+            <w:u w:val="single"/>
+          </w:rPr>
+          <w:t>Cut-KB10</w:t>
+        </w:r>
+      </w:hyperlink>
     </w:p>
     <w:p>
+      <w:hyperlink w:anchor="KB_Index">
+        <w:r>
+          <w:rPr>
+            <w:color w:val="9C2430"/>
+            <w:u w:val="single"/>
+          </w:rPr>
+          <w:t>Back to index</w:t>
+        </w:r>
+      </w:hyperlink>
+    </w:p>
+    <w:p>
+      <w:bookmarkStart w:id="3" w:name="Cut_KB3"/>
       <w:pPr>
         <w:pStyle w:val="Heading1"/>
       </w:pPr>
       <w:r>
         <w:t>Cut-KB3 Configure timecode zoom and shortcuts</w:t>
       </w:r>
+      <w:bookmarkEnd w:id="3"/>
     </w:p>
     <w:p>
       <w:r>
@@ -349,16 +471,53 @@
         <w:rPr>
           <w:sz w:val="20"/>
         </w:rPr>
-        <w:t>Related articles  Cut-KB2, Cut-KB4</w:t>
+        <w:t xml:space="preserve">Related articles  </w:t>
       </w:r>
+      <w:hyperlink w:anchor="Cut_KB2">
+        <w:r>
+          <w:rPr>
+            <w:color w:val="9C2430"/>
+            <w:u w:val="single"/>
+          </w:rPr>
+          <w:t>Cut-KB2</w:t>
+        </w:r>
+      </w:hyperlink>
+      <w:r>
+        <w:rPr>
+          <w:sz w:val="20"/>
+        </w:rPr>
+        <w:t xml:space="preserve">  |  </w:t>
+      </w:r>
+      <w:hyperlink w:anchor="Cut_KB4">
+        <w:r>
+          <w:rPr>
+            <w:color w:val="9C2430"/>
+            <w:u w:val="single"/>
+          </w:rPr>
+          <w:t>Cut-KB4</w:t>
+        </w:r>
+      </w:hyperlink>
     </w:p>
     <w:p>
+      <w:hyperlink w:anchor="KB_Index">
+        <w:r>
+          <w:rPr>
+            <w:color w:val="9C2430"/>
+            <w:u w:val="single"/>
+          </w:rPr>
+          <w:t>Back to index</w:t>
+        </w:r>
+      </w:hyperlink>
+    </w:p>
+    <w:p>
+      <w:bookmarkStart w:id="4" w:name="Cut_KB4"/>
       <w:pPr>
         <w:pStyle w:val="Heading1"/>
       </w:pPr>
       <w:r>
         <w:t>Cut-KB4 Arrange the workspace and preview monitor</w:t>
       </w:r>
+      <w:bookmarkEnd w:id="4"/>
     </w:p>
     <w:p>
       <w:r>
@@ -378,16 +537,53 @@
         <w:rPr>
           <w:sz w:val="20"/>
         </w:rPr>
-        <w:t>Related articles  Cut-KB3, Cut-KB13</w:t>
+        <w:t xml:space="preserve">Related articles  </w:t>
       </w:r>
+      <w:hyperlink w:anchor="Cut_KB3">
+        <w:r>
+          <w:rPr>
+            <w:color w:val="9C2430"/>
+            <w:u w:val="single"/>
+          </w:rPr>
+          <w:t>Cut-KB3</w:t>
+        </w:r>
+      </w:hyperlink>
+      <w:r>
+        <w:rPr>
+          <w:sz w:val="20"/>
+        </w:rPr>
+        <w:t xml:space="preserve">  |  </w:t>
+      </w:r>
+      <w:hyperlink w:anchor="Cut_KB13">
+        <w:r>
+          <w:rPr>
+            <w:color w:val="9C2430"/>
+            <w:u w:val="single"/>
+          </w:rPr>
+          <w:t>Cut-KB13</w:t>
+        </w:r>
+      </w:hyperlink>
     </w:p>
     <w:p>
+      <w:hyperlink w:anchor="KB_Index">
+        <w:r>
+          <w:rPr>
+            <w:color w:val="9C2430"/>
+            <w:u w:val="single"/>
+          </w:rPr>
+          <w:t>Back to index</w:t>
+        </w:r>
+      </w:hyperlink>
+    </w:p>
+    <w:p>
+      <w:bookmarkStart w:id="5" w:name="Cut_KB5"/>
       <w:pPr>
         <w:pStyle w:val="Heading1"/>
       </w:pPr>
       <w:r>
         <w:t>Cut-KB5 Correct colour and save grading profiles</w:t>
       </w:r>
+      <w:bookmarkEnd w:id="5"/>
     </w:p>
     <w:p>
       <w:r>
@@ -407,16 +603,53 @@
         <w:rPr>
           <w:sz w:val="20"/>
         </w:rPr>
-        <w:t>Related articles  Cut-KB6, Cut-KB13</w:t>
+        <w:t xml:space="preserve">Related articles  </w:t>
       </w:r>
+      <w:hyperlink w:anchor="Cut_KB6">
+        <w:r>
+          <w:rPr>
+            <w:color w:val="9C2430"/>
+            <w:u w:val="single"/>
+          </w:rPr>
+          <w:t>Cut-KB6</w:t>
+        </w:r>
+      </w:hyperlink>
+      <w:r>
+        <w:rPr>
+          <w:sz w:val="20"/>
+        </w:rPr>
+        <w:t xml:space="preserve">  |  </w:t>
+      </w:r>
+      <w:hyperlink w:anchor="Cut_KB13">
+        <w:r>
+          <w:rPr>
+            <w:color w:val="9C2430"/>
+            <w:u w:val="single"/>
+          </w:rPr>
+          <w:t>Cut-KB13</w:t>
+        </w:r>
+      </w:hyperlink>
     </w:p>
     <w:p>
+      <w:hyperlink w:anchor="KB_Index">
+        <w:r>
+          <w:rPr>
+            <w:color w:val="9C2430"/>
+            <w:u w:val="single"/>
+          </w:rPr>
+          <w:t>Back to index</w:t>
+        </w:r>
+      </w:hyperlink>
+    </w:p>
+    <w:p>
+      <w:bookmarkStart w:id="6" w:name="Cut_KB6"/>
       <w:pPr>
         <w:pStyle w:val="Heading1"/>
       </w:pPr>
       <w:r>
         <w:t>Cut-KB6 Crop mask key and blur footage</w:t>
       </w:r>
+      <w:bookmarkEnd w:id="6"/>
     </w:p>
     <w:p>
       <w:r>
@@ -436,16 +669,68 @@
         <w:rPr>
           <w:sz w:val="20"/>
         </w:rPr>
-        <w:t>Related articles  Cut-KB5, Cut-KB7, Cut-KB13</w:t>
+        <w:t xml:space="preserve">Related articles  </w:t>
       </w:r>
+      <w:hyperlink w:anchor="Cut_KB5">
+        <w:r>
+          <w:rPr>
+            <w:color w:val="9C2430"/>
+            <w:u w:val="single"/>
+          </w:rPr>
+          <w:t>Cut-KB5</w:t>
+        </w:r>
+      </w:hyperlink>
+      <w:r>
+        <w:rPr>
+          <w:sz w:val="20"/>
+        </w:rPr>
+        <w:t xml:space="preserve">  |  </w:t>
+      </w:r>
+      <w:hyperlink w:anchor="Cut_KB7">
+        <w:r>
+          <w:rPr>
+            <w:color w:val="9C2430"/>
+            <w:u w:val="single"/>
+          </w:rPr>
+          <w:t>Cut-KB7</w:t>
+        </w:r>
+      </w:hyperlink>
+      <w:r>
+        <w:rPr>
+          <w:sz w:val="20"/>
+        </w:rPr>
+        <w:t xml:space="preserve">  |  </w:t>
+      </w:r>
+      <w:hyperlink w:anchor="Cut_KB13">
+        <w:r>
+          <w:rPr>
+            <w:color w:val="9C2430"/>
+            <w:u w:val="single"/>
+          </w:rPr>
+          <w:t>Cut-KB13</w:t>
+        </w:r>
+      </w:hyperlink>
     </w:p>
     <w:p>
+      <w:hyperlink w:anchor="KB_Index">
+        <w:r>
+          <w:rPr>
+            <w:color w:val="9C2430"/>
+            <w:u w:val="single"/>
+          </w:rPr>
+          <w:t>Back to index</w:t>
+        </w:r>
+      </w:hyperlink>
+    </w:p>
+    <w:p>
+      <w:bookmarkStart w:id="7" w:name="Cut_KB7"/>
       <w:pPr>
         <w:pStyle w:val="Heading1"/>
       </w:pPr>
       <w:r>
         <w:t>Cut-KB7 Animate movement track subjects and adjust speed</w:t>
       </w:r>
+      <w:bookmarkEnd w:id="7"/>
     </w:p>
     <w:p>
       <w:r>
@@ -465,16 +750,53 @@
         <w:rPr>
           <w:sz w:val="20"/>
         </w:rPr>
-        <w:t>Related articles  Cut-KB2, Cut-KB6</w:t>
+        <w:t xml:space="preserve">Related articles  </w:t>
       </w:r>
+      <w:hyperlink w:anchor="Cut_KB2">
+        <w:r>
+          <w:rPr>
+            <w:color w:val="9C2430"/>
+            <w:u w:val="single"/>
+          </w:rPr>
+          <w:t>Cut-KB2</w:t>
+        </w:r>
+      </w:hyperlink>
+      <w:r>
+        <w:rPr>
+          <w:sz w:val="20"/>
+        </w:rPr>
+        <w:t xml:space="preserve">  |  </w:t>
+      </w:r>
+      <w:hyperlink w:anchor="Cut_KB6">
+        <w:r>
+          <w:rPr>
+            <w:color w:val="9C2430"/>
+            <w:u w:val="single"/>
+          </w:rPr>
+          <w:t>Cut-KB6</w:t>
+        </w:r>
+      </w:hyperlink>
     </w:p>
     <w:p>
+      <w:hyperlink w:anchor="KB_Index">
+        <w:r>
+          <w:rPr>
+            <w:color w:val="9C2430"/>
+            <w:u w:val="single"/>
+          </w:rPr>
+          <w:t>Back to index</w:t>
+        </w:r>
+      </w:hyperlink>
+    </w:p>
+    <w:p>
+      <w:bookmarkStart w:id="8" w:name="Cut_KB8"/>
       <w:pPr>
         <w:pStyle w:val="Heading1"/>
       </w:pPr>
       <w:r>
         <w:t>Cut-KB8 Mix audio record voice and reduce noise</w:t>
       </w:r>
+      <w:bookmarkEnd w:id="8"/>
     </w:p>
     <w:p>
       <w:r>
@@ -494,16 +816,53 @@
         <w:rPr>
           <w:sz w:val="20"/>
         </w:rPr>
-        <w:t>Related articles  Cut-KB10, Cut-KB14</w:t>
+        <w:t xml:space="preserve">Related articles  </w:t>
       </w:r>
+      <w:hyperlink w:anchor="Cut_KB10">
+        <w:r>
+          <w:rPr>
+            <w:color w:val="9C2430"/>
+            <w:u w:val="single"/>
+          </w:rPr>
+          <w:t>Cut-KB10</w:t>
+        </w:r>
+      </w:hyperlink>
+      <w:r>
+        <w:rPr>
+          <w:sz w:val="20"/>
+        </w:rPr>
+        <w:t xml:space="preserve">  |  </w:t>
+      </w:r>
+      <w:hyperlink w:anchor="Cut_KB14">
+        <w:r>
+          <w:rPr>
+            <w:color w:val="9C2430"/>
+            <w:u w:val="single"/>
+          </w:rPr>
+          <w:t>Cut-KB14</w:t>
+        </w:r>
+      </w:hyperlink>
     </w:p>
     <w:p>
+      <w:hyperlink w:anchor="KB_Index">
+        <w:r>
+          <w:rPr>
+            <w:color w:val="9C2430"/>
+            <w:u w:val="single"/>
+          </w:rPr>
+          <w:t>Back to index</w:t>
+        </w:r>
+      </w:hyperlink>
+    </w:p>
+    <w:p>
+      <w:bookmarkStart w:id="9" w:name="Cut_KB9"/>
       <w:pPr>
         <w:pStyle w:val="Heading1"/>
       </w:pPr>
       <w:r>
         <w:t>Cut-KB9 Save projects recover edits and keep backups</w:t>
       </w:r>
+      <w:bookmarkEnd w:id="9"/>
     </w:p>
     <w:p>
       <w:r>
@@ -523,16 +882,53 @@
         <w:rPr>
           <w:sz w:val="20"/>
         </w:rPr>
-        <w:t>Related articles  Cut-KB1, Cut-KB15</w:t>
+        <w:t xml:space="preserve">Related articles  </w:t>
       </w:r>
+      <w:hyperlink w:anchor="Cut_KB1">
+        <w:r>
+          <w:rPr>
+            <w:color w:val="9C2430"/>
+            <w:u w:val="single"/>
+          </w:rPr>
+          <w:t>Cut-KB1</w:t>
+        </w:r>
+      </w:hyperlink>
+      <w:r>
+        <w:rPr>
+          <w:sz w:val="20"/>
+        </w:rPr>
+        <w:t xml:space="preserve">  |  </w:t>
+      </w:r>
+      <w:hyperlink w:anchor="Cut_KB15">
+        <w:r>
+          <w:rPr>
+            <w:color w:val="9C2430"/>
+            <w:u w:val="single"/>
+          </w:rPr>
+          <w:t>Cut-KB15</w:t>
+        </w:r>
+      </w:hyperlink>
     </w:p>
     <w:p>
+      <w:hyperlink w:anchor="KB_Index">
+        <w:r>
+          <w:rPr>
+            <w:color w:val="9C2430"/>
+            <w:u w:val="single"/>
+          </w:rPr>
+          <w:t>Back to index</w:t>
+        </w:r>
+      </w:hyperlink>
+    </w:p>
+    <w:p>
+      <w:bookmarkStart w:id="10" w:name="Cut_KB10"/>
       <w:pPr>
         <w:pStyle w:val="Heading1"/>
       </w:pPr>
       <w:r>
         <w:t>Cut-KB10 Generate edit and style captions</w:t>
       </w:r>
+      <w:bookmarkEnd w:id="10"/>
     </w:p>
     <w:p>
       <w:r>
@@ -552,16 +948,53 @@
         <w:rPr>
           <w:sz w:val="20"/>
         </w:rPr>
-        <w:t>Related articles  Cut-KB8, Cut-KB14</w:t>
+        <w:t xml:space="preserve">Related articles  </w:t>
       </w:r>
+      <w:hyperlink w:anchor="Cut_KB8">
+        <w:r>
+          <w:rPr>
+            <w:color w:val="9C2430"/>
+            <w:u w:val="single"/>
+          </w:rPr>
+          <w:t>Cut-KB8</w:t>
+        </w:r>
+      </w:hyperlink>
+      <w:r>
+        <w:rPr>
+          <w:sz w:val="20"/>
+        </w:rPr>
+        <w:t xml:space="preserve">  |  </w:t>
+      </w:r>
+      <w:hyperlink w:anchor="Cut_KB14">
+        <w:r>
+          <w:rPr>
+            <w:color w:val="9C2430"/>
+            <w:u w:val="single"/>
+          </w:rPr>
+          <w:t>Cut-KB14</w:t>
+        </w:r>
+      </w:hyperlink>
     </w:p>
     <w:p>
+      <w:hyperlink w:anchor="KB_Index">
+        <w:r>
+          <w:rPr>
+            <w:color w:val="9C2430"/>
+            <w:u w:val="single"/>
+          </w:rPr>
+          <w:t>Back to index</w:t>
+        </w:r>
+      </w:hyperlink>
+    </w:p>
+    <w:p>
+      <w:bookmarkStart w:id="11" w:name="Cut_KB11"/>
       <w:pPr>
         <w:pStyle w:val="Heading1"/>
       </w:pPr>
       <w:r>
         <w:t>Cut-KB11 Build templates intros and asset collections</w:t>
       </w:r>
+      <w:bookmarkEnd w:id="11"/>
     </w:p>
     <w:p>
       <w:r>
@@ -581,16 +1014,53 @@
         <w:rPr>
           <w:sz w:val="20"/>
         </w:rPr>
-        <w:t>Related articles  Cut-KB1, Cut-KB4</w:t>
+        <w:t xml:space="preserve">Related articles  </w:t>
       </w:r>
+      <w:hyperlink w:anchor="Cut_KB1">
+        <w:r>
+          <w:rPr>
+            <w:color w:val="9C2430"/>
+            <w:u w:val="single"/>
+          </w:rPr>
+          <w:t>Cut-KB1</w:t>
+        </w:r>
+      </w:hyperlink>
+      <w:r>
+        <w:rPr>
+          <w:sz w:val="20"/>
+        </w:rPr>
+        <w:t xml:space="preserve">  |  </w:t>
+      </w:r>
+      <w:hyperlink w:anchor="Cut_KB4">
+        <w:r>
+          <w:rPr>
+            <w:color w:val="9C2430"/>
+            <w:u w:val="single"/>
+          </w:rPr>
+          <w:t>Cut-KB4</w:t>
+        </w:r>
+      </w:hyperlink>
     </w:p>
     <w:p>
+      <w:hyperlink w:anchor="KB_Index">
+        <w:r>
+          <w:rPr>
+            <w:color w:val="9C2430"/>
+            <w:u w:val="single"/>
+          </w:rPr>
+          <w:t>Back to index</w:t>
+        </w:r>
+      </w:hyperlink>
+    </w:p>
+    <w:p>
+      <w:bookmarkStart w:id="12" w:name="Cut_KB12"/>
       <w:pPr>
         <w:pStyle w:val="Heading1"/>
       </w:pPr>
       <w:r>
         <w:t>Cut-KB12 Export video audio GIFs and thumbnails</w:t>
       </w:r>
+      <w:bookmarkEnd w:id="12"/>
     </w:p>
     <w:p>
       <w:r>
@@ -610,16 +1080,53 @@
         <w:rPr>
           <w:sz w:val="20"/>
         </w:rPr>
-        <w:t>Related articles  Cut-KB13, Cut-KB14</w:t>
+        <w:t xml:space="preserve">Related articles  </w:t>
       </w:r>
+      <w:hyperlink w:anchor="Cut_KB13">
+        <w:r>
+          <w:rPr>
+            <w:color w:val="9C2430"/>
+            <w:u w:val="single"/>
+          </w:rPr>
+          <w:t>Cut-KB13</w:t>
+        </w:r>
+      </w:hyperlink>
+      <w:r>
+        <w:rPr>
+          <w:sz w:val="20"/>
+        </w:rPr>
+        <w:t xml:space="preserve">  |  </w:t>
+      </w:r>
+      <w:hyperlink w:anchor="Cut_KB14">
+        <w:r>
+          <w:rPr>
+            <w:color w:val="9C2430"/>
+            <w:u w:val="single"/>
+          </w:rPr>
+          <w:t>Cut-KB14</w:t>
+        </w:r>
+      </w:hyperlink>
     </w:p>
     <w:p>
+      <w:hyperlink w:anchor="KB_Index">
+        <w:r>
+          <w:rPr>
+            <w:color w:val="9C2430"/>
+            <w:u w:val="single"/>
+          </w:rPr>
+          <w:t>Back to index</w:t>
+        </w:r>
+      </w:hyperlink>
+    </w:p>
+    <w:p>
+      <w:bookmarkStart w:id="13" w:name="Cut_KB13"/>
       <w:pPr>
         <w:pStyle w:val="Heading1"/>
       </w:pPr>
       <w:r>
         <w:t>Cut-KB13 Understand quality HDR and performance</w:t>
       </w:r>
+      <w:bookmarkEnd w:id="13"/>
     </w:p>
     <w:p>
       <w:r>
@@ -639,16 +1146,68 @@
         <w:rPr>
           <w:sz w:val="20"/>
         </w:rPr>
-        <w:t>Related articles  Cut-KB4, Cut-KB5, Cut-KB12</w:t>
+        <w:t xml:space="preserve">Related articles  </w:t>
       </w:r>
+      <w:hyperlink w:anchor="Cut_KB4">
+        <w:r>
+          <w:rPr>
+            <w:color w:val="9C2430"/>
+            <w:u w:val="single"/>
+          </w:rPr>
+          <w:t>Cut-KB4</w:t>
+        </w:r>
+      </w:hyperlink>
+      <w:r>
+        <w:rPr>
+          <w:sz w:val="20"/>
+        </w:rPr>
+        <w:t xml:space="preserve">  |  </w:t>
+      </w:r>
+      <w:hyperlink w:anchor="Cut_KB5">
+        <w:r>
+          <w:rPr>
+            <w:color w:val="9C2430"/>
+            <w:u w:val="single"/>
+          </w:rPr>
+          <w:t>Cut-KB5</w:t>
+        </w:r>
+      </w:hyperlink>
+      <w:r>
+        <w:rPr>
+          <w:sz w:val="20"/>
+        </w:rPr>
+        <w:t xml:space="preserve">  |  </w:t>
+      </w:r>
+      <w:hyperlink w:anchor="Cut_KB12">
+        <w:r>
+          <w:rPr>
+            <w:color w:val="9C2430"/>
+            <w:u w:val="single"/>
+          </w:rPr>
+          <w:t>Cut-KB12</w:t>
+        </w:r>
+      </w:hyperlink>
     </w:p>
     <w:p>
+      <w:hyperlink w:anchor="KB_Index">
+        <w:r>
+          <w:rPr>
+            <w:color w:val="9C2430"/>
+            <w:u w:val="single"/>
+          </w:rPr>
+          <w:t>Back to index</w:t>
+        </w:r>
+      </w:hyperlink>
+    </w:p>
+    <w:p>
+      <w:bookmarkStart w:id="14" w:name="Cut_KB14"/>
       <w:pPr>
         <w:pStyle w:val="Heading1"/>
       </w:pPr>
       <w:r>
         <w:t>Cut-KB14 Connect services and check recording matches</w:t>
       </w:r>
+      <w:bookmarkEnd w:id="14"/>
     </w:p>
     <w:p>
       <w:r>
@@ -673,16 +1232,68 @@
         <w:rPr>
           <w:sz w:val="20"/>
         </w:rPr>
-        <w:t>Related articles  Cut-KB8, Cut-KB10, Cut-KB12</w:t>
+        <w:t xml:space="preserve">Related articles  </w:t>
       </w:r>
+      <w:hyperlink w:anchor="Cut_KB8">
+        <w:r>
+          <w:rPr>
+            <w:color w:val="9C2430"/>
+            <w:u w:val="single"/>
+          </w:rPr>
+          <w:t>Cut-KB8</w:t>
+        </w:r>
+      </w:hyperlink>
+      <w:r>
+        <w:rPr>
+          <w:sz w:val="20"/>
+        </w:rPr>
+        <w:t xml:space="preserve">  |  </w:t>
+      </w:r>
+      <w:hyperlink w:anchor="Cut_KB10">
+        <w:r>
+          <w:rPr>
+            <w:color w:val="9C2430"/>
+            <w:u w:val="single"/>
+          </w:rPr>
+          <w:t>Cut-KB10</w:t>
+        </w:r>
+      </w:hyperlink>
+      <w:r>
+        <w:rPr>
+          <w:sz w:val="20"/>
+        </w:rPr>
+        <w:t xml:space="preserve">  |  </w:t>
+      </w:r>
+      <w:hyperlink w:anchor="Cut_KB12">
+        <w:r>
+          <w:rPr>
+            <w:color w:val="9C2430"/>
+            <w:u w:val="single"/>
+          </w:rPr>
+          <w:t>Cut-KB12</w:t>
+        </w:r>
+      </w:hyperlink>
     </w:p>
     <w:p>
+      <w:hyperlink w:anchor="KB_Index">
+        <w:r>
+          <w:rPr>
+            <w:color w:val="9C2430"/>
+            <w:u w:val="single"/>
+          </w:rPr>
+          <w:t>Back to index</w:t>
+        </w:r>
+      </w:hyperlink>
+    </w:p>
+    <w:p>
+      <w:bookmarkStart w:id="15" w:name="Cut_KB15"/>
       <w:pPr>
         <w:pStyle w:val="Heading1"/>
       </w:pPr>
       <w:r>
         <w:t>Cut-KB15 Manage storage appearance and workspace profiles</w:t>
       </w:r>
+      <w:bookmarkEnd w:id="15"/>
     </w:p>
     <w:p>
       <w:r>
@@ -691,7 +1302,12 @@
     </w:p>
     <w:p>
       <w:r>
-        <w:t>Scans are on demand, skip symbolic links, and stop after 100,000 files or 20 directory levels. Changing a quick-access folder does not move or delete its files. Generated previews, speech, extracted WAVs and merged clips remain local assets; delete only files no longer referenced by saved projects.</w:t>
+        <w:t>Scans are on demand, skip symbolic links, and stop after 100,000 files or 20 directory levels. Changing a quick-access folder does not move or delete its files. Generated previews, speech, extracted WAVs and merged clips remain local assets; delete only files no longer referenced by saved projects. Desktop export notifications contain a generic completion message and the app icon; click to return to Cut and reveal the export, or dismiss using your operating system.</w:t>
+      </w:r>
+    </w:p>
+    <w:p>
+      <w:r>
+        <w:t>Disable them in Appearance. Native notification styling and permission controls depend on the OS. Close window to tray keeps editing and processing available; use Quit TMA-Cut in the tray to exit. Disable close-to-tray in Appearance to quit with the window.</w:t>
       </w:r>
     </w:p>
     <w:p>
@@ -702,16 +1318,53 @@
         <w:rPr>
           <w:sz w:val="20"/>
         </w:rPr>
-        <w:t>Related articles  Cut-KB4, Cut-KB9</w:t>
+        <w:t xml:space="preserve">Related articles  </w:t>
       </w:r>
+      <w:hyperlink w:anchor="Cut_KB4">
+        <w:r>
+          <w:rPr>
+            <w:color w:val="9C2430"/>
+            <w:u w:val="single"/>
+          </w:rPr>
+          <w:t>Cut-KB4</w:t>
+        </w:r>
+      </w:hyperlink>
+      <w:r>
+        <w:rPr>
+          <w:sz w:val="20"/>
+        </w:rPr>
+        <w:t xml:space="preserve">  |  </w:t>
+      </w:r>
+      <w:hyperlink w:anchor="Cut_KB9">
+        <w:r>
+          <w:rPr>
+            <w:color w:val="9C2430"/>
+            <w:u w:val="single"/>
+          </w:rPr>
+          <w:t>Cut-KB9</w:t>
+        </w:r>
+      </w:hyperlink>
     </w:p>
     <w:p>
+      <w:hyperlink w:anchor="KB_Index">
+        <w:r>
+          <w:rPr>
+            <w:color w:val="9C2430"/>
+            <w:u w:val="single"/>
+          </w:rPr>
+          <w:t>Back to index</w:t>
+        </w:r>
+      </w:hyperlink>
+    </w:p>
+    <w:p>
+      <w:bookmarkStart w:id="16" w:name="Cut_KB16"/>
       <w:pPr>
         <w:pStyle w:val="Heading1"/>
       </w:pPr>
       <w:r>
         <w:t>Cut-KB16 Find help report issues and review crashes</w:t>
       </w:r>
+      <w:bookmarkEnd w:id="16"/>
     </w:p>
     <w:p>
       <w:r>
@@ -731,11 +1384,46 @@
         <w:rPr>
           <w:sz w:val="20"/>
         </w:rPr>
-        <w:t>Related articles  Cut-KB9, Cut-KB13</w:t>
+        <w:t xml:space="preserve">Related articles  </w:t>
       </w:r>
+      <w:hyperlink w:anchor="Cut_KB9">
+        <w:r>
+          <w:rPr>
+            <w:color w:val="9C2430"/>
+            <w:u w:val="single"/>
+          </w:rPr>
+          <w:t>Cut-KB9</w:t>
+        </w:r>
+      </w:hyperlink>
+      <w:r>
+        <w:rPr>
+          <w:sz w:val="20"/>
+        </w:rPr>
+        <w:t xml:space="preserve">  |  </w:t>
+      </w:r>
+      <w:hyperlink w:anchor="Cut_KB13">
+        <w:r>
+          <w:rPr>
+            <w:color w:val="9C2430"/>
+            <w:u w:val="single"/>
+          </w:rPr>
+          <w:t>Cut-KB13</w:t>
+        </w:r>
+      </w:hyperlink>
+    </w:p>
+    <w:p>
+      <w:hyperlink w:anchor="KB_Index">
+        <w:r>
+          <w:rPr>
+            <w:color w:val="9C2430"/>
+            <w:u w:val="single"/>
+          </w:rPr>
+          <w:t>Back to index</w:t>
+        </w:r>
+      </w:hyperlink>
     </w:p>
     <w:sectPr>
-      <w:footerReference w:type="default" r:id="rId9"/>
+      <w:footerReference w:type="default" r:id="rId10"/>
       <w:pgSz w:w="12240" w:h="15840"/>
       <w:pgMar w:top="1080" w:right="1152" w:bottom="1080" w:left="1152" w:header="720" w:footer="720" w:gutter="0"/>
       <w:cols w:space="720"/>

</xml_diff>

<commit_message>
Add TMA-Libraries coming-soon listing in launcher 1.14.1
Register Libraries on Windows, macOS and Linux without advertising unpublished installers or OS support. Preserve app ordering and provide source and details access. Add Launcher-KB13, screenshots and updated linked Word library. Verified 188 Windows checks, startup/idle resource budgets and 37 desktop checks (one native-process test requires macOS/Linux).
</commit_message>
<xml_diff>
--- a/docs/KB Library.docx
+++ b/docs/KB Library.docx
@@ -20,7 +20,7 @@
     </w:p>
     <w:p>
       <w:r>
-        <w:t>Release 1.14.0  |  21 October 2026  |  DaddyTylerXO</w:t>
+        <w:t>Release 1.14.1  |  21 October 2026  |  DaddyTylerXO</w:t>
       </w:r>
     </w:p>
     <w:p>
@@ -712,6 +712,57 @@
           </w:p>
         </w:tc>
       </w:tr>
+      <w:tr>
+        <w:tc>
+          <w:tcPr>
+            <w:tcW w:type="dxa" w:w="2376"/>
+            <w:vAlign w:val="center"/>
+            <w:shd w:fill="F5F5F5"/>
+            <w:tcBorders>
+              <w:top w:val="single" w:sz="4" w:color="D9D9D9"/>
+              <w:left w:val="single" w:sz="4" w:color="D9D9D9"/>
+              <w:bottom w:val="single" w:sz="4" w:color="D9D9D9"/>
+              <w:right w:val="single" w:sz="4" w:color="D9D9D9"/>
+            </w:tcBorders>
+          </w:tcPr>
+          <w:p>
+            <w:hyperlink w:anchor="Launcher_KB13" w:history="1">
+              <w:r>
+                <w:rPr>
+                  <w:color w:val="FFFFFF"/>
+                  <w:shd w:fill="CC5500"/>
+                  <w:b/>
+                </w:rPr>
+                <w:t xml:space="preserve">  Launcher‑KB13  </w:t>
+              </w:r>
+            </w:hyperlink>
+          </w:p>
+        </w:tc>
+        <w:tc>
+          <w:tcPr>
+            <w:tcW w:type="dxa" w:w="7416"/>
+            <w:vAlign w:val="center"/>
+            <w:shd w:fill="F5F5F5"/>
+            <w:tcBorders>
+              <w:top w:val="single" w:sz="4" w:color="D9D9D9"/>
+              <w:left w:val="single" w:sz="4" w:color="D9D9D9"/>
+              <w:bottom w:val="single" w:sz="4" w:color="D9D9D9"/>
+              <w:right w:val="single" w:sz="4" w:color="D9D9D9"/>
+            </w:tcBorders>
+          </w:tcPr>
+          <w:p>
+            <w:hyperlink w:anchor="Launcher_KB13" w:history="1">
+              <w:r>
+                <w:rPr>
+                  <w:color w:val="9B4300"/>
+                  <w:u w:val="single"/>
+                </w:rPr>
+                <w:t xml:space="preserve">Coming soon applications</w:t>
+              </w:r>
+            </w:hyperlink>
+          </w:p>
+        </w:tc>
+      </w:tr>
     </w:tbl>
     <w:p>
       <w:r>
@@ -912,7 +963,20 @@
         </w:r>
       </w:hyperlink>
       <w:r>
-        <w:t>.</w:t>
+        <w:t xml:space="preserve">. See </w:t>
+      </w:r>
+      <w:hyperlink w:anchor="Launcher_KB13" w:history="1">
+        <w:r>
+          <w:rPr>
+            <w:color w:val="FFFFFF"/>
+            <w:shd w:fill="CC5500"/>
+            <w:b/>
+          </w:rPr>
+          <w:t xml:space="preserve">  Launcher‑KB13  </w:t>
+        </w:r>
+      </w:hyperlink>
+      <w:r>
+        <w:t xml:space="preserve"> for coming-soon apps.</w:t>
       </w:r>
     </w:p>
     <w:p>
@@ -1998,6 +2062,136 @@
       </w:r>
     </w:p>
     <w:p>
+      <w:r>
+        <w:br w:type="page"/>
+      </w:r>
+    </w:p>
+    <w:p>
+      <w:bookmarkStart w:id="14" w:name="Launcher_KB13"/>
+      <w:pPr>
+        <w:pStyle w:val="Heading1"/>
+      </w:pPr>
+      <w:r>
+        <w:t>Launcher KB13 Coming soon applications</w:t>
+      </w:r>
+      <w:bookmarkEnd w:id="14"/>
+    </w:p>
+    <w:p>
+      <w:pPr>
+        <w:keepNext/>
+      </w:pPr>
+      <w:hyperlink w:anchor="KB_Index" w:history="1">
+        <w:r>
+          <w:rPr>
+            <w:color w:val="FFFFFF"/>
+            <w:shd w:fill="CC5500"/>
+            <w:b/>
+          </w:rPr>
+          <w:t xml:space="preserve">  Back to index  </w:t>
+        </w:r>
+      </w:hyperlink>
+    </w:p>
+    <w:p>
+      <w:pPr>
+        <w:keepNext/>
+      </w:pPr>
+      <w:r>
+        <w:t>Coming soon means no compatible installable build has been published. TMA-Libraries currently has a source branch only and uses a neutral question-mark placeholder until its app icon is available. Its version and update date are shown as not published, and no OS support badges are advertised.</w:t>
+      </w:r>
+    </w:p>
+    <w:p>
+      <w:pPr>
+        <w:keepNext/>
+      </w:pPr>
+      <w:r>
+        <w:t>You can open its Details screen or View source on GitHub from the options menu; installation stays disabled until a verified package is published. Libraries appears before SocialsManager, which stays immediately before Agent Office. Agent Office is always last and its number moves down when apps are added.</w:t>
+      </w:r>
+    </w:p>
+    <w:p>
+      <w:pPr>
+        <w:keepNext w:val="0"/>
+      </w:pPr>
+      <w:r>
+        <w:t xml:space="preserve">Check for updates to refresh published app availability. If you are using launcher 1.14.0 or earlier, accept the launcher update to support the expanded catalog. See </w:t>
+      </w:r>
+      <w:hyperlink w:anchor="Launcher_KB2" w:history="1">
+        <w:r>
+          <w:rPr>
+            <w:color w:val="FFFFFF"/>
+            <w:shd w:fill="CC5500"/>
+            <w:b/>
+          </w:rPr>
+          <w:t xml:space="preserve">  Launcher‑KB2  </w:t>
+        </w:r>
+      </w:hyperlink>
+      <w:r>
+        <w:t xml:space="preserve"> and </w:t>
+      </w:r>
+      <w:hyperlink w:anchor="Launcher_KB12" w:history="1">
+        <w:r>
+          <w:rPr>
+            <w:color w:val="FFFFFF"/>
+            <w:shd w:fill="CC5500"/>
+            <w:b/>
+          </w:rPr>
+          <w:t xml:space="preserve">  Launcher‑KB12  </w:t>
+        </w:r>
+      </w:hyperlink>
+      <w:r>
+        <w:t>.</w:t>
+      </w:r>
+    </w:p>
+    <w:p>
+      <w:pPr>
+        <w:keepNext/>
+        <w:jc w:val="center"/>
+      </w:pPr>
+      <w:r>
+        <w:drawing>
+          <wp:inline xmlns:a="http://schemas.openxmlformats.org/drawingml/2006/main" xmlns:pic="http://schemas.openxmlformats.org/drawingml/2006/picture">
+            <wp:extent cx="6035040" cy="1678193"/>
+            <wp:docPr id="10" name="Picture 10"/>
+            <wp:cNvGraphicFramePr>
+              <a:graphicFrameLocks noChangeAspect="1"/>
+            </wp:cNvGraphicFramePr>
+            <a:graphic>
+              <a:graphicData uri="http://schemas.openxmlformats.org/drawingml/2006/picture">
+                <pic:pic>
+                  <pic:nvPicPr>
+                    <pic:cNvPr id="0" name="image.png"/>
+                    <pic:cNvPicPr/>
+                  </pic:nvPicPr>
+                  <pic:blipFill>
+                    <a:blip r:embed="rId18"/>
+                    <a:stretch>
+                      <a:fillRect/>
+                    </a:stretch>
+                  </pic:blipFill>
+                  <pic:spPr>
+                    <a:xfrm>
+                      <a:off x="0" y="0"/>
+                      <a:ext cx="6035040" cy="1678193"/>
+                    </a:xfrm>
+                    <a:prstGeom prst="rect"/>
+                  </pic:spPr>
+                </pic:pic>
+              </a:graphicData>
+            </a:graphic>
+          </wp:inline>
+        </w:drawing>
+      </w:r>
+    </w:p>
+    <w:p>
+      <w:pPr>
+        <w:pStyle w:val="Caption"/>
+        <w:keepNext w:val="0"/>
+        <w:spacing w:after="240"/>
+      </w:pPr>
+      <w:r>
+        <w:t>TMA-Libraries has a coming-soon card, an unpublished version and date, and a disabled install action.</w:t>
+      </w:r>
+    </w:p>
+    <w:p>
       <w:pPr>
         <w:pStyle w:val="Heading1"/>
       </w:pPr>
@@ -2011,7 +2205,7 @@
       </w:r>
     </w:p>
     <w:sectPr>
-      <w:footerReference w:type="default" r:id="rId18"/>
+      <w:footerReference w:type="default" r:id="rId19"/>
       <w:pgSz w:w="12240" w:h="15840"/>
       <w:pgMar w:top="1152" w:right="1224" w:bottom="1152" w:left="1224" w:header="720" w:footer="720" w:gutter="0"/>
       <w:cols w:space="720"/>

</xml_diff>

<commit_message>
Publish Libraries and Finance integration in launcher 1.14.2
Add verified Windows development packages, source metadata and app icons. Fix per-app shortcut identities and scope optional profile deletion to the documented app folders. Build and verify actual packages through install/launch/uninstall, including disposable Finance renderer/resource checks; bundle the published catalog on macOS/Linux. Update KB13, add KB14 and refresh screenshots and the linked Word library. Local verification: 193 Windows checks and resource budgets, 38 desktop checks (one native-only check skipped), Libraries storage/smoke checks, Finance tests and real ZIP lifecycle checks.
</commit_message>
<xml_diff>
--- a/docs/KB Library.docx
+++ b/docs/KB Library.docx
@@ -20,7 +20,7 @@
     </w:p>
     <w:p>
       <w:r>
-        <w:t>Release 1.14.1  |  21 October 2026  |  DaddyTylerXO</w:t>
+        <w:t>Release 1.14.2  |  21 October 2026  |  DaddyTylerXO</w:t>
       </w:r>
     </w:p>
     <w:p>
@@ -758,6 +758,57 @@
                   <w:u w:val="single"/>
                 </w:rPr>
                 <w:t xml:space="preserve">Coming soon applications</w:t>
+              </w:r>
+            </w:hyperlink>
+          </w:p>
+        </w:tc>
+      </w:tr>
+      <w:tr>
+        <w:tc>
+          <w:tcPr>
+            <w:tcW w:type="dxa" w:w="2376"/>
+            <w:vAlign w:val="center"/>
+            <w:shd w:fill="FFFFFF"/>
+            <w:tcBorders>
+              <w:top w:val="single" w:sz="4" w:color="D9D9D9"/>
+              <w:left w:val="single" w:sz="4" w:color="D9D9D9"/>
+              <w:bottom w:val="single" w:sz="4" w:color="D9D9D9"/>
+              <w:right w:val="single" w:sz="4" w:color="D9D9D9"/>
+            </w:tcBorders>
+          </w:tcPr>
+          <w:p>
+            <w:hyperlink w:anchor="Launcher_KB14" w:history="1">
+              <w:r>
+                <w:rPr>
+                  <w:color w:val="FFFFFF"/>
+                  <w:shd w:fill="CC5500"/>
+                  <w:b/>
+                </w:rPr>
+                <w:t xml:space="preserve">  Launcher‑KB14  </w:t>
+              </w:r>
+            </w:hyperlink>
+          </w:p>
+        </w:tc>
+        <w:tc>
+          <w:tcPr>
+            <w:tcW w:type="dxa" w:w="7416"/>
+            <w:vAlign w:val="center"/>
+            <w:shd w:fill="FFFFFF"/>
+            <w:tcBorders>
+              <w:top w:val="single" w:sz="4" w:color="D9D9D9"/>
+              <w:left w:val="single" w:sz="4" w:color="D9D9D9"/>
+              <w:bottom w:val="single" w:sz="4" w:color="D9D9D9"/>
+              <w:right w:val="single" w:sz="4" w:color="D9D9D9"/>
+            </w:tcBorders>
+          </w:tcPr>
+          <w:p>
+            <w:hyperlink w:anchor="Launcher_KB14" w:history="1">
+              <w:r>
+                <w:rPr>
+                  <w:color w:val="9B4300"/>
+                  <w:u w:val="single"/>
+                </w:rPr>
+                <w:t xml:space="preserve">Install Libraries and Finance</w:t>
               </w:r>
             </w:hyperlink>
           </w:p>
@@ -2096,7 +2147,7 @@
         <w:keepNext/>
       </w:pPr>
       <w:r>
-        <w:t>Coming soon means no compatible installable build has been published. TMA-Libraries currently has a source branch only and uses a neutral question-mark placeholder until its app icon is available. Its version and update date are shown as not published, and no OS support badges are advertised.</w:t>
+        <w:t>Coming soon means no installable package has been published. A source branch or app icon alone does not mean an app is ready to install. Check for updates to refresh verified availability.</w:t>
       </w:r>
     </w:p>
     <w:p>
@@ -2104,7 +2155,7 @@
         <w:keepNext/>
       </w:pPr>
       <w:r>
-        <w:t>You can open its Details screen or View source on GitHub from the options menu; installation stays disabled until a verified package is published. Libraries appears before SocialsManager, which stays immediately before Agent Office. Agent Office is always last and its number moves down when apps are added.</w:t>
+        <w:t>The OS badges show the platforms with actual published builds; a Windows app cannot be installed by the macOS or Linux launcher. Libraries and Finance 0.1.0 now have Windows development packages and their app icons. Their feature sets are incomplete; review Details and release notes before installing.</w:t>
       </w:r>
     </w:p>
     <w:p>
@@ -2112,7 +2163,7 @@
         <w:keepNext w:val="0"/>
       </w:pPr>
       <w:r>
-        <w:t xml:space="preserve">Check for updates to refresh published app availability. If you are using launcher 1.14.0 or earlier, accept the launcher update to support the expanded catalog. See </w:t>
+        <w:t xml:space="preserve">SocialsManager stays immediately before Agent Office, which is always last and moves down when apps are added. Older launchers may need to update and restart before they can read an expanded app catalog. See </w:t>
       </w:r>
       <w:hyperlink w:anchor="Launcher_KB2" w:history="1">
         <w:r>
@@ -2127,14 +2178,115 @@
       <w:r>
         <w:t xml:space="preserve"> and </w:t>
       </w:r>
-      <w:hyperlink w:anchor="Launcher_KB12" w:history="1">
+      <w:hyperlink w:anchor="Launcher_KB14" w:history="1">
         <w:r>
           <w:rPr>
             <w:color w:val="FFFFFF"/>
             <w:shd w:fill="CC5500"/>
             <w:b/>
           </w:rPr>
-          <w:t xml:space="preserve">  Launcher‑KB12  </w:t>
+          <w:t xml:space="preserve">  Launcher‑KB14  </w:t>
+        </w:r>
+      </w:hyperlink>
+      <w:r>
+        <w:t>.</w:t>
+      </w:r>
+    </w:p>
+    <w:p>
+      <w:r>
+        <w:br w:type="page"/>
+      </w:r>
+    </w:p>
+    <w:p>
+      <w:bookmarkStart w:id="15" w:name="Launcher_KB14"/>
+      <w:pPr>
+        <w:pStyle w:val="Heading1"/>
+      </w:pPr>
+      <w:r>
+        <w:t>Launcher KB14 Install Libraries and Finance</w:t>
+      </w:r>
+      <w:bookmarkEnd w:id="15"/>
+    </w:p>
+    <w:p>
+      <w:pPr>
+        <w:keepNext/>
+      </w:pPr>
+      <w:hyperlink w:anchor="KB_Index" w:history="1">
+        <w:r>
+          <w:rPr>
+            <w:color w:val="FFFFFF"/>
+            <w:shd w:fill="CC5500"/>
+            <w:b/>
+          </w:rPr>
+          <w:t xml:space="preserve">  Back to index  </w:t>
+        </w:r>
+      </w:hyperlink>
+    </w:p>
+    <w:p>
+      <w:pPr>
+        <w:keepNext/>
+      </w:pPr>
+      <w:r>
+        <w:t>Launcher 1.14.2 adds Libraries and Finance 0.1.0 as Windows development builds. Choose Check updates, accept the launcher update and restart if needed, then choose Install app and an empty folder. Startup and desktop shortcuts are optional.</w:t>
+      </w:r>
+    </w:p>
+    <w:p>
+      <w:pPr>
+        <w:keepNext/>
+      </w:pPr>
+      <w:r>
+        <w:t>Libraries uses the brown folder icon and provides offline text notes, checklists and workspace recovery; advanced editors, encryption and integrations are pending. Finance uses the green bills icon and provides budgets, savings and a manual investment workspace; optional online providers require your own account and permissions inside Finance. No provider key is entered in the launcher.</w:t>
+      </w:r>
+    </w:p>
+    <w:p>
+      <w:pPr>
+        <w:keepNext/>
+      </w:pPr>
+      <w:r>
+        <w:t>Both apps store records locally without app-level encryption. Libraries uses the current Windows user local TMApps TMA-Libraries folder; Finance uses the roaming TMA-Finance profile. Uninstall keeps data by default; deleting standard local data requires your explicit choice and affects other copies using that profile.</w:t>
+      </w:r>
+    </w:p>
+    <w:p>
+      <w:pPr>
+        <w:keepNext w:val="0"/>
+      </w:pPr>
+      <w:r>
+        <w:t xml:space="preserve">Export backups before deletion. No macOS or Linux app build is advertised until a matching tested package exists. See </w:t>
+      </w:r>
+      <w:hyperlink w:anchor="Launcher_KB2" w:history="1">
+        <w:r>
+          <w:rPr>
+            <w:color w:val="FFFFFF"/>
+            <w:shd w:fill="CC5500"/>
+            <w:b/>
+          </w:rPr>
+          <w:t xml:space="preserve">  Launcher‑KB2  </w:t>
+        </w:r>
+      </w:hyperlink>
+      <w:r>
+        <w:t xml:space="preserve">, </w:t>
+      </w:r>
+      <w:hyperlink w:anchor="Launcher_KB10" w:history="1">
+        <w:r>
+          <w:rPr>
+            <w:color w:val="FFFFFF"/>
+            <w:shd w:fill="CC5500"/>
+            <w:b/>
+          </w:rPr>
+          <w:t xml:space="preserve">  Launcher‑KB10  </w:t>
+        </w:r>
+      </w:hyperlink>
+      <w:r>
+        <w:t xml:space="preserve"> and </w:t>
+      </w:r>
+      <w:hyperlink w:anchor="Launcher_KB13" w:history="1">
+        <w:r>
+          <w:rPr>
+            <w:color w:val="FFFFFF"/>
+            <w:shd w:fill="CC5500"/>
+            <w:b/>
+          </w:rPr>
+          <w:t xml:space="preserve">  Launcher‑KB13  </w:t>
         </w:r>
       </w:hyperlink>
       <w:r>
@@ -2149,7 +2301,7 @@
       <w:r>
         <w:drawing>
           <wp:inline xmlns:a="http://schemas.openxmlformats.org/drawingml/2006/main" xmlns:pic="http://schemas.openxmlformats.org/drawingml/2006/picture">
-            <wp:extent cx="6035040" cy="1678193"/>
+            <wp:extent cx="6035040" cy="3704934"/>
             <wp:docPr id="10" name="Picture 10"/>
             <wp:cNvGraphicFramePr>
               <a:graphicFrameLocks noChangeAspect="1"/>
@@ -2170,7 +2322,7 @@
                   <pic:spPr>
                     <a:xfrm>
                       <a:off x="0" y="0"/>
-                      <a:ext cx="6035040" cy="1678193"/>
+                      <a:ext cx="6035040" cy="3704934"/>
                     </a:xfrm>
                     <a:prstGeom prst="rect"/>
                   </pic:spPr>
@@ -2188,7 +2340,7 @@
         <w:spacing w:after="240"/>
       </w:pPr>
       <w:r>
-        <w:t>TMA-Libraries has a coming-soon card, an unpublished version and date, and a disabled install action.</w:t>
+        <w:t>Libraries and Finance show their actual app icons, version dates, Windows support and install actions.</w:t>
       </w:r>
     </w:p>
     <w:p>

</xml_diff>

<commit_message>
Release launcher 1.15 profile, showcase, settings and installer improvements
</commit_message>
<xml_diff>
--- a/docs/KB Library.docx
+++ b/docs/KB Library.docx
@@ -20,7 +20,7 @@
     </w:p>
     <w:p>
       <w:r>
-        <w:t>Release 1.14.2  |  22 October 2026  |  DaddyTylerXO</w:t>
+        <w:t>Release 1.15.0  |  23 October 2026  |  DaddyTylerXO</w:t>
       </w:r>
     </w:p>
     <w:p>
@@ -68,6 +68,9 @@
             </w:tcBorders>
           </w:tcPr>
           <w:p>
+            <w:pPr>
+              <w:spacing w:after="40" w:before="0" w:line="240" w:lineRule="auto"/>
+            </w:pPr>
             <w:r>
               <w:rPr>
                 <w:b/>
@@ -90,6 +93,9 @@
             </w:tcBorders>
           </w:tcPr>
           <w:p>
+            <w:pPr>
+              <w:spacing w:after="40" w:before="0" w:line="240" w:lineRule="auto"/>
+            </w:pPr>
             <w:r>
               <w:rPr>
                 <w:b/>
@@ -114,6 +120,9 @@
             </w:tcBorders>
           </w:tcPr>
           <w:p>
+            <w:pPr>
+              <w:spacing w:after="40" w:before="0" w:line="240" w:lineRule="auto"/>
+            </w:pPr>
             <w:hyperlink w:anchor="Launcher_KB1" w:history="1">
               <w:r>
                 <w:rPr>
@@ -139,6 +148,9 @@
             </w:tcBorders>
           </w:tcPr>
           <w:p>
+            <w:pPr>
+              <w:spacing w:after="40" w:before="0" w:line="240" w:lineRule="auto"/>
+            </w:pPr>
             <w:hyperlink w:anchor="Launcher_KB1" w:history="1">
               <w:r>
                 <w:rPr>
@@ -165,6 +177,9 @@
             </w:tcBorders>
           </w:tcPr>
           <w:p>
+            <w:pPr>
+              <w:spacing w:after="40" w:before="0" w:line="240" w:lineRule="auto"/>
+            </w:pPr>
             <w:hyperlink w:anchor="Launcher_KB2" w:history="1">
               <w:r>
                 <w:rPr>
@@ -190,6 +205,9 @@
             </w:tcBorders>
           </w:tcPr>
           <w:p>
+            <w:pPr>
+              <w:spacing w:after="40" w:before="0" w:line="240" w:lineRule="auto"/>
+            </w:pPr>
             <w:hyperlink w:anchor="Launcher_KB2" w:history="1">
               <w:r>
                 <w:rPr>
@@ -216,6 +234,9 @@
             </w:tcBorders>
           </w:tcPr>
           <w:p>
+            <w:pPr>
+              <w:spacing w:after="40" w:before="0" w:line="240" w:lineRule="auto"/>
+            </w:pPr>
             <w:hyperlink w:anchor="Launcher_KB3" w:history="1">
               <w:r>
                 <w:rPr>
@@ -241,6 +262,9 @@
             </w:tcBorders>
           </w:tcPr>
           <w:p>
+            <w:pPr>
+              <w:spacing w:after="40" w:before="0" w:line="240" w:lineRule="auto"/>
+            </w:pPr>
             <w:hyperlink w:anchor="Launcher_KB3" w:history="1">
               <w:r>
                 <w:rPr>
@@ -267,6 +291,9 @@
             </w:tcBorders>
           </w:tcPr>
           <w:p>
+            <w:pPr>
+              <w:spacing w:after="40" w:before="0" w:line="240" w:lineRule="auto"/>
+            </w:pPr>
             <w:hyperlink w:anchor="Launcher_KB4" w:history="1">
               <w:r>
                 <w:rPr>
@@ -292,6 +319,9 @@
             </w:tcBorders>
           </w:tcPr>
           <w:p>
+            <w:pPr>
+              <w:spacing w:after="40" w:before="0" w:line="240" w:lineRule="auto"/>
+            </w:pPr>
             <w:hyperlink w:anchor="Launcher_KB4" w:history="1">
               <w:r>
                 <w:rPr>
@@ -318,6 +348,9 @@
             </w:tcBorders>
           </w:tcPr>
           <w:p>
+            <w:pPr>
+              <w:spacing w:after="40" w:before="0" w:line="240" w:lineRule="auto"/>
+            </w:pPr>
             <w:hyperlink w:anchor="Launcher_KB5" w:history="1">
               <w:r>
                 <w:rPr>
@@ -343,6 +376,9 @@
             </w:tcBorders>
           </w:tcPr>
           <w:p>
+            <w:pPr>
+              <w:spacing w:after="40" w:before="0" w:line="240" w:lineRule="auto"/>
+            </w:pPr>
             <w:hyperlink w:anchor="Launcher_KB5" w:history="1">
               <w:r>
                 <w:rPr>
@@ -369,6 +405,9 @@
             </w:tcBorders>
           </w:tcPr>
           <w:p>
+            <w:pPr>
+              <w:spacing w:after="40" w:before="0" w:line="240" w:lineRule="auto"/>
+            </w:pPr>
             <w:hyperlink w:anchor="Launcher_KB6" w:history="1">
               <w:r>
                 <w:rPr>
@@ -394,6 +433,9 @@
             </w:tcBorders>
           </w:tcPr>
           <w:p>
+            <w:pPr>
+              <w:spacing w:after="40" w:before="0" w:line="240" w:lineRule="auto"/>
+            </w:pPr>
             <w:hyperlink w:anchor="Launcher_KB6" w:history="1">
               <w:r>
                 <w:rPr>
@@ -420,6 +462,9 @@
             </w:tcBorders>
           </w:tcPr>
           <w:p>
+            <w:pPr>
+              <w:spacing w:after="40" w:before="0" w:line="240" w:lineRule="auto"/>
+            </w:pPr>
             <w:hyperlink w:anchor="Launcher_KB7" w:history="1">
               <w:r>
                 <w:rPr>
@@ -445,6 +490,9 @@
             </w:tcBorders>
           </w:tcPr>
           <w:p>
+            <w:pPr>
+              <w:spacing w:after="40" w:before="0" w:line="240" w:lineRule="auto"/>
+            </w:pPr>
             <w:hyperlink w:anchor="Launcher_KB7" w:history="1">
               <w:r>
                 <w:rPr>
@@ -471,6 +519,9 @@
             </w:tcBorders>
           </w:tcPr>
           <w:p>
+            <w:pPr>
+              <w:spacing w:after="40" w:before="0" w:line="240" w:lineRule="auto"/>
+            </w:pPr>
             <w:hyperlink w:anchor="Launcher_KB8" w:history="1">
               <w:r>
                 <w:rPr>
@@ -496,6 +547,9 @@
             </w:tcBorders>
           </w:tcPr>
           <w:p>
+            <w:pPr>
+              <w:spacing w:after="40" w:before="0" w:line="240" w:lineRule="auto"/>
+            </w:pPr>
             <w:hyperlink w:anchor="Launcher_KB8" w:history="1">
               <w:r>
                 <w:rPr>
@@ -522,6 +576,9 @@
             </w:tcBorders>
           </w:tcPr>
           <w:p>
+            <w:pPr>
+              <w:spacing w:after="40" w:before="0" w:line="240" w:lineRule="auto"/>
+            </w:pPr>
             <w:hyperlink w:anchor="Launcher_KB9" w:history="1">
               <w:r>
                 <w:rPr>
@@ -547,6 +604,9 @@
             </w:tcBorders>
           </w:tcPr>
           <w:p>
+            <w:pPr>
+              <w:spacing w:after="40" w:before="0" w:line="240" w:lineRule="auto"/>
+            </w:pPr>
             <w:hyperlink w:anchor="Launcher_KB9" w:history="1">
               <w:r>
                 <w:rPr>
@@ -573,6 +633,9 @@
             </w:tcBorders>
           </w:tcPr>
           <w:p>
+            <w:pPr>
+              <w:spacing w:after="40" w:before="0" w:line="240" w:lineRule="auto"/>
+            </w:pPr>
             <w:hyperlink w:anchor="Launcher_KB10" w:history="1">
               <w:r>
                 <w:rPr>
@@ -598,6 +661,9 @@
             </w:tcBorders>
           </w:tcPr>
           <w:p>
+            <w:pPr>
+              <w:spacing w:after="40" w:before="0" w:line="240" w:lineRule="auto"/>
+            </w:pPr>
             <w:hyperlink w:anchor="Launcher_KB10" w:history="1">
               <w:r>
                 <w:rPr>
@@ -624,6 +690,9 @@
             </w:tcBorders>
           </w:tcPr>
           <w:p>
+            <w:pPr>
+              <w:spacing w:after="40" w:before="0" w:line="240" w:lineRule="auto"/>
+            </w:pPr>
             <w:hyperlink w:anchor="Launcher_KB11" w:history="1">
               <w:r>
                 <w:rPr>
@@ -649,6 +718,9 @@
             </w:tcBorders>
           </w:tcPr>
           <w:p>
+            <w:pPr>
+              <w:spacing w:after="40" w:before="0" w:line="240" w:lineRule="auto"/>
+            </w:pPr>
             <w:hyperlink w:anchor="Launcher_KB11" w:history="1">
               <w:r>
                 <w:rPr>
@@ -675,6 +747,9 @@
             </w:tcBorders>
           </w:tcPr>
           <w:p>
+            <w:pPr>
+              <w:spacing w:after="40" w:before="0" w:line="240" w:lineRule="auto"/>
+            </w:pPr>
             <w:hyperlink w:anchor="Launcher_KB12" w:history="1">
               <w:r>
                 <w:rPr>
@@ -700,6 +775,9 @@
             </w:tcBorders>
           </w:tcPr>
           <w:p>
+            <w:pPr>
+              <w:spacing w:after="40" w:before="0" w:line="240" w:lineRule="auto"/>
+            </w:pPr>
             <w:hyperlink w:anchor="Launcher_KB12" w:history="1">
               <w:r>
                 <w:rPr>
@@ -726,6 +804,9 @@
             </w:tcBorders>
           </w:tcPr>
           <w:p>
+            <w:pPr>
+              <w:spacing w:after="40" w:before="0" w:line="240" w:lineRule="auto"/>
+            </w:pPr>
             <w:hyperlink w:anchor="Launcher_KB13" w:history="1">
               <w:r>
                 <w:rPr>
@@ -751,6 +832,9 @@
             </w:tcBorders>
           </w:tcPr>
           <w:p>
+            <w:pPr>
+              <w:spacing w:after="40" w:before="0" w:line="240" w:lineRule="auto"/>
+            </w:pPr>
             <w:hyperlink w:anchor="Launcher_KB13" w:history="1">
               <w:r>
                 <w:rPr>
@@ -777,6 +861,9 @@
             </w:tcBorders>
           </w:tcPr>
           <w:p>
+            <w:pPr>
+              <w:spacing w:after="40" w:before="0" w:line="240" w:lineRule="auto"/>
+            </w:pPr>
             <w:hyperlink w:anchor="Launcher_KB14" w:history="1">
               <w:r>
                 <w:rPr>
@@ -802,6 +889,9 @@
             </w:tcBorders>
           </w:tcPr>
           <w:p>
+            <w:pPr>
+              <w:spacing w:after="40" w:before="0" w:line="240" w:lineRule="auto"/>
+            </w:pPr>
             <w:hyperlink w:anchor="Launcher_KB14" w:history="1">
               <w:r>
                 <w:rPr>
@@ -814,16 +904,183 @@
           </w:p>
         </w:tc>
       </w:tr>
+      <w:tr>
+        <w:tc>
+          <w:tcPr>
+            <w:tcW w:type="dxa" w:w="2376"/>
+            <w:vAlign w:val="center"/>
+            <w:shd w:fill="F5F5F5"/>
+            <w:tcBorders>
+              <w:top w:val="single" w:sz="4" w:color="D9D9D9"/>
+              <w:left w:val="single" w:sz="4" w:color="D9D9D9"/>
+              <w:bottom w:val="single" w:sz="4" w:color="D9D9D9"/>
+              <w:right w:val="single" w:sz="4" w:color="D9D9D9"/>
+            </w:tcBorders>
+          </w:tcPr>
+          <w:p>
+            <w:pPr>
+              <w:spacing w:after="40" w:before="0" w:line="240" w:lineRule="auto"/>
+            </w:pPr>
+            <w:hyperlink w:anchor="Launcher_KB15" w:history="1">
+              <w:r>
+                <w:rPr>
+                  <w:color w:val="FFFFFF"/>
+                  <w:shd w:fill="CC5500"/>
+                  <w:b/>
+                </w:rPr>
+                <w:t xml:space="preserve">  Launcher‑KB15  </w:t>
+              </w:r>
+            </w:hyperlink>
+          </w:p>
+        </w:tc>
+        <w:tc>
+          <w:tcPr>
+            <w:tcW w:type="dxa" w:w="7416"/>
+            <w:vAlign w:val="center"/>
+            <w:shd w:fill="F5F5F5"/>
+            <w:tcBorders>
+              <w:top w:val="single" w:sz="4" w:color="D9D9D9"/>
+              <w:left w:val="single" w:sz="4" w:color="D9D9D9"/>
+              <w:bottom w:val="single" w:sz="4" w:color="D9D9D9"/>
+              <w:right w:val="single" w:sz="4" w:color="D9D9D9"/>
+            </w:tcBorders>
+          </w:tcPr>
+          <w:p>
+            <w:pPr>
+              <w:spacing w:after="40" w:before="0" w:line="240" w:lineRule="auto"/>
+            </w:pPr>
+            <w:hyperlink w:anchor="Launcher_KB15" w:history="1">
+              <w:r>
+                <w:rPr>
+                  <w:color w:val="9B4300"/>
+                  <w:u w:val="single"/>
+                </w:rPr>
+                <w:t xml:space="preserve">Spotify playback and browser streaming</w:t>
+              </w:r>
+            </w:hyperlink>
+          </w:p>
+        </w:tc>
+      </w:tr>
+      <w:tr>
+        <w:tc>
+          <w:tcPr>
+            <w:tcW w:type="dxa" w:w="2376"/>
+            <w:vAlign w:val="center"/>
+            <w:shd w:fill="FFFFFF"/>
+            <w:tcBorders>
+              <w:top w:val="single" w:sz="4" w:color="D9D9D9"/>
+              <w:left w:val="single" w:sz="4" w:color="D9D9D9"/>
+              <w:bottom w:val="single" w:sz="4" w:color="D9D9D9"/>
+              <w:right w:val="single" w:sz="4" w:color="D9D9D9"/>
+            </w:tcBorders>
+          </w:tcPr>
+          <w:p>
+            <w:pPr>
+              <w:spacing w:after="40" w:before="0" w:line="240" w:lineRule="auto"/>
+            </w:pPr>
+            <w:hyperlink w:anchor="Launcher_KB16" w:history="1">
+              <w:r>
+                <w:rPr>
+                  <w:color w:val="FFFFFF"/>
+                  <w:shd w:fill="CC5500"/>
+                  <w:b/>
+                </w:rPr>
+                <w:t xml:space="preserve">  Launcher‑KB16  </w:t>
+              </w:r>
+            </w:hyperlink>
+          </w:p>
+        </w:tc>
+        <w:tc>
+          <w:tcPr>
+            <w:tcW w:type="dxa" w:w="7416"/>
+            <w:vAlign w:val="center"/>
+            <w:shd w:fill="FFFFFF"/>
+            <w:tcBorders>
+              <w:top w:val="single" w:sz="4" w:color="D9D9D9"/>
+              <w:left w:val="single" w:sz="4" w:color="D9D9D9"/>
+              <w:bottom w:val="single" w:sz="4" w:color="D9D9D9"/>
+              <w:right w:val="single" w:sz="4" w:color="D9D9D9"/>
+            </w:tcBorders>
+          </w:tcPr>
+          <w:p>
+            <w:pPr>
+              <w:spacing w:after="40" w:before="0" w:line="240" w:lineRule="auto"/>
+            </w:pPr>
+            <w:hyperlink w:anchor="Launcher_KB16" w:history="1">
+              <w:r>
+                <w:rPr>
+                  <w:color w:val="9B4300"/>
+                  <w:u w:val="single"/>
+                </w:rPr>
+                <w:t xml:space="preserve">Autofill profiles across TMA apps</w:t>
+              </w:r>
+            </w:hyperlink>
+          </w:p>
+        </w:tc>
+      </w:tr>
+      <w:tr>
+        <w:tc>
+          <w:tcPr>
+            <w:tcW w:type="dxa" w:w="2376"/>
+            <w:vAlign w:val="center"/>
+            <w:shd w:fill="F5F5F5"/>
+            <w:tcBorders>
+              <w:top w:val="single" w:sz="4" w:color="D9D9D9"/>
+              <w:left w:val="single" w:sz="4" w:color="D9D9D9"/>
+              <w:bottom w:val="single" w:sz="4" w:color="D9D9D9"/>
+              <w:right w:val="single" w:sz="4" w:color="D9D9D9"/>
+            </w:tcBorders>
+          </w:tcPr>
+          <w:p>
+            <w:pPr>
+              <w:spacing w:after="40" w:before="0" w:line="240" w:lineRule="auto"/>
+            </w:pPr>
+            <w:hyperlink w:anchor="Launcher_KB17" w:history="1">
+              <w:r>
+                <w:rPr>
+                  <w:color w:val="FFFFFF"/>
+                  <w:shd w:fill="CC5500"/>
+                  <w:b/>
+                </w:rPr>
+                <w:t xml:space="preserve">  Launcher‑KB17  </w:t>
+              </w:r>
+            </w:hyperlink>
+          </w:p>
+        </w:tc>
+        <w:tc>
+          <w:tcPr>
+            <w:tcW w:type="dxa" w:w="7416"/>
+            <w:vAlign w:val="center"/>
+            <w:shd w:fill="F5F5F5"/>
+            <w:tcBorders>
+              <w:top w:val="single" w:sz="4" w:color="D9D9D9"/>
+              <w:left w:val="single" w:sz="4" w:color="D9D9D9"/>
+              <w:bottom w:val="single" w:sz="4" w:color="D9D9D9"/>
+              <w:right w:val="single" w:sz="4" w:color="D9D9D9"/>
+            </w:tcBorders>
+          </w:tcPr>
+          <w:p>
+            <w:pPr>
+              <w:spacing w:after="40" w:before="0" w:line="240" w:lineRule="auto"/>
+            </w:pPr>
+            <w:hyperlink w:anchor="Launcher_KB17" w:history="1">
+              <w:r>
+                <w:rPr>
+                  <w:color w:val="9B4300"/>
+                  <w:u w:val="single"/>
+                </w:rPr>
+                <w:t xml:space="preserve">Check service status</w:t>
+              </w:r>
+            </w:hyperlink>
+          </w:p>
+        </w:tc>
+      </w:tr>
     </w:tbl>
-    <w:p>
-      <w:r>
-        <w:br w:type="page"/>
-      </w:r>
-    </w:p>
     <w:p>
       <w:bookmarkStart w:id="2" w:name="Launcher_KB1"/>
       <w:pPr>
         <w:pStyle w:val="Heading1"/>
+        <w:pageBreakBefore/>
       </w:pPr>
       <w:r>
         <w:t>Launcher KB1 Install the launcher</w:t>
@@ -938,14 +1195,10 @@
       </w:r>
     </w:p>
     <w:p>
-      <w:r>
-        <w:br w:type="page"/>
-      </w:r>
-    </w:p>
-    <w:p>
       <w:bookmarkStart w:id="3" w:name="Launcher_KB2"/>
       <w:pPr>
         <w:pStyle w:val="Heading1"/>
+        <w:pageBreakBefore/>
       </w:pPr>
       <w:r>
         <w:t>Launcher KB2 Install and update applications</w:t>
@@ -1038,7 +1291,7 @@
       <w:r>
         <w:drawing>
           <wp:inline xmlns:a="http://schemas.openxmlformats.org/drawingml/2006/main" xmlns:pic="http://schemas.openxmlformats.org/drawingml/2006/picture">
-            <wp:extent cx="5486400" cy="3310128"/>
+            <wp:extent cx="5486400" cy="3657600"/>
             <wp:docPr id="2" name="Picture 2"/>
             <wp:cNvGraphicFramePr>
               <a:graphicFrameLocks noChangeAspect="1"/>
@@ -1059,7 +1312,7 @@
                   <pic:spPr>
                     <a:xfrm>
                       <a:off x="0" y="0"/>
-                      <a:ext cx="5486400" cy="3310128"/>
+                      <a:ext cx="5486400" cy="3657600"/>
                     </a:xfrm>
                     <a:prstGeom prst="rect"/>
                   </pic:spPr>
@@ -1081,14 +1334,10 @@
       </w:r>
     </w:p>
     <w:p>
-      <w:r>
-        <w:br w:type="page"/>
-      </w:r>
-    </w:p>
-    <w:p>
       <w:bookmarkStart w:id="4" w:name="Launcher_KB3"/>
       <w:pPr>
         <w:pStyle w:val="Heading1"/>
+        <w:pageBreakBefore/>
       </w:pPr>
       <w:r>
         <w:t>Launcher KB3 Profile and social account suggestions</w:t>
@@ -1115,7 +1364,23 @@
         <w:keepNext/>
       </w:pPr>
       <w:r>
-        <w:t>The optional profile stores name, email addresses and social handles or public profile URLs locally. Sharing suggestions does not authenticate with providers. Enable each sharing choice only for the apps you want to use it.</w:t>
+        <w:t>Your optional profile stays on this device. Enter your name and one email address, then choose + Add email address for additional addresses, up to 20. Remove deletes a row; the first saved email is your primary suggestion.</w:t>
+      </w:r>
+    </w:p>
+    <w:p>
+      <w:pPr>
+        <w:keepNext/>
+      </w:pPr>
+      <w:r>
+        <w:t>Choose profile photo accepts a PNG or JPEG smaller than 4 MB, crops it to a square and stores a small local PNG when you save. Remove photo restores your initial. Cancel discards unsaved profile and photo edits.</w:t>
+      </w:r>
+    </w:p>
+    <w:p>
+      <w:pPr>
+        <w:keepNext/>
+      </w:pPr>
+      <w:r>
+        <w:t>Photos are not shared with providers or other apps. Optional social accounts hold usernames or public HTTPS profile URLs, never passwords or tokens. Shared profile suggestions do not sign in to provider accounts.</w:t>
       </w:r>
     </w:p>
     <w:p>
@@ -1123,7 +1388,7 @@
         <w:keepNext w:val="0"/>
       </w:pPr>
       <w:r>
-        <w:t xml:space="preserve">Provider passwords and API keys stay in each app. See </w:t>
+        <w:t xml:space="preserve">Control overall, Mail and future social sharing separately. See </w:t>
       </w:r>
       <w:hyperlink w:anchor="Launcher_KB4" w:history="1">
         <w:r>
@@ -1136,7 +1401,7 @@
         </w:r>
       </w:hyperlink>
       <w:r>
-        <w:t xml:space="preserve"> and </w:t>
+        <w:t xml:space="preserve">, </w:t>
       </w:r>
       <w:hyperlink w:anchor="Launcher_KB10" w:history="1">
         <w:r>
@@ -1146,6 +1411,19 @@
             <w:b/>
           </w:rPr>
           <w:t xml:space="preserve">  Launcher‑KB10  </w:t>
+        </w:r>
+      </w:hyperlink>
+      <w:r>
+        <w:t xml:space="preserve"> and </w:t>
+      </w:r>
+      <w:hyperlink w:anchor="Launcher_KB16" w:history="1">
+        <w:r>
+          <w:rPr>
+            <w:color w:val="FFFFFF"/>
+            <w:shd w:fill="CC5500"/>
+            <w:b/>
+          </w:rPr>
+          <w:t xml:space="preserve">  Launcher‑KB16  </w:t>
         </w:r>
       </w:hyperlink>
       <w:r>
@@ -1160,7 +1438,7 @@
       <w:r>
         <w:drawing>
           <wp:inline xmlns:a="http://schemas.openxmlformats.org/drawingml/2006/main" xmlns:pic="http://schemas.openxmlformats.org/drawingml/2006/picture">
-            <wp:extent cx="5029200" cy="4266438"/>
+            <wp:extent cx="4572000" cy="4495800"/>
             <wp:docPr id="3" name="Picture 3"/>
             <wp:cNvGraphicFramePr>
               <a:graphicFrameLocks noChangeAspect="1"/>
@@ -1181,7 +1459,7 @@
                   <pic:spPr>
                     <a:xfrm>
                       <a:off x="0" y="0"/>
-                      <a:ext cx="5029200" cy="4266438"/>
+                      <a:ext cx="4572000" cy="4495800"/>
                     </a:xfrm>
                     <a:prstGeom prst="rect"/>
                   </pic:spPr>
@@ -1206,6 +1484,7 @@
       <w:bookmarkStart w:id="5" w:name="Launcher_KB4"/>
       <w:pPr>
         <w:pStyle w:val="Heading1"/>
+        <w:pageBreakBefore w:val="0"/>
       </w:pPr>
       <w:r>
         <w:t>Launcher KB4 TMApps sign in and app access</w:t>
@@ -1270,14 +1549,10 @@
       </w:r>
     </w:p>
     <w:p>
-      <w:r>
-        <w:br w:type="page"/>
-      </w:r>
-    </w:p>
-    <w:p>
       <w:bookmarkStart w:id="6" w:name="Launcher_KB5"/>
       <w:pPr>
         <w:pStyle w:val="Heading1"/>
+        <w:pageBreakBefore w:val="0"/>
       </w:pPr>
       <w:r>
         <w:t>Launcher KB5 Choose your appearance</w:t>
@@ -1304,7 +1579,15 @@
         <w:keepNext/>
       </w:pPr>
       <w:r>
-        <w:t>Settings offers Orange, Grey and Black dark palettes. Navigation can sit on any edge. List view uses smaller app tiles; Grid view emphasises app cards.</w:t>
+        <w:t>In Settings, choose the Appearance tab. Pick Orange, Grey or Black, move navigation to Left, Right, Top or Bottom, choose List or Grid, and toggle Compact Navigation Bar. Save keeps changes; Cancel restores the previous appearance.</w:t>
+      </w:r>
+    </w:p>
+    <w:p>
+      <w:pPr>
+        <w:keepNext/>
+      </w:pPr>
+      <w:r>
+        <w:t>The title bar and scrollbars use the dark theme. Drag the title bar to move the window, double-click to maximize or restore, and use its window buttons to minimize or close. In list view, Details sits below the Open, Install or Update action.</w:t>
       </w:r>
     </w:p>
     <w:p>
@@ -1312,16 +1595,29 @@
         <w:keepNext w:val="0"/>
       </w:pPr>
       <w:r>
-        <w:t xml:space="preserve">Save keeps your changes and Cancel restores the previous appearance. See </w:t>
+        <w:t xml:space="preserve">Spotify playback modes and account opens the music settings. See </w:t>
       </w:r>
-      <w:hyperlink w:anchor="Launcher_KB11" w:history="1">
+      <w:hyperlink w:anchor="Launcher_KB9" w:history="1">
         <w:r>
           <w:rPr>
             <w:color w:val="FFFFFF"/>
             <w:shd w:fill="CC5500"/>
             <w:b/>
           </w:rPr>
-          <w:t xml:space="preserve">  Launcher‑KB11  </w:t>
+          <w:t xml:space="preserve">  Launcher‑KB9  </w:t>
+        </w:r>
+      </w:hyperlink>
+      <w:r>
+        <w:t xml:space="preserve"> and </w:t>
+      </w:r>
+      <w:hyperlink w:anchor="Launcher_KB15" w:history="1">
+        <w:r>
+          <w:rPr>
+            <w:color w:val="FFFFFF"/>
+            <w:shd w:fill="CC5500"/>
+            <w:b/>
+          </w:rPr>
+          <w:t xml:space="preserve">  Launcher‑KB15  </w:t>
         </w:r>
       </w:hyperlink>
       <w:r>
@@ -1336,7 +1632,7 @@
       <w:r>
         <w:drawing>
           <wp:inline xmlns:a="http://schemas.openxmlformats.org/drawingml/2006/main" xmlns:pic="http://schemas.openxmlformats.org/drawingml/2006/picture">
-            <wp:extent cx="5303520" cy="3915766"/>
+            <wp:extent cx="5303520" cy="4112554"/>
             <wp:docPr id="4" name="Picture 4"/>
             <wp:cNvGraphicFramePr>
               <a:graphicFrameLocks noChangeAspect="1"/>
@@ -1357,7 +1653,7 @@
                   <pic:spPr>
                     <a:xfrm>
                       <a:off x="0" y="0"/>
-                      <a:ext cx="5303520" cy="3915766"/>
+                      <a:ext cx="5303520" cy="4112554"/>
                     </a:xfrm>
                     <a:prstGeom prst="rect"/>
                   </pic:spPr>
@@ -1379,14 +1675,10 @@
       </w:r>
     </w:p>
     <w:p>
-      <w:r>
-        <w:br w:type="page"/>
-      </w:r>
-    </w:p>
-    <w:p>
       <w:bookmarkStart w:id="7" w:name="Launcher_KB6"/>
       <w:pPr>
         <w:pStyle w:val="Heading1"/>
+        <w:pageBreakBefore/>
       </w:pPr>
       <w:r>
         <w:t>Launcher KB6 Reduce resource usage</w:t>
@@ -1426,7 +1718,7 @@
     </w:p>
     <w:p>
       <w:pPr>
-        <w:keepNext w:val="0"/>
+        <w:keepNext/>
       </w:pPr>
       <w:r>
         <w:t xml:space="preserve">Functional and resource checks run in the release workflow. See </w:t>
@@ -1452,6 +1744,27 @@
             <w:b/>
           </w:rPr>
           <w:t xml:space="preserve">  Launcher‑KB9  </w:t>
+        </w:r>
+      </w:hyperlink>
+      <w:r>
+        <w:t>. Optional Spotify controls refresh every 15 seconds only while their music window is open and visible.</w:t>
+      </w:r>
+    </w:p>
+    <w:p>
+      <w:pPr>
+        <w:keepNext w:val="0"/>
+      </w:pPr>
+      <w:r>
+        <w:t xml:space="preserve">Closing it stops refresh work. Browser streaming uses the browser's CPU, RAM and network; Connect playback uses the selected Spotify device. See </w:t>
+      </w:r>
+      <w:hyperlink w:anchor="Launcher_KB15" w:history="1">
+        <w:r>
+          <w:rPr>
+            <w:color w:val="FFFFFF"/>
+            <w:shd w:fill="CC5500"/>
+            <w:b/>
+          </w:rPr>
+          <w:t xml:space="preserve">  Launcher‑KB15  </w:t>
         </w:r>
       </w:hyperlink>
       <w:r>
@@ -1512,6 +1825,7 @@
       <w:bookmarkStart w:id="8" w:name="Launcher_KB7"/>
       <w:pPr>
         <w:pStyle w:val="Heading1"/>
+        <w:pageBreakBefore w:val="0"/>
       </w:pPr>
       <w:r>
         <w:t>Launcher KB7 Review and submit a crash report</w:t>
@@ -1584,14 +1898,10 @@
       </w:r>
     </w:p>
     <w:p>
-      <w:r>
-        <w:br w:type="page"/>
-      </w:r>
-    </w:p>
-    <w:p>
       <w:bookmarkStart w:id="9" w:name="Launcher_KB8"/>
       <w:pPr>
         <w:pStyle w:val="Heading1"/>
+        <w:pageBreakBefore/>
       </w:pPr>
       <w:r>
         <w:t>Launcher KB8 Get help and request changes</w:t>
@@ -1693,14 +2003,10 @@
       </w:r>
     </w:p>
     <w:p>
-      <w:r>
-        <w:br w:type="page"/>
-      </w:r>
-    </w:p>
-    <w:p>
       <w:bookmarkStart w:id="10" w:name="Launcher_KB9"/>
       <w:pPr>
         <w:pStyle w:val="Heading1"/>
+        <w:pageBreakBefore/>
       </w:pPr>
       <w:r>
         <w:t>Launcher KB9 App details and galleries</w:t>
@@ -1727,7 +2033,23 @@
         <w:keepNext/>
       </w:pPr>
       <w:r>
-        <w:t>Click an app name or Details to see its catalog version, update date, description and published release notes. Each app can publish one showcase video and up to ten screenshots. Missing media is labelled unpublished.</w:t>
+        <w:t>Click an app name or Details to open its showcase. The header shows the app icon, description, version and update date. Open, Install or Update is available when the app supports your operating system; GitHub opens its source branch.</w:t>
+      </w:r>
+    </w:p>
+    <w:p>
+      <w:pPr>
+        <w:keepNext/>
+      </w:pPr>
+      <w:r>
+        <w:t>Published screenshots appear in a gallery with Previous, Next and thumbnail buttons, up to ten per app. A showcase video appears only when published and plays only when requested. Missing media stays unpublished.</w:t>
+      </w:r>
+    </w:p>
+    <w:p>
+      <w:pPr>
+        <w:keepNext/>
+      </w:pPr>
+      <w:r>
+        <w:t>Feature cards and Latest release show available app information; preview limitations remain in the release notes. Close the screen to release media resources. In List view Details is below the main app action.</w:t>
       </w:r>
     </w:p>
     <w:p>
@@ -1735,7 +2057,20 @@
         <w:keepNext w:val="0"/>
       </w:pPr>
       <w:r>
-        <w:t xml:space="preserve">Media is loaded only when details are opened; videos never play automatically. See </w:t>
+        <w:t xml:space="preserve">See </w:t>
+      </w:r>
+      <w:hyperlink w:anchor="Launcher_KB2" w:history="1">
+        <w:r>
+          <w:rPr>
+            <w:color w:val="FFFFFF"/>
+            <w:shd w:fill="CC5500"/>
+            <w:b/>
+          </w:rPr>
+          <w:t xml:space="preserve">  Launcher‑KB2  </w:t>
+        </w:r>
+      </w:hyperlink>
+      <w:r>
+        <w:t xml:space="preserve"> and </w:t>
       </w:r>
       <w:hyperlink w:anchor="Launcher_KB6" w:history="1">
         <w:r>
@@ -1759,7 +2094,7 @@
       <w:r>
         <w:drawing>
           <wp:inline xmlns:a="http://schemas.openxmlformats.org/drawingml/2006/main" xmlns:pic="http://schemas.openxmlformats.org/drawingml/2006/picture">
-            <wp:extent cx="4937760" cy="4672355"/>
+            <wp:extent cx="6035040" cy="4396958"/>
             <wp:docPr id="7" name="Picture 7"/>
             <wp:cNvGraphicFramePr>
               <a:graphicFrameLocks noChangeAspect="1"/>
@@ -1780,7 +2115,7 @@
                   <pic:spPr>
                     <a:xfrm>
                       <a:off x="0" y="0"/>
-                      <a:ext cx="4937760" cy="4672355"/>
+                      <a:ext cx="6035040" cy="4396958"/>
                     </a:xfrm>
                     <a:prstGeom prst="rect"/>
                   </pic:spPr>
@@ -1802,14 +2137,10 @@
       </w:r>
     </w:p>
     <w:p>
-      <w:r>
-        <w:br w:type="page"/>
-      </w:r>
-    </w:p>
-    <w:p>
       <w:bookmarkStart w:id="11" w:name="Launcher_KB10"/>
       <w:pPr>
         <w:pStyle w:val="Heading1"/>
+        <w:pageBreakBefore/>
       </w:pPr>
       <w:r>
         <w:t>Launcher KB10 Privacy and local data</w:t>
@@ -1924,14 +2255,10 @@
       </w:r>
     </w:p>
     <w:p>
-      <w:r>
-        <w:br w:type="page"/>
-      </w:r>
-    </w:p>
-    <w:p>
       <w:bookmarkStart w:id="12" w:name="Launcher_KB11"/>
       <w:pPr>
         <w:pStyle w:val="Heading1"/>
+        <w:pageBreakBefore/>
       </w:pPr>
       <w:r>
         <w:t>Launcher KB11 Search settings and knowledge articles</w:t>
@@ -1958,15 +2285,15 @@
         <w:keepNext/>
       </w:pPr>
       <w:r>
-        <w:t>Type keywords in Settings search to find relevant controls. Knowledge articles are included by default. Turn off Include KB articles in settings search to limit results to controls; Help still provides the complete KB Library.</w:t>
+        <w:t>Settings groups options into Appearance, Startup and performance, Help and KB Library, and Downloads and storage on Windows. Choose a section button to focus its controls. Search settings searches all sections by keyword.</w:t>
       </w:r>
     </w:p>
     <w:p>
       <w:pPr>
-        <w:keepNext w:val="0"/>
+        <w:keepNext/>
       </w:pPr>
       <w:r>
-        <w:t xml:space="preserve">Search supports KB numbers such as </w:t>
+        <w:t xml:space="preserve">Help has a dedicated Search KB Library field on Windows; Open KB Library and support opens the searchable library on macOS and Linux. Include KB articles in settings search can be disabled without removing Help. Enter a stable reference such as </w:t>
       </w:r>
       <w:hyperlink w:anchor="Launcher_KB6" w:history="1">
         <w:r>
@@ -1979,7 +2306,15 @@
         </w:r>
       </w:hyperlink>
       <w:r>
-        <w:t xml:space="preserve">. See </w:t>
+        <w:t xml:space="preserve"> to find the matching guide.</w:t>
+      </w:r>
+    </w:p>
+    <w:p>
+      <w:pPr>
+        <w:keepNext w:val="0"/>
+      </w:pPr>
+      <w:r>
+        <w:t xml:space="preserve">See </w:t>
       </w:r>
       <w:hyperlink w:anchor="Launcher_KB5" w:history="1">
         <w:r>
@@ -1989,6 +2324,32 @@
             <w:b/>
           </w:rPr>
           <w:t xml:space="preserve">  Launcher‑KB5  </w:t>
+        </w:r>
+      </w:hyperlink>
+      <w:r>
+        <w:t xml:space="preserve">, </w:t>
+      </w:r>
+      <w:hyperlink w:anchor="Launcher_KB6" w:history="1">
+        <w:r>
+          <w:rPr>
+            <w:color w:val="FFFFFF"/>
+            <w:shd w:fill="CC5500"/>
+            <w:b/>
+          </w:rPr>
+          <w:t xml:space="preserve">  Launcher‑KB6  </w:t>
+        </w:r>
+      </w:hyperlink>
+      <w:r>
+        <w:t xml:space="preserve"> and </w:t>
+      </w:r>
+      <w:hyperlink w:anchor="Launcher_KB8" w:history="1">
+        <w:r>
+          <w:rPr>
+            <w:color w:val="FFFFFF"/>
+            <w:shd w:fill="CC5500"/>
+            <w:b/>
+          </w:rPr>
+          <w:t xml:space="preserve">  Launcher‑KB8  </w:t>
         </w:r>
       </w:hyperlink>
       <w:r>
@@ -2003,7 +2364,7 @@
       <w:r>
         <w:drawing>
           <wp:inline xmlns:a="http://schemas.openxmlformats.org/drawingml/2006/main" xmlns:pic="http://schemas.openxmlformats.org/drawingml/2006/picture">
-            <wp:extent cx="5303520" cy="3632911"/>
+            <wp:extent cx="5303520" cy="4525670"/>
             <wp:docPr id="9" name="Picture 9"/>
             <wp:cNvGraphicFramePr>
               <a:graphicFrameLocks noChangeAspect="1"/>
@@ -2024,7 +2385,7 @@
                   <pic:spPr>
                     <a:xfrm>
                       <a:off x="0" y="0"/>
-                      <a:ext cx="5303520" cy="3632911"/>
+                      <a:ext cx="5303520" cy="4525670"/>
                     </a:xfrm>
                     <a:prstGeom prst="rect"/>
                   </pic:spPr>
@@ -2049,6 +2410,7 @@
       <w:bookmarkStart w:id="13" w:name="Launcher_KB12"/>
       <w:pPr>
         <w:pStyle w:val="Heading1"/>
+        <w:pageBreakBefore w:val="0"/>
       </w:pPr>
       <w:r>
         <w:t>Launcher KB12 Troubleshoot platform compatibility</w:t>
@@ -2113,14 +2475,10 @@
       </w:r>
     </w:p>
     <w:p>
-      <w:r>
-        <w:br w:type="page"/>
-      </w:r>
-    </w:p>
-    <w:p>
       <w:bookmarkStart w:id="14" w:name="Launcher_KB13"/>
       <w:pPr>
         <w:pStyle w:val="Heading1"/>
+        <w:pageBreakBefore w:val="0"/>
       </w:pPr>
       <w:r>
         <w:t>Launcher KB13 Coming soon applications</w:t>
@@ -2193,14 +2551,10 @@
       </w:r>
     </w:p>
     <w:p>
-      <w:r>
-        <w:br w:type="page"/>
-      </w:r>
-    </w:p>
-    <w:p>
       <w:bookmarkStart w:id="15" w:name="Launcher_KB14"/>
       <w:pPr>
         <w:pStyle w:val="Heading1"/>
+        <w:pageBreakBefore/>
       </w:pPr>
       <w:r>
         <w:t>Launcher KB14 Install Libraries and Finance</w:t>
@@ -2348,11 +2702,447 @@
         <w:spacing w:after="240"/>
       </w:pPr>
       <w:r>
-        <w:t>Libraries 0.2.0-dev.1 Windows preview home screen after isolated packaged-app checks.</w:t>
+        <w:t>Libraries 0.2.0 development preview after verified launcher installation.</w:t>
+      </w:r>
+    </w:p>
+    <w:p>
+      <w:bookmarkStart w:id="16" w:name="Launcher_KB15"/>
+      <w:pPr>
+        <w:pStyle w:val="Heading1"/>
+        <w:pageBreakBefore/>
+      </w:pPr>
+      <w:r>
+        <w:t>Launcher KB15 Spotify playback and browser streaming</w:t>
+      </w:r>
+      <w:bookmarkEnd w:id="16"/>
+    </w:p>
+    <w:p>
+      <w:pPr>
+        <w:keepNext/>
+      </w:pPr>
+      <w:hyperlink w:anchor="KB_Index" w:history="1">
+        <w:r>
+          <w:rPr>
+            <w:color w:val="FFFFFF"/>
+            <w:shd w:fill="CC5500"/>
+            <w:b/>
+          </w:rPr>
+          <w:t xml:space="preserve">  Back to index  </w:t>
+        </w:r>
+      </w:hyperlink>
+    </w:p>
+    <w:p>
+      <w:pPr>
+        <w:keepNext/>
+      </w:pPr>
+      <w:r>
+        <w:t>Open Spotify in navigation, or Spotify playback modes and account in Settings. Connect Spotify signs in through your browser using PKCE. Choose Spotify app / Connect device or Browser streaming with in-app controls.</w:t>
+      </w:r>
+    </w:p>
+    <w:p>
+      <w:pPr>
+        <w:keepNext/>
+      </w:pPr>
+      <w:r>
+        <w:t>In browser mode, open the web player, sign in there and start a track. Audio streams in the browser; TMA controls the active Spotify device. Premium and developer-app user access are required.</w:t>
+      </w:r>
+    </w:p>
+    <w:p>
+      <w:pPr>
+        <w:keepNext/>
+      </w:pPr>
+      <w:r>
+        <w:t>Each app authorizes separately. Finish one sign-in before starting another. The registered callback is http://127.0.0.1:43823/spotify/callback.</w:t>
+      </w:r>
+    </w:p>
+    <w:p>
+      <w:pPr>
+        <w:keepNext/>
+      </w:pPr>
+      <w:r>
+        <w:t>Authorization stays encrypted locally; without a secure Linux keyring it stays in memory. Closing the music window stops its 15-second refresh. Disconnect removes local authorization; revoke provider access in Spotify if needed.</w:t>
+      </w:r>
+    </w:p>
+    <w:p>
+      <w:pPr>
+        <w:keepNext w:val="0"/>
+      </w:pPr>
+      <w:r>
+        <w:t xml:space="preserve">A busy port, denied access, inactive device or rate limit has an actionable message. See </w:t>
+      </w:r>
+      <w:hyperlink w:anchor="Launcher_KB6" w:history="1">
+        <w:r>
+          <w:rPr>
+            <w:color w:val="FFFFFF"/>
+            <w:shd w:fill="CC5500"/>
+            <w:b/>
+          </w:rPr>
+          <w:t xml:space="preserve">  Launcher‑KB6  </w:t>
+        </w:r>
+      </w:hyperlink>
+      <w:r>
+        <w:t xml:space="preserve"> and </w:t>
+      </w:r>
+      <w:hyperlink w:anchor="Launcher_KB10" w:history="1">
+        <w:r>
+          <w:rPr>
+            <w:color w:val="FFFFFF"/>
+            <w:shd w:fill="CC5500"/>
+            <w:b/>
+          </w:rPr>
+          <w:t xml:space="preserve">  Launcher‑KB10  </w:t>
+        </w:r>
+      </w:hyperlink>
+      <w:r>
+        <w:t>. Companion-app Spotify changes are uploaded as source for their next releases; existing companion downloads are unchanged.</w:t>
+      </w:r>
+    </w:p>
+    <w:p>
+      <w:pPr>
+        <w:keepNext/>
+        <w:jc w:val="center"/>
+      </w:pPr>
+      <w:r>
+        <w:drawing>
+          <wp:inline xmlns:a="http://schemas.openxmlformats.org/drawingml/2006/main" xmlns:pic="http://schemas.openxmlformats.org/drawingml/2006/picture">
+            <wp:extent cx="5303520" cy="2935877"/>
+            <wp:docPr id="11" name="Picture 11"/>
+            <wp:cNvGraphicFramePr>
+              <a:graphicFrameLocks noChangeAspect="1"/>
+            </wp:cNvGraphicFramePr>
+            <a:graphic>
+              <a:graphicData uri="http://schemas.openxmlformats.org/drawingml/2006/picture">
+                <pic:pic>
+                  <pic:nvPicPr>
+                    <pic:cNvPr id="0" name="image.png"/>
+                    <pic:cNvPicPr/>
+                  </pic:nvPicPr>
+                  <pic:blipFill>
+                    <a:blip r:embed="rId19"/>
+                    <a:stretch>
+                      <a:fillRect/>
+                    </a:stretch>
+                  </pic:blipFill>
+                  <pic:spPr>
+                    <a:xfrm>
+                      <a:off x="0" y="0"/>
+                      <a:ext cx="5303520" cy="2935877"/>
+                    </a:xfrm>
+                    <a:prstGeom prst="rect"/>
+                  </pic:spPr>
+                </pic:pic>
+              </a:graphicData>
+            </a:graphic>
+          </wp:inline>
+        </w:drawing>
+      </w:r>
+    </w:p>
+    <w:p>
+      <w:pPr>
+        <w:pStyle w:val="Caption"/>
+        <w:keepNext w:val="0"/>
+        <w:spacing w:after="240"/>
+      </w:pPr>
+      <w:r>
+        <w:t>Spotify offers Connect controls and browser streaming with in-app controls. Sign-in is optional.</w:t>
+      </w:r>
+    </w:p>
+    <w:p>
+      <w:bookmarkStart w:id="17" w:name="Launcher_KB16"/>
+      <w:pPr>
+        <w:pStyle w:val="Heading1"/>
+        <w:pageBreakBefore/>
+      </w:pPr>
+      <w:r>
+        <w:t>Launcher KB16 Autofill profiles across TMA apps</w:t>
+      </w:r>
+      <w:bookmarkEnd w:id="17"/>
+    </w:p>
+    <w:p>
+      <w:pPr>
+        <w:keepNext/>
+      </w:pPr>
+      <w:hyperlink w:anchor="KB_Index" w:history="1">
+        <w:r>
+          <w:rPr>
+            <w:color w:val="FFFFFF"/>
+            <w:shd w:fill="CC5500"/>
+            <w:b/>
+          </w:rPr>
+          <w:t xml:space="preserve">  Back to index  </w:t>
+        </w:r>
+      </w:hyperlink>
+    </w:p>
+    <w:p>
+      <w:pPr>
+        <w:keepNext/>
+      </w:pPr>
+      <w:r>
+        <w:t>Save your optional name and email addresses through the top-right profile icon. Autofill compatible TMA app profiles on this device enables shared suggestions; Mail and social metadata keep their additional sharing controls. Compatible apps read suggestions when opened or focused.</w:t>
+      </w:r>
+    </w:p>
+    <w:p>
+      <w:pPr>
+        <w:keepNext/>
+      </w:pPr>
+      <w:r>
+        <w:t>Empty fields and previously imported values update automatically; app-specific edits and connected account identities are preserved. Office and Finance source updates add editable profile icons; their public downloads gain this with their next releases. Mail already supports launcher name/email suggestions on Windows.</w:t>
+      </w:r>
+    </w:p>
+    <w:p>
+      <w:pPr>
+        <w:keepNext/>
+      </w:pPr>
+      <w:r>
+        <w:t>Profile sharing is local to the current OS user, not cloud sync or provider authentication. Disabling sharing stops future imports and keeps existing local app values. Credentials and app-specific keys are still entered in each provider app.</w:t>
+      </w:r>
+    </w:p>
+    <w:p>
+      <w:pPr>
+        <w:keepNext w:val="0"/>
+      </w:pPr>
+      <w:r>
+        <w:t xml:space="preserve">See </w:t>
+      </w:r>
+      <w:hyperlink w:anchor="Launcher_KB3" w:history="1">
+        <w:r>
+          <w:rPr>
+            <w:color w:val="FFFFFF"/>
+            <w:shd w:fill="CC5500"/>
+            <w:b/>
+          </w:rPr>
+          <w:t xml:space="preserve">  Launcher‑KB3  </w:t>
+        </w:r>
+      </w:hyperlink>
+      <w:r>
+        <w:t xml:space="preserve">, </w:t>
+      </w:r>
+      <w:hyperlink w:anchor="Launcher_KB4" w:history="1">
+        <w:r>
+          <w:rPr>
+            <w:color w:val="FFFFFF"/>
+            <w:shd w:fill="CC5500"/>
+            <w:b/>
+          </w:rPr>
+          <w:t xml:space="preserve">  Launcher‑KB4  </w:t>
+        </w:r>
+      </w:hyperlink>
+      <w:r>
+        <w:t xml:space="preserve"> and </w:t>
+      </w:r>
+      <w:hyperlink w:anchor="Launcher_KB10" w:history="1">
+        <w:r>
+          <w:rPr>
+            <w:color w:val="FFFFFF"/>
+            <w:shd w:fill="CC5500"/>
+            <w:b/>
+          </w:rPr>
+          <w:t xml:space="preserve">  Launcher‑KB10  </w:t>
+        </w:r>
+      </w:hyperlink>
+      <w:r>
+        <w:t>. Earlier released Mail versions continue their existing display-name sync behavior until the companion update; connected email identities stay protected.</w:t>
+      </w:r>
+    </w:p>
+    <w:p>
+      <w:pPr>
+        <w:keepNext/>
+        <w:jc w:val="center"/>
+      </w:pPr>
+      <w:r>
+        <w:drawing>
+          <wp:inline xmlns:a="http://schemas.openxmlformats.org/drawingml/2006/main" xmlns:pic="http://schemas.openxmlformats.org/drawingml/2006/picture">
+            <wp:extent cx="4572000" cy="3733800"/>
+            <wp:docPr id="12" name="Picture 12"/>
+            <wp:cNvGraphicFramePr>
+              <a:graphicFrameLocks noChangeAspect="1"/>
+            </wp:cNvGraphicFramePr>
+            <a:graphic>
+              <a:graphicData uri="http://schemas.openxmlformats.org/drawingml/2006/picture">
+                <pic:pic>
+                  <pic:nvPicPr>
+                    <pic:cNvPr id="0" name="image.png"/>
+                    <pic:cNvPicPr/>
+                  </pic:nvPicPr>
+                  <pic:blipFill>
+                    <a:blip r:embed="rId20"/>
+                    <a:stretch>
+                      <a:fillRect/>
+                    </a:stretch>
+                  </pic:blipFill>
+                  <pic:spPr>
+                    <a:xfrm>
+                      <a:off x="0" y="0"/>
+                      <a:ext cx="4572000" cy="3733800"/>
+                    </a:xfrm>
+                    <a:prstGeom prst="rect"/>
+                  </pic:spPr>
+                </pic:pic>
+              </a:graphicData>
+            </a:graphic>
+          </wp:inline>
+        </w:drawing>
+      </w:r>
+    </w:p>
+    <w:p>
+      <w:pPr>
+        <w:pStyle w:val="Caption"/>
+        <w:keepNext w:val="0"/>
+        <w:spacing w:after="240"/>
+      </w:pPr>
+      <w:r>
+        <w:t>The launcher profile enables local autofill for compatible TMA app profile icons.</w:t>
+      </w:r>
+    </w:p>
+    <w:p>
+      <w:bookmarkStart w:id="18" w:name="Launcher_KB17"/>
+      <w:pPr>
+        <w:pStyle w:val="Heading1"/>
+        <w:pageBreakBefore/>
+      </w:pPr>
+      <w:r>
+        <w:t>Launcher KB17 Check service status</w:t>
+      </w:r>
+      <w:bookmarkEnd w:id="18"/>
+    </w:p>
+    <w:p>
+      <w:pPr>
+        <w:keepNext/>
+      </w:pPr>
+      <w:hyperlink w:anchor="KB_Index" w:history="1">
+        <w:r>
+          <w:rPr>
+            <w:color w:val="FFFFFF"/>
+            <w:shd w:fill="CC5500"/>
+            <w:b/>
+          </w:rPr>
+          <w:t xml:space="preserve">  Back to index  </w:t>
+        </w:r>
+      </w:hyperlink>
+    </w:p>
+    <w:p>
+      <w:pPr>
+        <w:keepNext/>
+      </w:pPr>
+      <w:r>
+        <w:t>Open Service Status and choose Check APIs now. API Checkers group the suite public service checks by app. Gray means not checked.</w:t>
+      </w:r>
+    </w:p>
+    <w:p>
+      <w:pPr>
+        <w:keepNext/>
+      </w:pPr>
+      <w:r>
+        <w:t>Glowing green means the public endpoint responded; glowing red means unavailable from this device or rate-limited. Checks send no account credentials and do not run in the background. Green is not proof that an account is signed in, a subscription is active or permissions are granted.</w:t>
+      </w:r>
+    </w:p>
+    <w:p>
+      <w:pPr>
+        <w:keepNext/>
+      </w:pPr>
+      <w:r>
+        <w:t>Microsoft and Google sign-in discovery and GitHub and Spotify endpoint reachability are covered; additional app-specific providers and IMAP/SMTP account tests remain inside their apps. Companion Spotify integration reaches downloads in their own releases. Retry after checking your connection if a service is red.</w:t>
+      </w:r>
+    </w:p>
+    <w:p>
+      <w:pPr>
+        <w:keepNext w:val="0"/>
+      </w:pPr>
+      <w:r>
+        <w:t xml:space="preserve">See </w:t>
+      </w:r>
+      <w:hyperlink w:anchor="Launcher_KB7" w:history="1">
+        <w:r>
+          <w:rPr>
+            <w:color w:val="FFFFFF"/>
+            <w:shd w:fill="CC5500"/>
+            <w:b/>
+          </w:rPr>
+          <w:t xml:space="preserve">  Launcher‑KB7  </w:t>
+        </w:r>
+      </w:hyperlink>
+      <w:r>
+        <w:t xml:space="preserve">, </w:t>
+      </w:r>
+      <w:hyperlink w:anchor="Launcher_KB8" w:history="1">
+        <w:r>
+          <w:rPr>
+            <w:color w:val="FFFFFF"/>
+            <w:shd w:fill="CC5500"/>
+            <w:b/>
+          </w:rPr>
+          <w:t xml:space="preserve">  Launcher‑KB8  </w:t>
+        </w:r>
+      </w:hyperlink>
+      <w:r>
+        <w:t xml:space="preserve"> and </w:t>
+      </w:r>
+      <w:hyperlink w:anchor="Launcher_KB15" w:history="1">
+        <w:r>
+          <w:rPr>
+            <w:color w:val="FFFFFF"/>
+            <w:shd w:fill="CC5500"/>
+            <w:b/>
+          </w:rPr>
+          <w:t xml:space="preserve">  Launcher‑KB15  </w:t>
+        </w:r>
+      </w:hyperlink>
+      <w:r>
+        <w:t>.</w:t>
+      </w:r>
+    </w:p>
+    <w:p>
+      <w:pPr>
+        <w:keepNext/>
+        <w:jc w:val="center"/>
+      </w:pPr>
+      <w:r>
+        <w:drawing>
+          <wp:inline xmlns:a="http://schemas.openxmlformats.org/drawingml/2006/main" xmlns:pic="http://schemas.openxmlformats.org/drawingml/2006/picture">
+            <wp:extent cx="4572000" cy="3733800"/>
+            <wp:docPr id="13" name="Picture 13"/>
+            <wp:cNvGraphicFramePr>
+              <a:graphicFrameLocks noChangeAspect="1"/>
+            </wp:cNvGraphicFramePr>
+            <a:graphic>
+              <a:graphicData uri="http://schemas.openxmlformats.org/drawingml/2006/picture">
+                <pic:pic>
+                  <pic:nvPicPr>
+                    <pic:cNvPr id="0" name="image.png"/>
+                    <pic:cNvPicPr/>
+                  </pic:nvPicPr>
+                  <pic:blipFill>
+                    <a:blip r:embed="rId21"/>
+                    <a:stretch>
+                      <a:fillRect/>
+                    </a:stretch>
+                  </pic:blipFill>
+                  <pic:spPr>
+                    <a:xfrm>
+                      <a:off x="0" y="0"/>
+                      <a:ext cx="4572000" cy="3733800"/>
+                    </a:xfrm>
+                    <a:prstGeom prst="rect"/>
+                  </pic:spPr>
+                </pic:pic>
+              </a:graphicData>
+            </a:graphic>
+          </wp:inline>
+        </w:drawing>
+      </w:r>
+    </w:p>
+    <w:p>
+      <w:pPr>
+        <w:pStyle w:val="Caption"/>
+        <w:keepNext w:val="0"/>
+        <w:spacing w:after="240"/>
+      </w:pPr>
+      <w:r>
+        <w:t>Service Status checks public service reachability only when requested.</w:t>
       </w:r>
     </w:p>
     <w:sectPr>
-      <w:footerReference w:type="default" r:id="rId19"/>
+      <w:footerReference w:type="default" r:id="rId22"/>
       <w:pgSz w:w="12240" w:h="15840"/>
       <w:pgMar w:top="1152" w:right="1224" w:bottom="1152" w:left="1224" w:header="720" w:footer="720" w:gutter="0"/>
       <w:cols w:space="720"/>

</xml_diff>

<commit_message>
Align launcher settings and branded KB with current suite standards
</commit_message>
<xml_diff>
--- a/docs/KB Library.docx
+++ b/docs/KB Library.docx
@@ -26,6 +26,11 @@
     <w:p>
       <w:r>
         <w:t>Use this library to install the launcher, manage your applications, find settings, and report problems. Each article has a stable KB number that you can type into launcher Help or settings search. Shared TMApps sign-in is prepared for deployment and requires backend configuration before activation. App support varies by operating system.</w:t>
+      </w:r>
+    </w:p>
+    <w:p>
+      <w:r>
+        <w:t>The TMApps Master KB link is pending publication on the main branch when this guide is prepared. This app library remains available offline. Provider sign-in, app downloads, API checks and support links require an internet connection.</w:t>
       </w:r>
     </w:p>
     <w:p>
@@ -1165,7 +1170,7 @@
                     <pic:cNvPicPr/>
                   </pic:nvPicPr>
                   <pic:blipFill>
-                    <a:blip r:embed="rId9"/>
+                    <a:blip r:embed="rId10"/>
                     <a:stretch>
                       <a:fillRect/>
                     </a:stretch>
@@ -1304,7 +1309,7 @@
                     <pic:cNvPicPr/>
                   </pic:nvPicPr>
                   <pic:blipFill>
-                    <a:blip r:embed="rId10"/>
+                    <a:blip r:embed="rId11"/>
                     <a:stretch>
                       <a:fillRect/>
                     </a:stretch>
@@ -1451,7 +1456,7 @@
                     <pic:cNvPicPr/>
                   </pic:nvPicPr>
                   <pic:blipFill>
-                    <a:blip r:embed="rId11"/>
+                    <a:blip r:embed="rId12"/>
                     <a:stretch>
                       <a:fillRect/>
                     </a:stretch>
@@ -1645,7 +1650,7 @@
                     <pic:cNvPicPr/>
                   </pic:nvPicPr>
                   <pic:blipFill>
-                    <a:blip r:embed="rId12"/>
+                    <a:blip r:embed="rId13"/>
                     <a:stretch>
                       <a:fillRect/>
                     </a:stretch>
@@ -1792,7 +1797,7 @@
                     <pic:cNvPicPr/>
                   </pic:nvPicPr>
                   <pic:blipFill>
-                    <a:blip r:embed="rId13"/>
+                    <a:blip r:embed="rId14"/>
                     <a:stretch>
                       <a:fillRect/>
                     </a:stretch>
@@ -1973,7 +1978,7 @@
                     <pic:cNvPicPr/>
                   </pic:nvPicPr>
                   <pic:blipFill>
-                    <a:blip r:embed="rId14"/>
+                    <a:blip r:embed="rId15"/>
                     <a:stretch>
                       <a:fillRect/>
                     </a:stretch>
@@ -2107,7 +2112,7 @@
                     <pic:cNvPicPr/>
                   </pic:nvPicPr>
                   <pic:blipFill>
-                    <a:blip r:embed="rId15"/>
+                    <a:blip r:embed="rId16"/>
                     <a:stretch>
                       <a:fillRect/>
                     </a:stretch>
@@ -2225,7 +2230,7 @@
                     <pic:cNvPicPr/>
                   </pic:nvPicPr>
                   <pic:blipFill>
-                    <a:blip r:embed="rId16"/>
+                    <a:blip r:embed="rId17"/>
                     <a:stretch>
                       <a:fillRect/>
                     </a:stretch>
@@ -2364,7 +2369,7 @@
       <w:r>
         <w:drawing>
           <wp:inline xmlns:a="http://schemas.openxmlformats.org/drawingml/2006/main" xmlns:pic="http://schemas.openxmlformats.org/drawingml/2006/picture">
-            <wp:extent cx="5303520" cy="4525670"/>
+            <wp:extent cx="5303520" cy="4967630"/>
             <wp:docPr id="9" name="Picture 9"/>
             <wp:cNvGraphicFramePr>
               <a:graphicFrameLocks noChangeAspect="1"/>
@@ -2377,7 +2382,7 @@
                     <pic:cNvPicPr/>
                   </pic:nvPicPr>
                   <pic:blipFill>
-                    <a:blip r:embed="rId17"/>
+                    <a:blip r:embed="rId18"/>
                     <a:stretch>
                       <a:fillRect/>
                     </a:stretch>
@@ -2385,7 +2390,7 @@
                   <pic:spPr>
                     <a:xfrm>
                       <a:off x="0" y="0"/>
-                      <a:ext cx="5303520" cy="4525670"/>
+                      <a:ext cx="5303520" cy="4967630"/>
                     </a:xfrm>
                     <a:prstGeom prst="rect"/>
                   </pic:spPr>
@@ -2676,7 +2681,7 @@
                     <pic:cNvPicPr/>
                   </pic:nvPicPr>
                   <pic:blipFill>
-                    <a:blip r:embed="rId18"/>
+                    <a:blip r:embed="rId19"/>
                     <a:stretch>
                       <a:fillRect/>
                     </a:stretch>
@@ -2818,7 +2823,7 @@
                     <pic:cNvPicPr/>
                   </pic:nvPicPr>
                   <pic:blipFill>
-                    <a:blip r:embed="rId19"/>
+                    <a:blip r:embed="rId20"/>
                     <a:stretch>
                       <a:fillRect/>
                     </a:stretch>
@@ -2965,7 +2970,7 @@
                     <pic:cNvPicPr/>
                   </pic:nvPicPr>
                   <pic:blipFill>
-                    <a:blip r:embed="rId20"/>
+                    <a:blip r:embed="rId21"/>
                     <a:stretch>
                       <a:fillRect/>
                     </a:stretch>
@@ -3112,7 +3117,7 @@
                     <pic:cNvPicPr/>
                   </pic:nvPicPr>
                   <pic:blipFill>
-                    <a:blip r:embed="rId21"/>
+                    <a:blip r:embed="rId22"/>
                     <a:stretch>
                       <a:fillRect/>
                     </a:stretch>
@@ -3142,7 +3147,8 @@
       </w:r>
     </w:p>
     <w:sectPr>
-      <w:footerReference w:type="default" r:id="rId22"/>
+      <w:headerReference w:type="default" r:id="rId9"/>
+      <w:footerReference w:type="default" r:id="rId23"/>
       <w:pgSz w:w="12240" w:h="15840"/>
       <w:pgMar w:top="1152" w:right="1224" w:bottom="1152" w:left="1224" w:header="720" w:footer="720" w:gutter="0"/>
       <w:cols w:space="720"/>
@@ -3164,6 +3170,59 @@
     <w:fldSimple w:instr="PAGE"/>
   </w:p>
 </w:ftr>
+</file>
+
+<file path=word/header1.xml><?xml version="1.0" encoding="utf-8"?>
+<w:hdr xmlns:m="http://schemas.openxmlformats.org/officeDocument/2006/math" xmlns:mc="http://schemas.openxmlformats.org/markup-compatibility/2006" xmlns:mo="http://schemas.microsoft.com/office/mac/office/2008/main" xmlns:mv="urn:schemas-microsoft-com:mac:vml" xmlns:o="urn:schemas-microsoft-com:office:office" xmlns:r="http://schemas.openxmlformats.org/officeDocument/2006/relationships" xmlns:v="urn:schemas-microsoft-com:vml" xmlns:w10="urn:schemas-microsoft-com:office:word" xmlns:w14="http://schemas.microsoft.com/office/word/2010/wordml" xmlns:w="http://schemas.openxmlformats.org/wordprocessingml/2006/main" xmlns:wne="http://schemas.microsoft.com/office/word/2006/wordml" xmlns:wp14="http://schemas.microsoft.com/office/word/2010/wordprocessingDrawing" xmlns:wp="http://schemas.openxmlformats.org/drawingml/2006/wordprocessingDrawing" xmlns:wpc="http://schemas.microsoft.com/office/word/2010/wordprocessingCanvas" xmlns:wpg="http://schemas.microsoft.com/office/word/2010/wordprocessingGroup" xmlns:wpi="http://schemas.microsoft.com/office/word/2010/wordprocessingInk" xmlns:wps="http://schemas.microsoft.com/office/word/2010/wordprocessingShape" mc:Ignorable="w14 wp14">
+  <w:p>
+    <w:pPr>
+      <w:pStyle w:val="Header"/>
+      <w:spacing w:after="40"/>
+    </w:pPr>
+    <w:r>
+      <w:drawing>
+        <wp:inline xmlns:a="http://schemas.openxmlformats.org/drawingml/2006/main" xmlns:pic="http://schemas.openxmlformats.org/drawingml/2006/picture">
+          <wp:extent cx="219456" cy="219456"/>
+          <wp:docPr id="1" name="Picture 1"/>
+          <wp:cNvGraphicFramePr>
+            <a:graphicFrameLocks noChangeAspect="1"/>
+          </wp:cNvGraphicFramePr>
+          <a:graphic>
+            <a:graphicData uri="http://schemas.openxmlformats.org/drawingml/2006/picture">
+              <pic:pic>
+                <pic:nvPicPr>
+                  <pic:cNvPr id="0" name="image.png"/>
+                  <pic:cNvPicPr/>
+                </pic:nvPicPr>
+                <pic:blipFill>
+                  <a:blip r:embed="rId1"/>
+                  <a:stretch>
+                    <a:fillRect/>
+                  </a:stretch>
+                </pic:blipFill>
+                <pic:spPr>
+                  <a:xfrm>
+                    <a:off x="0" y="0"/>
+                    <a:ext cx="219456" cy="219456"/>
+                  </a:xfrm>
+                  <a:prstGeom prst="rect"/>
+                </pic:spPr>
+              </pic:pic>
+            </a:graphicData>
+          </a:graphic>
+        </wp:inline>
+      </w:drawing>
+    </w:r>
+    <w:r>
+      <w:rPr>
+        <w:b/>
+        <w:color w:val="CC5500"/>
+        <w:sz w:val="20"/>
+      </w:rPr>
+      <w:t xml:space="preserve">  TMApps Launcher</w:t>
+    </w:r>
+  </w:p>
+</w:hdr>
 </file>
 
 <file path=word/numbering.xml><?xml version="1.0" encoding="utf-8"?>

</xml_diff>

<commit_message>
Release launcher 1.15.1 with corrected KB version guidance
</commit_message>
<xml_diff>
--- a/docs/KB Library.docx
+++ b/docs/KB Library.docx
@@ -20,7 +20,7 @@
     </w:p>
     <w:p>
       <w:r>
-        <w:t>Release 1.15.0  |  23 October 2026  |  DaddyTylerXO</w:t>
+        <w:t>Release 1.15.1  |  23 October 2026  |  DaddyTylerXO</w:t>
       </w:r>
     </w:p>
     <w:p>
@@ -2518,7 +2518,7 @@
         <w:keepNext/>
       </w:pPr>
       <w:r>
-        <w:t>The OS badges show the platforms with actual published builds; a Windows app cannot be installed by the macOS or Linux launcher. Libraries and Finance 0.1.0 now have Windows development packages and their app icons. Their feature sets are incomplete; review Details and release notes before installing.</w:t>
+        <w:t>The OS badges show the platforms with actual published builds; a Windows app cannot be installed by the macOS or Linux launcher. Libraries and Finance have published Windows development packages and their app icons. Their feature sets are incomplete; review Details and release notes before installing.</w:t>
       </w:r>
     </w:p>
     <w:p>
@@ -2610,7 +2610,7 @@
         <w:keepNext/>
       </w:pPr>
       <w:r>
-        <w:t>Finance remains 0.1.0 with budgets, savings and a manual investment workspace. Both apps store records without app-level encryption. No provider key is entered in the launcher.</w:t>
+        <w:t>Finance provides budgets, savings and a manual investment workspace. Both apps store records without app-level encryption. No provider key is entered in the launcher.</w:t>
       </w:r>
     </w:p>
     <w:p>

</xml_diff>

<commit_message>
Align Padlock settings, tour and illustrated KB with suite standards
</commit_message>
<xml_diff>
--- a/docs/KB Library.docx
+++ b/docs/KB Library.docx
@@ -25,88 +25,163 @@
     </w:p>
     <w:p>
       <w:r>
+        <w:t>Suite reference: the TMApps Master KB Library was not yet published on main at verification. This guide preserves Padlock KB IDs for future registry links.</w:t>
+      </w:r>
+    </w:p>
+    <w:p>
+      <w:r>
         <w:t>Keep this guide with your recovery plan. All example accounts and codes in the screenshots are fictional. The same numbered articles are available offline in Settings and can be found with Settings search.</w:t>
       </w:r>
     </w:p>
     <w:p>
+      <w:bookmarkStart w:id="1" w:name="PadlockIndex"/>
       <w:pPr>
         <w:pStyle w:val="Heading1"/>
       </w:pPr>
       <w:r>
         <w:t>Find a guide</w:t>
       </w:r>
+      <w:bookmarkEnd w:id="1"/>
     </w:p>
     <w:p>
       <w:pPr>
         <w:spacing w:after="80"/>
       </w:pPr>
-      <w:r>
-        <w:t>Padlock-KB1  First setup and master password</w:t>
-      </w:r>
+      <w:hyperlink w:anchor="PadlockKB1">
+        <w:r>
+          <w:rPr>
+            <w:color w:val="832B50"/>
+            <w:u w:val="single"/>
+          </w:rPr>
+          <w:t>Padlock-KB1  First setup and master password</w:t>
+        </w:r>
+      </w:hyperlink>
     </w:p>
     <w:p>
       <w:pPr>
         <w:spacing w:after="80"/>
       </w:pPr>
-      <w:r>
-        <w:t>Padlock-KB2  Add and verify an authenticator</w:t>
-      </w:r>
+      <w:hyperlink w:anchor="PadlockKB2">
+        <w:r>
+          <w:rPr>
+            <w:color w:val="832B50"/>
+            <w:u w:val="single"/>
+          </w:rPr>
+          <w:t>Padlock-KB2  Add and verify an authenticator</w:t>
+        </w:r>
+      </w:hyperlink>
     </w:p>
     <w:p>
       <w:pPr>
         <w:spacing w:after="80"/>
       </w:pPr>
-      <w:r>
-        <w:t>Padlock-KB3  Offline codes, expiry timers and clock problems</w:t>
-      </w:r>
+      <w:hyperlink w:anchor="PadlockKB3">
+        <w:r>
+          <w:rPr>
+            <w:color w:val="832B50"/>
+            <w:u w:val="single"/>
+          </w:rPr>
+          <w:t>Padlock-KB3  Offline codes, expiry timers and clock problems</w:t>
+        </w:r>
+      </w:hyperlink>
     </w:p>
     <w:p>
       <w:pPr>
         <w:spacing w:after="80"/>
       </w:pPr>
-      <w:r>
-        <w:t>Padlock-KB4  Encrypted backup, export and import</w:t>
-      </w:r>
+      <w:hyperlink w:anchor="PadlockKB4">
+        <w:r>
+          <w:rPr>
+            <w:color w:val="832B50"/>
+            <w:u w:val="single"/>
+          </w:rPr>
+          <w:t>Padlock-KB4  Encrypted backup, export and import</w:t>
+        </w:r>
+      </w:hyperlink>
     </w:p>
     <w:p>
       <w:pPr>
         <w:spacing w:after="80"/>
       </w:pPr>
-      <w:r>
-        <w:t>Padlock-KB5  Tray and compact authenticator window</w:t>
-      </w:r>
+      <w:hyperlink w:anchor="PadlockKB5">
+        <w:r>
+          <w:rPr>
+            <w:color w:val="832B50"/>
+            <w:u w:val="single"/>
+          </w:rPr>
+          <w:t>Padlock-KB5  Tray and compact authenticator window</w:t>
+        </w:r>
+      </w:hyperlink>
     </w:p>
     <w:p>
       <w:pPr>
         <w:spacing w:after="80"/>
       </w:pPr>
-      <w:r>
-        <w:t>Padlock-KB6  Custom icons and account privacy</w:t>
-      </w:r>
+      <w:hyperlink w:anchor="PadlockKB6">
+        <w:r>
+          <w:rPr>
+            <w:color w:val="832B50"/>
+            <w:u w:val="single"/>
+          </w:rPr>
+          <w:t>Padlock-KB6  Custom icons and account privacy</w:t>
+        </w:r>
+      </w:hyperlink>
     </w:p>
     <w:p>
       <w:pPr>
         <w:spacing w:after="80"/>
       </w:pPr>
-      <w:r>
-        <w:t>Padlock-KB7  Appearance, scheduled colours and performance</w:t>
-      </w:r>
+      <w:hyperlink w:anchor="PadlockKB7">
+        <w:r>
+          <w:rPr>
+            <w:color w:val="832B50"/>
+            <w:u w:val="single"/>
+          </w:rPr>
+          <w:t>Padlock-KB7  Appearance, scheduled colours and performance</w:t>
+        </w:r>
+      </w:hyperlink>
     </w:p>
     <w:p>
       <w:pPr>
         <w:spacing w:after="80"/>
       </w:pPr>
-      <w:r>
-        <w:t>Padlock-KB8  Locking and security boundaries</w:t>
-      </w:r>
+      <w:hyperlink w:anchor="PadlockKB8">
+        <w:r>
+          <w:rPr>
+            <w:color w:val="832B50"/>
+            <w:u w:val="single"/>
+          </w:rPr>
+          <w:t>Padlock-KB8  Locking and security boundaries</w:t>
+        </w:r>
+      </w:hyperlink>
     </w:p>
     <w:p>
       <w:pPr>
         <w:spacing w:after="80"/>
       </w:pPr>
-      <w:r>
-        <w:t>Padlock-KB9  Search, support and reporting</w:t>
-      </w:r>
+      <w:hyperlink w:anchor="PadlockKB9">
+        <w:r>
+          <w:rPr>
+            <w:color w:val="832B50"/>
+            <w:u w:val="single"/>
+          </w:rPr>
+          <w:t>Padlock-KB9  Search, support and reporting</w:t>
+        </w:r>
+      </w:hyperlink>
+    </w:p>
+    <w:p>
+      <w:pPr>
+        <w:spacing w:after="80"/>
+      </w:pPr>
+      <w:hyperlink w:anchor="PadlockKB10">
+        <w:r>
+          <w:rPr>
+            <w:color w:val="832B50"/>
+            <w:u w:val="single"/>
+          </w:rPr>
+          <w:t>Padlock-KB10  Error messages and safe recovery</w:t>
+        </w:r>
+      </w:hyperlink>
     </w:p>
     <w:p>
       <w:pPr>
@@ -116,7 +191,7 @@
       <w:r>
         <w:drawing>
           <wp:inline xmlns:a="http://schemas.openxmlformats.org/drawingml/2006/main" xmlns:pic="http://schemas.openxmlformats.org/drawingml/2006/picture">
-            <wp:extent cx="5029200" cy="3374403"/>
+            <wp:extent cx="3931920" cy="2638170"/>
             <wp:docPr id="1" name="Picture 1"/>
             <wp:cNvGraphicFramePr>
               <a:graphicFrameLocks noChangeAspect="1"/>
@@ -129,7 +204,7 @@
                     <pic:cNvPicPr/>
                   </pic:nvPicPr>
                   <pic:blipFill>
-                    <a:blip r:embed="rId9"/>
+                    <a:blip r:embed="rId11"/>
                     <a:stretch>
                       <a:fillRect/>
                     </a:stretch>
@@ -137,7 +212,7 @@
                   <pic:spPr>
                     <a:xfrm>
                       <a:off x="0" y="0"/>
-                      <a:ext cx="5029200" cy="3374403"/>
+                      <a:ext cx="3931920" cy="2638170"/>
                     </a:xfrm>
                     <a:prstGeom prst="rect"/>
                   </pic:spPr>
@@ -166,12 +241,14 @@
       </w:r>
     </w:p>
     <w:p>
+      <w:bookmarkStart w:id="2" w:name="PadlockKB1"/>
       <w:pPr>
         <w:pStyle w:val="Heading1"/>
       </w:pPr>
       <w:r>
         <w:t>Padlock-KB1 First setup and master password</w:t>
       </w:r>
+      <w:bookmarkEnd w:id="2"/>
     </w:p>
     <w:p>
       <w:r>
@@ -180,16 +257,56 @@
     </w:p>
     <w:p>
       <w:r>
-        <w:t>Portable backup prompts you to choose a separate backup master password. The first-launch demo is fictional and returns you to setup when closed. Related: Padlock-KB4, Padlock-KB8.</w:t>
+        <w:t xml:space="preserve">Portable backup prompts you to choose a separate backup master password. The first-launch demo is fictional and returns you to setup when closed. Related: </w:t>
+      </w:r>
+      <w:hyperlink w:anchor="PadlockKB4">
+        <w:r>
+          <w:rPr>
+            <w:color w:val="832B50"/>
+            <w:u w:val="single"/>
+          </w:rPr>
+          <w:t>Padlock-KB4</w:t>
+        </w:r>
+      </w:hyperlink>
+      <w:r>
+        <w:t xml:space="preserve">, </w:t>
+      </w:r>
+      <w:hyperlink w:anchor="PadlockKB8">
+        <w:r>
+          <w:rPr>
+            <w:color w:val="832B50"/>
+            <w:u w:val="single"/>
+          </w:rPr>
+          <w:t>Padlock-KB8</w:t>
+        </w:r>
+      </w:hyperlink>
+      <w:r>
+        <w:t>.</w:t>
       </w:r>
     </w:p>
     <w:p>
+      <w:pPr>
+        <w:spacing w:after="120"/>
+      </w:pPr>
+      <w:hyperlink w:anchor="PadlockIndex">
+        <w:r>
+          <w:rPr>
+            <w:color w:val="832B50"/>
+            <w:u w:val="single"/>
+          </w:rPr>
+          <w:t>Back to index</w:t>
+        </w:r>
+      </w:hyperlink>
+    </w:p>
+    <w:p>
+      <w:bookmarkStart w:id="3" w:name="PadlockKB2"/>
       <w:pPr>
         <w:pStyle w:val="Heading1"/>
       </w:pPr>
       <w:r>
         <w:t>Padlock-KB2 Add and verify an authenticator</w:t>
       </w:r>
+      <w:bookmarkEnd w:id="3"/>
     </w:p>
     <w:p>
       <w:r>
@@ -203,13 +320,27 @@
     </w:p>
     <w:p>
       <w:pPr>
+        <w:spacing w:after="120"/>
+      </w:pPr>
+      <w:hyperlink w:anchor="PadlockIndex">
+        <w:r>
+          <w:rPr>
+            <w:color w:val="832B50"/>
+            <w:u w:val="single"/>
+          </w:rPr>
+          <w:t>Back to index</w:t>
+        </w:r>
+      </w:hyperlink>
+    </w:p>
+    <w:p>
+      <w:pPr>
         <w:spacing w:after="80"/>
         <w:jc w:val="center"/>
       </w:pPr>
       <w:r>
         <w:drawing>
           <wp:inline xmlns:a="http://schemas.openxmlformats.org/drawingml/2006/main" xmlns:pic="http://schemas.openxmlformats.org/drawingml/2006/picture">
-            <wp:extent cx="6035040" cy="4049284"/>
+            <wp:extent cx="5577840" cy="3742520"/>
             <wp:docPr id="2" name="Picture 2"/>
             <wp:cNvGraphicFramePr>
               <a:graphicFrameLocks noChangeAspect="1"/>
@@ -222,7 +353,7 @@
                     <pic:cNvPicPr/>
                   </pic:nvPicPr>
                   <pic:blipFill>
-                    <a:blip r:embed="rId10"/>
+                    <a:blip r:embed="rId12"/>
                     <a:stretch>
                       <a:fillRect/>
                     </a:stretch>
@@ -230,7 +361,7 @@
                   <pic:spPr>
                     <a:xfrm>
                       <a:off x="0" y="0"/>
-                      <a:ext cx="6035040" cy="4049284"/>
+                      <a:ext cx="5577840" cy="3742520"/>
                     </a:xfrm>
                     <a:prstGeom prst="rect"/>
                   </pic:spPr>
@@ -259,12 +390,14 @@
       </w:r>
     </w:p>
     <w:p>
+      <w:bookmarkStart w:id="4" w:name="PadlockKB3"/>
       <w:pPr>
         <w:pStyle w:val="Heading1"/>
       </w:pPr>
       <w:r>
         <w:t>Padlock-KB3 Offline codes, expiry timers and clock problems</w:t>
       </w:r>
+      <w:bookmarkEnd w:id="4"/>
     </w:p>
     <w:p>
       <w:r>
@@ -278,11 +411,27 @@
     </w:p>
     <w:p>
       <w:pPr>
+        <w:spacing w:after="120"/>
+      </w:pPr>
+      <w:hyperlink w:anchor="PadlockIndex">
+        <w:r>
+          <w:rPr>
+            <w:color w:val="832B50"/>
+            <w:u w:val="single"/>
+          </w:rPr>
+          <w:t>Back to index</w:t>
+        </w:r>
+      </w:hyperlink>
+    </w:p>
+    <w:p>
+      <w:bookmarkStart w:id="5" w:name="PadlockKB4"/>
+      <w:pPr>
         <w:pStyle w:val="Heading1"/>
       </w:pPr>
       <w:r>
         <w:t>Padlock-KB4 Encrypted backup, export and import</w:t>
       </w:r>
+      <w:bookmarkEnd w:id="5"/>
     </w:p>
     <w:p>
       <w:r>
@@ -291,8 +440,46 @@
     </w:p>
     <w:p>
       <w:r>
-        <w:t>Import backup merges into an unlocked vault and requires the source backup password even if your current vault is unlocked. Exact secret/type/algorithm/digits/period matches are skipped; the current account and HOTP counter are retained. Wrong passwords, damaged files and over-limit imports leave the current vault unchanged. Related: Padlock-KB1, Padlock-KB8.</w:t>
+        <w:t xml:space="preserve">Import backup merges into an unlocked vault and requires the source backup password even if your current vault is unlocked. Exact secret/type/algorithm/digits/period matches are skipped; the current account and HOTP counter are retained. Wrong passwords, damaged files and over-limit imports leave the current vault unchanged. Related: </w:t>
       </w:r>
+      <w:hyperlink w:anchor="PadlockKB1">
+        <w:r>
+          <w:rPr>
+            <w:color w:val="832B50"/>
+            <w:u w:val="single"/>
+          </w:rPr>
+          <w:t>Padlock-KB1</w:t>
+        </w:r>
+      </w:hyperlink>
+      <w:r>
+        <w:t xml:space="preserve">, </w:t>
+      </w:r>
+      <w:hyperlink w:anchor="PadlockKB8">
+        <w:r>
+          <w:rPr>
+            <w:color w:val="832B50"/>
+            <w:u w:val="single"/>
+          </w:rPr>
+          <w:t>Padlock-KB8</w:t>
+        </w:r>
+      </w:hyperlink>
+      <w:r>
+        <w:t>.</w:t>
+      </w:r>
+    </w:p>
+    <w:p>
+      <w:pPr>
+        <w:spacing w:after="120"/>
+      </w:pPr>
+      <w:hyperlink w:anchor="PadlockIndex">
+        <w:r>
+          <w:rPr>
+            <w:color w:val="832B50"/>
+            <w:u w:val="single"/>
+          </w:rPr>
+          <w:t>Back to index</w:t>
+        </w:r>
+      </w:hyperlink>
     </w:p>
     <w:p>
       <w:pPr>
@@ -302,7 +489,7 @@
       <w:r>
         <w:drawing>
           <wp:inline xmlns:a="http://schemas.openxmlformats.org/drawingml/2006/main" xmlns:pic="http://schemas.openxmlformats.org/drawingml/2006/picture">
-            <wp:extent cx="6035040" cy="4049284"/>
+            <wp:extent cx="5577840" cy="3742520"/>
             <wp:docPr id="3" name="Picture 3"/>
             <wp:cNvGraphicFramePr>
               <a:graphicFrameLocks noChangeAspect="1"/>
@@ -315,7 +502,7 @@
                     <pic:cNvPicPr/>
                   </pic:nvPicPr>
                   <pic:blipFill>
-                    <a:blip r:embed="rId11"/>
+                    <a:blip r:embed="rId13"/>
                     <a:stretch>
                       <a:fillRect/>
                     </a:stretch>
@@ -323,7 +510,7 @@
                   <pic:spPr>
                     <a:xfrm>
                       <a:off x="0" y="0"/>
-                      <a:ext cx="6035040" cy="4049284"/>
+                      <a:ext cx="5577840" cy="3742520"/>
                     </a:xfrm>
                     <a:prstGeom prst="rect"/>
                   </pic:spPr>
@@ -352,12 +539,14 @@
       </w:r>
     </w:p>
     <w:p>
+      <w:bookmarkStart w:id="6" w:name="PadlockKB5"/>
       <w:pPr>
         <w:pStyle w:val="Heading1"/>
       </w:pPr>
       <w:r>
         <w:t>Padlock-KB5 Tray and compact authenticator window</w:t>
       </w:r>
+      <w:bookmarkEnd w:id="6"/>
     </w:p>
     <w:p>
       <w:r>
@@ -371,11 +560,27 @@
     </w:p>
     <w:p>
       <w:pPr>
+        <w:spacing w:after="120"/>
+      </w:pPr>
+      <w:hyperlink w:anchor="PadlockIndex">
+        <w:r>
+          <w:rPr>
+            <w:color w:val="832B50"/>
+            <w:u w:val="single"/>
+          </w:rPr>
+          <w:t>Back to index</w:t>
+        </w:r>
+      </w:hyperlink>
+    </w:p>
+    <w:p>
+      <w:bookmarkStart w:id="7" w:name="PadlockKB6"/>
+      <w:pPr>
         <w:pStyle w:val="Heading1"/>
       </w:pPr>
       <w:r>
         <w:t>Padlock-KB6 Custom icons and account privacy</w:t>
       </w:r>
+      <w:bookmarkEnd w:id="7"/>
     </w:p>
     <w:p>
       <w:r>
@@ -386,6 +591,20 @@
       <w:r>
         <w:t>Hide code masks the account across windows and persists after restart. Copy still works for hidden codes. Global Hide codes affects the current window. Clipboard codes clear after 20 seconds if the clipboard still contains the copied value.</w:t>
       </w:r>
+    </w:p>
+    <w:p>
+      <w:pPr>
+        <w:spacing w:after="120"/>
+      </w:pPr>
+      <w:hyperlink w:anchor="PadlockIndex">
+        <w:r>
+          <w:rPr>
+            <w:color w:val="832B50"/>
+            <w:u w:val="single"/>
+          </w:rPr>
+          <w:t>Back to index</w:t>
+        </w:r>
+      </w:hyperlink>
     </w:p>
     <w:tbl>
       <w:tblPr>
@@ -421,7 +640,7 @@
                           <pic:cNvPicPr/>
                         </pic:nvPicPr>
                         <pic:blipFill>
-                          <a:blip r:embed="rId12"/>
+                          <a:blip r:embed="rId14"/>
                           <a:stretch>
                             <a:fillRect/>
                           </a:stretch>
@@ -465,7 +684,7 @@
                           <pic:cNvPicPr/>
                         </pic:nvPicPr>
                         <pic:blipFill>
-                          <a:blip r:embed="rId13"/>
+                          <a:blip r:embed="rId15"/>
                           <a:stretch>
                             <a:fillRect/>
                           </a:stretch>
@@ -505,12 +724,14 @@
       </w:r>
     </w:p>
     <w:p>
+      <w:bookmarkStart w:id="8" w:name="PadlockKB7"/>
       <w:pPr>
         <w:pStyle w:val="Heading1"/>
       </w:pPr>
       <w:r>
         <w:t>Padlock-KB7 Appearance, scheduled colours and performance</w:t>
       </w:r>
+      <w:bookmarkEnd w:id="8"/>
     </w:p>
     <w:p>
       <w:r>
@@ -524,13 +745,27 @@
     </w:p>
     <w:p>
       <w:pPr>
+        <w:spacing w:after="120"/>
+      </w:pPr>
+      <w:hyperlink w:anchor="PadlockIndex">
+        <w:r>
+          <w:rPr>
+            <w:color w:val="832B50"/>
+            <w:u w:val="single"/>
+          </w:rPr>
+          <w:t>Back to index</w:t>
+        </w:r>
+      </w:hyperlink>
+    </w:p>
+    <w:p>
+      <w:pPr>
         <w:spacing w:after="80"/>
         <w:jc w:val="center"/>
       </w:pPr>
       <w:r>
         <w:drawing>
           <wp:inline xmlns:a="http://schemas.openxmlformats.org/drawingml/2006/main" xmlns:pic="http://schemas.openxmlformats.org/drawingml/2006/picture">
-            <wp:extent cx="6035040" cy="4049284"/>
+            <wp:extent cx="5577840" cy="3742520"/>
             <wp:docPr id="6" name="Picture 6"/>
             <wp:cNvGraphicFramePr>
               <a:graphicFrameLocks noChangeAspect="1"/>
@@ -543,7 +778,7 @@
                     <pic:cNvPicPr/>
                   </pic:nvPicPr>
                   <pic:blipFill>
-                    <a:blip r:embed="rId14"/>
+                    <a:blip r:embed="rId16"/>
                     <a:stretch>
                       <a:fillRect/>
                     </a:stretch>
@@ -551,7 +786,7 @@
                   <pic:spPr>
                     <a:xfrm>
                       <a:off x="0" y="0"/>
-                      <a:ext cx="6035040" cy="4049284"/>
+                      <a:ext cx="5577840" cy="3742520"/>
                     </a:xfrm>
                     <a:prstGeom prst="rect"/>
                   </pic:spPr>
@@ -585,12 +820,14 @@
       </w:r>
     </w:p>
     <w:p>
+      <w:bookmarkStart w:id="9" w:name="PadlockKB8"/>
       <w:pPr>
         <w:pStyle w:val="Heading1"/>
       </w:pPr>
       <w:r>
         <w:t>Padlock-KB8 Locking and security boundaries</w:t>
       </w:r>
+      <w:bookmarkEnd w:id="9"/>
     </w:p>
     <w:p>
       <w:r>
@@ -604,11 +841,27 @@
     </w:p>
     <w:p>
       <w:pPr>
+        <w:spacing w:after="120"/>
+      </w:pPr>
+      <w:hyperlink w:anchor="PadlockIndex">
+        <w:r>
+          <w:rPr>
+            <w:color w:val="832B50"/>
+            <w:u w:val="single"/>
+          </w:rPr>
+          <w:t>Back to index</w:t>
+        </w:r>
+      </w:hyperlink>
+    </w:p>
+    <w:p>
+      <w:bookmarkStart w:id="10" w:name="PadlockKB9"/>
+      <w:pPr>
         <w:pStyle w:val="Heading1"/>
       </w:pPr>
       <w:r>
         <w:t>Padlock-KB9 Search, support and reporting</w:t>
       </w:r>
+      <w:bookmarkEnd w:id="10"/>
     </w:p>
     <w:p>
       <w:r>
@@ -619,6 +872,20 @@
       <w:r>
         <w:t>Crash report presents a description, optional sanitized diagnostic and a review checkbox. Upload to GitHub Issues opens a prefilled issue; sign in and select Submit new issue on GitHub to finish. Never paste secrets into reports. Diagnostics contain only app version, OS, architecture, timestamps and allowlisted failure categories; no vault contents, raw errors, stack traces or paths. Offline users can read this library and prepare a report later.</w:t>
       </w:r>
+    </w:p>
+    <w:p>
+      <w:pPr>
+        <w:spacing w:after="120"/>
+      </w:pPr>
+      <w:hyperlink w:anchor="PadlockIndex">
+        <w:r>
+          <w:rPr>
+            <w:color w:val="832B50"/>
+            <w:u w:val="single"/>
+          </w:rPr>
+          <w:t>Back to index</w:t>
+        </w:r>
+      </w:hyperlink>
     </w:p>
     <w:p>
       <w:pPr>
@@ -670,7 +937,89 @@
         <w:t>For the security assessment and performance measurements, see security-assessment.md and performance.md in that folder. Related guides: Padlock-KB3 for offline operation, Padlock-KB4 for recovery and Padlock-KB8 for security boundaries.</w:t>
       </w:r>
     </w:p>
+    <w:p>
+      <w:r>
+        <w:br w:type="page"/>
+      </w:r>
+    </w:p>
+    <w:p>
+      <w:bookmarkStart w:id="11" w:name="PadlockKB10"/>
+      <w:pPr>
+        <w:pStyle w:val="Heading1"/>
+      </w:pPr>
+      <w:r>
+        <w:t>Padlock-KB10 Error messages and safe recovery</w:t>
+      </w:r>
+      <w:bookmarkEnd w:id="11"/>
+    </w:p>
+    <w:p>
+      <w:r>
+        <w:t>Could not unlock: check the master password and OS account; do not delete or replace the vault. Too many unlock attempts: wait for the stated cooldown before retrying. Passwords do not match: re-enter both fields using the eye controls if needed. Use a Base32 secret: obtain the manual authenticator setup key from your service; do not paste its login password. Import failed or Backup could not be restored: confirm the source backup master password, file and account limit; the current vault remains unchanged. Vault locked. Try again: unlock and repeat the cancelled operation.</w:t>
+      </w:r>
+    </w:p>
+    <w:p>
+      <w:r>
+        <w:t xml:space="preserve">Vault size limit reached: remove unnecessary custom icons or use smaller images; a failed save rolls back the change. EPERM, EACCES or disk errors: ensure the chosen folder is writable, free up disk space and retry after antivirus scanning finishes; do not weaken OS security controls. Desktop notification could not be displayed: allow Padlock notifications in OS settings and check quiet mode. Report is too long: shorten the description or turn off diagnostics, then review again. If an error persists, use Bug report or a reviewed crash report with sanitized text and steps. Suspected vulnerabilities must be reported privately through the GitHub Security tab; never publish real passwords, codes, setup keys or vault files. Codes and KB guides work offline; reports require internet and GitHub sign-in. Related: </w:t>
+      </w:r>
+      <w:hyperlink w:anchor="PadlockKB4">
+        <w:r>
+          <w:rPr>
+            <w:color w:val="832B50"/>
+            <w:u w:val="single"/>
+          </w:rPr>
+          <w:t>Padlock-KB4</w:t>
+        </w:r>
+      </w:hyperlink>
+      <w:r>
+        <w:t xml:space="preserve">, </w:t>
+      </w:r>
+      <w:hyperlink w:anchor="PadlockKB8">
+        <w:r>
+          <w:rPr>
+            <w:color w:val="832B50"/>
+            <w:u w:val="single"/>
+          </w:rPr>
+          <w:t>Padlock-KB8</w:t>
+        </w:r>
+      </w:hyperlink>
+      <w:r>
+        <w:t xml:space="preserve">, </w:t>
+      </w:r>
+      <w:hyperlink w:anchor="PadlockKB9">
+        <w:r>
+          <w:rPr>
+            <w:color w:val="832B50"/>
+            <w:u w:val="single"/>
+          </w:rPr>
+          <w:t>Padlock-KB9</w:t>
+        </w:r>
+      </w:hyperlink>
+      <w:r>
+        <w:t>.</w:t>
+      </w:r>
+    </w:p>
+    <w:p>
+      <w:pPr>
+        <w:spacing w:after="120"/>
+      </w:pPr>
+      <w:hyperlink w:anchor="PadlockIndex">
+        <w:r>
+          <w:rPr>
+            <w:color w:val="832B50"/>
+            <w:u w:val="single"/>
+          </w:rPr>
+          <w:t>Back to index</w:t>
+        </w:r>
+      </w:hyperlink>
+    </w:p>
+    <w:p>
+      <w:r>
+        <w:t>Keep the original encrypted vault and known-good backups safe while troubleshooting. Never upload a whole application-data folder. When contacting support, include the app version, operating system and architecture, the KB steps you tried and only sanitized error details.</w:t>
+      </w:r>
+    </w:p>
     <w:sectPr>
+      <w:headerReference w:type="default" r:id="rId9"/>
+      <w:footerReference w:type="default" r:id="rId10"/>
       <w:pgSz w:w="11909" w:h="16834"/>
       <w:pgMar w:top="1008" w:right="1152" w:bottom="1008" w:left="1152" w:header="720" w:footer="720" w:gutter="0"/>
       <w:cols w:space="720"/>
@@ -678,6 +1027,81 @@
     </w:sectPr>
   </w:body>
 </w:document>
+</file>
+
+<file path=word/footer1.xml><?xml version="1.0" encoding="utf-8"?>
+<w:ftr xmlns:m="http://schemas.openxmlformats.org/officeDocument/2006/math" xmlns:mc="http://schemas.openxmlformats.org/markup-compatibility/2006" xmlns:mo="http://schemas.microsoft.com/office/mac/office/2008/main" xmlns:mv="urn:schemas-microsoft-com:mac:vml" xmlns:o="urn:schemas-microsoft-com:office:office" xmlns:r="http://schemas.openxmlformats.org/officeDocument/2006/relationships" xmlns:v="urn:schemas-microsoft-com:vml" xmlns:w10="urn:schemas-microsoft-com:office:word" xmlns:w14="http://schemas.microsoft.com/office/word/2010/wordml" xmlns:w="http://schemas.openxmlformats.org/wordprocessingml/2006/main" xmlns:wne="http://schemas.microsoft.com/office/word/2006/wordml" xmlns:wp14="http://schemas.microsoft.com/office/word/2010/wordprocessingDrawing" xmlns:wp="http://schemas.openxmlformats.org/drawingml/2006/wordprocessingDrawing" xmlns:wpc="http://schemas.microsoft.com/office/word/2010/wordprocessingCanvas" xmlns:wpg="http://schemas.microsoft.com/office/word/2010/wordprocessingGroup" xmlns:wpi="http://schemas.microsoft.com/office/word/2010/wordprocessingInk" xmlns:wps="http://schemas.microsoft.com/office/word/2010/wordprocessingShape" mc:Ignorable="w14 wp14">
+  <w:p>
+    <w:pPr>
+      <w:pStyle w:val="Footer"/>
+      <w:jc w:val="right"/>
+    </w:pPr>
+    <w:r>
+      <w:rPr>
+        <w:color w:val="000000"/>
+      </w:rPr>
+      <w:t xml:space="preserve">TMA-Padlock 0.4.0  |  </w:t>
+    </w:r>
+    <w:fldSimple w:instr="PAGE"/>
+  </w:p>
+</w:ftr>
+</file>
+
+<file path=word/header1.xml><?xml version="1.0" encoding="utf-8"?>
+<w:hdr xmlns:m="http://schemas.openxmlformats.org/officeDocument/2006/math" xmlns:mc="http://schemas.openxmlformats.org/markup-compatibility/2006" xmlns:mo="http://schemas.microsoft.com/office/mac/office/2008/main" xmlns:mv="urn:schemas-microsoft-com:mac:vml" xmlns:o="urn:schemas-microsoft-com:office:office" xmlns:r="http://schemas.openxmlformats.org/officeDocument/2006/relationships" xmlns:v="urn:schemas-microsoft-com:vml" xmlns:w10="urn:schemas-microsoft-com:office:word" xmlns:w14="http://schemas.microsoft.com/office/word/2010/wordml" xmlns:w="http://schemas.openxmlformats.org/wordprocessingml/2006/main" xmlns:wne="http://schemas.microsoft.com/office/word/2006/wordml" xmlns:wp14="http://schemas.microsoft.com/office/word/2010/wordprocessingDrawing" xmlns:wp="http://schemas.openxmlformats.org/drawingml/2006/wordprocessingDrawing" xmlns:wpc="http://schemas.microsoft.com/office/word/2010/wordprocessingCanvas" xmlns:wpg="http://schemas.microsoft.com/office/word/2010/wordprocessingGroup" xmlns:wpi="http://schemas.microsoft.com/office/word/2010/wordprocessingInk" xmlns:wps="http://schemas.microsoft.com/office/word/2010/wordprocessingShape" mc:Ignorable="w14 wp14">
+  <w:p>
+    <w:pPr>
+      <w:pStyle w:val="Header"/>
+      <w:spacing w:after="160"/>
+    </w:pPr>
+    <w:r>
+      <w:rPr>
+        <w:color w:val="000000"/>
+        <w:sz w:val="20"/>
+      </w:rPr>
+      <w:drawing>
+        <wp:inline xmlns:a="http://schemas.openxmlformats.org/drawingml/2006/main" xmlns:pic="http://schemas.openxmlformats.org/drawingml/2006/picture">
+          <wp:extent cx="256032" cy="256032"/>
+          <wp:docPr id="1" name="Picture 1"/>
+          <wp:cNvGraphicFramePr>
+            <a:graphicFrameLocks noChangeAspect="1"/>
+          </wp:cNvGraphicFramePr>
+          <a:graphic>
+            <a:graphicData uri="http://schemas.openxmlformats.org/drawingml/2006/picture">
+              <pic:pic>
+                <pic:nvPicPr>
+                  <pic:cNvPr id="0" name="icon.png"/>
+                  <pic:cNvPicPr/>
+                </pic:nvPicPr>
+                <pic:blipFill>
+                  <a:blip r:embed="rId1"/>
+                  <a:stretch>
+                    <a:fillRect/>
+                  </a:stretch>
+                </pic:blipFill>
+                <pic:spPr>
+                  <a:xfrm>
+                    <a:off x="0" y="0"/>
+                    <a:ext cx="256032" cy="256032"/>
+                  </a:xfrm>
+                  <a:prstGeom prst="rect"/>
+                </pic:spPr>
+              </pic:pic>
+            </a:graphicData>
+          </a:graphic>
+        </wp:inline>
+      </w:drawing>
+    </w:r>
+    <w:r>
+      <w:rPr>
+        <w:b/>
+        <w:color w:val="000000"/>
+        <w:sz w:val="20"/>
+      </w:rPr>
+      <w:t xml:space="preserve">  TMA-Padlock  |  KB Library</w:t>
+    </w:r>
+  </w:p>
+</w:hdr>
 </file>
 
 <file path=word/numbering.xml><?xml version="1.0" encoding="utf-8"?>
@@ -1066,6 +1490,10 @@
       </w:tabs>
       <w:spacing w:after="0" w:line="240" w:lineRule="auto"/>
     </w:pPr>
+    <w:rPr>
+      <w:rFonts w:ascii="Calibri" w:hAnsi="Calibri"/>
+      <w:color w:val="000000"/>
+    </w:rPr>
   </w:style>
   <w:style w:type="character" w:customStyle="1" w:styleId="HeaderChar">
     <w:name w:val="Header Char"/>
@@ -1088,6 +1516,10 @@
       </w:tabs>
       <w:spacing w:after="0" w:line="240" w:lineRule="auto"/>
     </w:pPr>
+    <w:rPr>
+      <w:rFonts w:ascii="Calibri" w:hAnsi="Calibri"/>
+      <w:color w:val="000000"/>
+    </w:rPr>
   </w:style>
   <w:style w:type="character" w:customStyle="1" w:styleId="FooterChar">
     <w:name w:val="Footer Char"/>

</xml_diff>

<commit_message>
Add offline dashboard, encrypted API/cards and searchable accessible Settings
</commit_message>
<xml_diff>
--- a/docs/KB Library.docx
+++ b/docs/KB Library.docx
@@ -101,6 +101,50 @@
             <w:u w:val="single"/>
           </w:rPr>
           <w:t>Safe-KB4  Troubleshooting and safe support</w:t>
+        </w:r>
+      </w:hyperlink>
+    </w:p>
+    <w:p>
+      <w:hyperlink w:anchor="SafeKB5">
+        <w:r>
+          <w:rPr>
+            <w:color w:val="7048A4"/>
+            <w:u w:val="single"/>
+          </w:rPr>
+          <w:t>Safe-KB5  Appearance accessibility and password defaults</w:t>
+        </w:r>
+      </w:hyperlink>
+    </w:p>
+    <w:p>
+      <w:hyperlink w:anchor="SafeKB6">
+        <w:r>
+          <w:rPr>
+            <w:color w:val="7048A4"/>
+            <w:u w:val="single"/>
+          </w:rPr>
+          <w:t>Safe-KB6  Store API credentials and cards</w:t>
+        </w:r>
+      </w:hyperlink>
+    </w:p>
+    <w:p>
+      <w:hyperlink w:anchor="SafeKB7">
+        <w:r>
+          <w:rPr>
+            <w:color w:val="7048A4"/>
+            <w:u w:val="single"/>
+          </w:rPr>
+          <w:t>Safe-KB7  Offline health dashboard and reported breaches</w:t>
+        </w:r>
+      </w:hyperlink>
+    </w:p>
+    <w:p>
+      <w:hyperlink w:anchor="SafeKB8">
+        <w:r>
+          <w:rPr>
+            <w:color w:val="7048A4"/>
+            <w:u w:val="single"/>
+          </w:rPr>
+          <w:t>Safe-KB8  Encrypted imports and reviewed support drafts</w:t>
         </w:r>
       </w:hyperlink>
     </w:p>
@@ -222,6 +266,23 @@
       </w:hyperlink>
       <w:r>
         <w:t xml:space="preserve"> for unlock errors. This feature works offline.</w:t>
+      </w:r>
+    </w:p>
+    <w:p>
+      <w:r>
+        <w:t xml:space="preserve">On first launch, choose Take the tour, Skip, or Accessibility. The tour uses fictional records and locks the real vault. Back, Next and Exit guide you around visible controls; after a first-setup tour you return to vault creation. Replay it from Settings. See </w:t>
+      </w:r>
+      <w:hyperlink w:anchor="SafeKB5">
+        <w:r>
+          <w:rPr>
+            <w:color w:val="7048A4"/>
+            <w:u w:val="single"/>
+          </w:rPr>
+          <w:t>Safe-KB5</w:t>
+        </w:r>
+      </w:hyperlink>
+      <w:r>
+        <w:t xml:space="preserve"> for accessibility choices.</w:t>
       </w:r>
     </w:p>
     <w:p>
@@ -356,7 +417,7 @@
       <w:r>
         <w:drawing>
           <wp:inline xmlns:a="http://schemas.openxmlformats.org/drawingml/2006/main" xmlns:pic="http://schemas.openxmlformats.org/drawingml/2006/picture">
-            <wp:extent cx="2880360" cy="3152758"/>
+            <wp:extent cx="5897880" cy="3845001"/>
             <wp:docPr id="3" name="Picture 3"/>
             <wp:cNvGraphicFramePr>
               <a:graphicFrameLocks noChangeAspect="1"/>
@@ -377,7 +438,7 @@
                   <pic:spPr>
                     <a:xfrm>
                       <a:off x="0" y="0"/>
-                      <a:ext cx="2880360" cy="3152758"/>
+                      <a:ext cx="5897880" cy="3845001"/>
                     </a:xfrm>
                     <a:prstGeom prst="rect"/>
                   </pic:spPr>
@@ -398,7 +459,7 @@
     </w:p>
     <w:p>
       <w:r>
-        <w:t>Settings is available while locked or unlocked. Startup opens a locked app. Close to tray requires Show tray and locks immediately. Tray availability depends on the desktop environment.</w:t>
+        <w:t>Settings is available while locked or unlocked. Search settings by keywords; sections use the common two-column panel layout. Feature request, Bug report, Issue report, Help and Crash report remain on the main Settings screen. Startup opens a locked app. Close to tray locks immediately.</w:t>
       </w:r>
     </w:p>
     <w:p>
@@ -414,6 +475,35 @@
     <w:p>
       <w:r>
         <w:t>Each save retains an encrypted .bak of the previous version. Keep backups safe because they retain older passwords. Unlocking uses about 128 MiB for scrypt, briefly increasing CPU/RAM usage; it is deliberate password-guessing resistance. This app has no cloud service or paid integration.</w:t>
+      </w:r>
+    </w:p>
+    <w:p>
+      <w:r>
+        <w:t xml:space="preserve">The original purple Bubble layout remains the default. Grey and black palettes, schedules, accessibility options and password defaults are explained in </w:t>
+      </w:r>
+      <w:hyperlink w:anchor="SafeKB5">
+        <w:r>
+          <w:rPr>
+            <w:color w:val="7048A4"/>
+            <w:u w:val="single"/>
+          </w:rPr>
+          <w:t>Safe-KB5</w:t>
+        </w:r>
+      </w:hyperlink>
+      <w:r>
+        <w:t xml:space="preserve">. See </w:t>
+      </w:r>
+      <w:hyperlink w:anchor="SafeKB8">
+        <w:r>
+          <w:rPr>
+            <w:color w:val="7048A4"/>
+            <w:u w:val="single"/>
+          </w:rPr>
+          <w:t>Safe-KB8</w:t>
+        </w:r>
+      </w:hyperlink>
+      <w:r>
+        <w:t xml:space="preserve"> for encrypted import and support drafts.</w:t>
       </w:r>
     </w:p>
     <w:p>
@@ -479,7 +569,7 @@
     </w:p>
     <w:p>
       <w:r>
-        <w:t xml:space="preserve">The app is an unsigned beta without an independent audit. AES-256-GCM protects vault data at rest; the provider has no account, recovery key or remote vault access. A compromised computer can capture unlocked data. No dark-web/breach lookup or passkey provider is implemented. See </w:t>
+        <w:t xml:space="preserve">The app is an unsigned beta without an independent audit. AES-256-GCM protects all vault data at rest, including API and card secrets; no provider has a recovery key or remote vault access. A compromised computer can capture unlocked data. Online breach monitoring, passkeys, TOTP and Windows Hello are not implemented. See </w:t>
       </w:r>
       <w:hyperlink w:anchor="SafeKB1">
         <w:r>
@@ -491,7 +581,369 @@
         </w:r>
       </w:hyperlink>
       <w:r>
-        <w:t xml:space="preserve"> for recovery precautions.</w:t>
+        <w:t xml:space="preserve"> for recovery precautions and </w:t>
+      </w:r>
+      <w:hyperlink w:anchor="SafeKB7">
+        <w:r>
+          <w:rPr>
+            <w:color w:val="7048A4"/>
+            <w:u w:val="single"/>
+          </w:rPr>
+          <w:t>Safe-KB7</w:t>
+        </w:r>
+      </w:hyperlink>
+      <w:r>
+        <w:t xml:space="preserve"> for offline health checks.</w:t>
+      </w:r>
+    </w:p>
+    <w:p>
+      <w:r>
+        <w:br w:type="page"/>
+      </w:r>
+    </w:p>
+    <w:p>
+      <w:bookmarkStart w:id="5" w:name="SafeKB5"/>
+      <w:pPr>
+        <w:pStyle w:val="Heading1"/>
+      </w:pPr>
+      <w:r>
+        <w:t>Safe-KB5  Appearance accessibility and password defaults</w:t>
+      </w:r>
+      <w:bookmarkEnd w:id="5"/>
+    </w:p>
+    <w:p>
+      <w:hyperlink w:anchor="Index">
+        <w:r>
+          <w:rPr>
+            <w:color w:val="7048A4"/>
+            <w:u w:val="single"/>
+          </w:rPr>
+          <w:t>Back to index</w:t>
+        </w:r>
+      </w:hyperlink>
+    </w:p>
+    <w:p>
+      <w:r>
+        <w:drawing>
+          <wp:inline xmlns:a="http://schemas.openxmlformats.org/drawingml/2006/main" xmlns:pic="http://schemas.openxmlformats.org/drawingml/2006/picture">
+            <wp:extent cx="5897880" cy="3845001"/>
+            <wp:docPr id="4" name="Picture 4"/>
+            <wp:cNvGraphicFramePr>
+              <a:graphicFrameLocks noChangeAspect="1"/>
+            </wp:cNvGraphicFramePr>
+            <a:graphic>
+              <a:graphicData uri="http://schemas.openxmlformats.org/drawingml/2006/picture">
+                <pic:pic>
+                  <pic:nvPicPr>
+                    <pic:cNvPr id="0" name="settings.png"/>
+                    <pic:cNvPicPr/>
+                  </pic:nvPicPr>
+                  <pic:blipFill>
+                    <a:blip r:embed="rId15"/>
+                    <a:stretch>
+                      <a:fillRect/>
+                    </a:stretch>
+                  </pic:blipFill>
+                  <pic:spPr>
+                    <a:xfrm>
+                      <a:off x="0" y="0"/>
+                      <a:ext cx="5897880" cy="3845001"/>
+                    </a:xfrm>
+                    <a:prstGeom prst="rect"/>
+                  </pic:spPr>
+                </pic:pic>
+              </a:graphicData>
+            </a:graphic>
+          </wp:inline>
+        </w:drawing>
+      </w:r>
+    </w:p>
+    <w:p>
+      <w:pPr>
+        <w:pStyle w:val="Caption"/>
+      </w:pPr>
+      <w:r>
+        <w:t>Searchable Settings with categories, support actions and saved preferences.</w:t>
+      </w:r>
+    </w:p>
+    <w:p>
+      <w:r>
+        <w:t>Original Bubble remains the default layout. Under Appearance choose Purple, Toned-back grey or Black. Enable a scheduled background, enter local start and return times, and choose an instant or gradual transition from 2 to 60 minutes. The transition must fit within both time intervals. Changes are saved with Save settings.</w:t>
+      </w:r>
+    </w:p>
+    <w:p>
+      <w:r>
+        <w:t>The app calculates progress from the clock, so reopening during a transition resumes the appropriate colours. It checks the clock at most once a minute outside transitions and updates at most twice a minute during them. Reduced motion makes colour changes instant. This is a display preference, not a medical treatment.</w:t>
+      </w:r>
+    </w:p>
+    <w:p>
+      <w:r>
+        <w:t>Accessibility offers 100–200% interface magnification, higher contrast and reduced motion. Optional adaptations are off by default. Native semantic labels and keyboard focus are always available. OS screen readers can read these controls; full manual testing with every assistive technology is not certified.</w:t>
+      </w:r>
+    </w:p>
+    <w:p>
+      <w:r>
+        <w:t>Password defaults set length and character groups for future generation. At least one group must remain selected. Existing passwords are unchanged. Settings search can include KB guides or exclude them using Include KB guides; Help still shows every guide. All these functions work offline.</w:t>
+      </w:r>
+    </w:p>
+    <w:p>
+      <w:r>
+        <w:br w:type="page"/>
+      </w:r>
+    </w:p>
+    <w:p>
+      <w:bookmarkStart w:id="6" w:name="SafeKB6"/>
+      <w:pPr>
+        <w:pStyle w:val="Heading1"/>
+      </w:pPr>
+      <w:r>
+        <w:t>Safe-KB6  Store API credentials and cards</w:t>
+      </w:r>
+      <w:bookmarkEnd w:id="6"/>
+    </w:p>
+    <w:p>
+      <w:hyperlink w:anchor="Index">
+        <w:r>
+          <w:rPr>
+            <w:color w:val="7048A4"/>
+            <w:u w:val="single"/>
+          </w:rPr>
+          <w:t>Back to index</w:t>
+        </w:r>
+      </w:hyperlink>
+    </w:p>
+    <w:p>
+      <w:r>
+        <w:drawing>
+          <wp:inline xmlns:a="http://schemas.openxmlformats.org/drawingml/2006/main" xmlns:pic="http://schemas.openxmlformats.org/drawingml/2006/picture">
+            <wp:extent cx="2880360" cy="3744971"/>
+            <wp:docPr id="5" name="Picture 5"/>
+            <wp:cNvGraphicFramePr>
+              <a:graphicFrameLocks noChangeAspect="1"/>
+            </wp:cNvGraphicFramePr>
+            <a:graphic>
+              <a:graphicData uri="http://schemas.openxmlformats.org/drawingml/2006/picture">
+                <pic:pic>
+                  <pic:nvPicPr>
+                    <pic:cNvPr id="0" name="api-editor.png"/>
+                    <pic:cNvPicPr/>
+                  </pic:nvPicPr>
+                  <pic:blipFill>
+                    <a:blip r:embed="rId16"/>
+                    <a:stretch>
+                      <a:fillRect/>
+                    </a:stretch>
+                  </pic:blipFill>
+                  <pic:spPr>
+                    <a:xfrm>
+                      <a:off x="0" y="0"/>
+                      <a:ext cx="2880360" cy="3744971"/>
+                    </a:xfrm>
+                    <a:prstGeom prst="rect"/>
+                  </pic:spPr>
+                </pic:pic>
+              </a:graphicData>
+            </a:graphic>
+          </wp:inline>
+        </w:drawing>
+      </w:r>
+    </w:p>
+    <w:p>
+      <w:pPr>
+        <w:pStyle w:val="Caption"/>
+      </w:pPr>
+      <w:r>
+        <w:t>A fictional API record with its client secret masked.</w:t>
+      </w:r>
+    </w:p>
+    <w:p>
+      <w:r>
+        <w:t>Choose API credential to add App Name, Email, Client ID and Client Secret. Choose a folder, optional update reminder and notes. Secret reveal is temporary; leave an existing secret untouched when editing to keep it. The Client ID is visible as record metadata while unlocked, but remains encrypted on disk.</w:t>
+      </w:r>
+    </w:p>
+    <w:p>
+      <w:r>
+        <w:t>Choose Card to store a card name, cardholder, number, expiry in MM/YY and an optional 3–4 digit security code. Numbers and codes remain masked in the editor until revealed. Copy card number copies the number only, not the security code.</w:t>
+      </w:r>
+    </w:p>
+    <w:p>
+      <w:r>
+        <w:t>Use the API credentials or Cards sidebar filters to find records. Edit opens the appropriate form; Delete record asks for confirmation. Folders and encrypted backups include these records. API secrets and card data are excluded from ordinary website login filling. Payment-form filling is not implemented.</w:t>
+      </w:r>
+    </w:p>
+    <w:p>
+      <w:r>
+        <w:t xml:space="preserve">These fields are encrypted using the same vault key as other records. They are available offline and are not uploaded to an API provider. Enter credentials issued by your provider; storing a value here does not configure or authenticate the external service. See </w:t>
+      </w:r>
+      <w:hyperlink w:anchor="SafeKB8">
+        <w:r>
+          <w:rPr>
+            <w:color w:val="7048A4"/>
+            <w:u w:val="single"/>
+          </w:rPr>
+          <w:t>Safe-KB8</w:t>
+        </w:r>
+      </w:hyperlink>
+      <w:r>
+        <w:t xml:space="preserve"> before moving records between vaults.</w:t>
+      </w:r>
+    </w:p>
+    <w:p>
+      <w:r>
+        <w:br w:type="page"/>
+      </w:r>
+    </w:p>
+    <w:p>
+      <w:bookmarkStart w:id="7" w:name="SafeKB7"/>
+      <w:pPr>
+        <w:pStyle w:val="Heading1"/>
+      </w:pPr>
+      <w:r>
+        <w:t>Safe-KB7  Offline health dashboard and reported breaches</w:t>
+      </w:r>
+      <w:bookmarkEnd w:id="7"/>
+    </w:p>
+    <w:p>
+      <w:hyperlink w:anchor="Index">
+        <w:r>
+          <w:rPr>
+            <w:color w:val="7048A4"/>
+            <w:u w:val="single"/>
+          </w:rPr>
+          <w:t>Back to index</w:t>
+        </w:r>
+      </w:hyperlink>
+    </w:p>
+    <w:p>
+      <w:r>
+        <w:drawing>
+          <wp:inline xmlns:a="http://schemas.openxmlformats.org/drawingml/2006/main" xmlns:pic="http://schemas.openxmlformats.org/drawingml/2006/picture">
+            <wp:extent cx="5897880" cy="3845001"/>
+            <wp:docPr id="6" name="Picture 6"/>
+            <wp:cNvGraphicFramePr>
+              <a:graphicFrameLocks noChangeAspect="1"/>
+            </wp:cNvGraphicFramePr>
+            <a:graphic>
+              <a:graphicData uri="http://schemas.openxmlformats.org/drawingml/2006/picture">
+                <pic:pic>
+                  <pic:nvPicPr>
+                    <pic:cNvPr id="0" name="dashboard.png"/>
+                    <pic:cNvPicPr/>
+                  </pic:nvPicPr>
+                  <pic:blipFill>
+                    <a:blip r:embed="rId17"/>
+                    <a:stretch>
+                      <a:fillRect/>
+                    </a:stretch>
+                  </pic:blipFill>
+                  <pic:spPr>
+                    <a:xfrm>
+                      <a:off x="0" y="0"/>
+                      <a:ext cx="5897880" cy="3845001"/>
+                    </a:xfrm>
+                    <a:prstGeom prst="rect"/>
+                  </pic:spPr>
+                </pic:pic>
+              </a:graphicData>
+            </a:graphic>
+          </wp:inline>
+        </w:drawing>
+      </w:r>
+    </w:p>
+    <w:p>
+      <w:pPr>
+        <w:pStyle w:val="Caption"/>
+      </w:pPr>
+      <w:r>
+        <w:t>Offline widgets using fictional records and deliberately reused demonstration passwords.</w:t>
+      </w:r>
+    </w:p>
+    <w:p>
+      <w:r>
+        <w:t>Open Dashboard to choose widgets for stored records, short login passwords, reused login passwords, due reminders and manually reported breaches. Select the widgets and Save widget choices. Preferences are saved on this device.</w:t>
+      </w:r>
+    </w:p>
+    <w:p>
+      <w:r>
+        <w:t>Short means fewer than 12 characters; reuse means identical nonempty login passwords. These are local health signals, not a complete strength analysis or proof that a password was breached. API client secrets and card payloads are excluded from login reuse checks.</w:t>
+      </w:r>
+    </w:p>
+    <w:p>
+      <w:r>
+        <w:t>If you have your own reliable breach report, edit the record and select Manually reported breach, then enter a reference or note. A red Reported breach warning appears on that record. The application does not verify your report or query a dark-web, email or password-breach service. No account, username, password or hash is sent online.</w:t>
+      </w:r>
+    </w:p>
+    <w:p>
+      <w:r>
+        <w:t>Daily snapshots keep the last measured counts for each UTC day when you changed the vault, up to 90 days. Days without changes have no new measurement. Snapshots are encrypted inside the vault and reflect your local records and entered reports; they do not measure worldwide breach activity. Locking clears the dashboard.</w:t>
+      </w:r>
+    </w:p>
+    <w:p>
+      <w:r>
+        <w:br w:type="page"/>
+      </w:r>
+    </w:p>
+    <w:p>
+      <w:bookmarkStart w:id="8" w:name="SafeKB8"/>
+      <w:pPr>
+        <w:pStyle w:val="Heading1"/>
+      </w:pPr>
+      <w:r>
+        <w:t>Safe-KB8  Encrypted imports and reviewed support drafts</w:t>
+      </w:r>
+      <w:bookmarkEnd w:id="8"/>
+    </w:p>
+    <w:p>
+      <w:hyperlink w:anchor="Index">
+        <w:r>
+          <w:rPr>
+            <w:color w:val="7048A4"/>
+            <w:u w:val="single"/>
+          </w:rPr>
+          <w:t>Back to index</w:t>
+        </w:r>
+      </w:hyperlink>
+    </w:p>
+    <w:p>
+      <w:r>
+        <w:t>To export or back up, open Vault &amp; security and Save an encrypted portable copy. This exports a complete encrypted .tmasafe file, not plaintext CSV. Keep any required key file separately. Exported copies are independent; they do not synchronise.</w:t>
+      </w:r>
+    </w:p>
+    <w:p>
+      <w:r>
+        <w:t>To merge an encrypted file, unlock the destination vault and choose Import an encrypted vault. Enter the imported vault’s own master password and indicate whether it requires a separate key file. Choose that vault and, if required, its original key file. A wrong password or key does not partially import records.</w:t>
+      </w:r>
+    </w:p>
+    <w:p>
+      <w:r>
+        <w:t xml:space="preserve">The import preserves folders by matching names and creating missing folders. It assigns new record IDs and skips exact duplicate credentials. Logins, API credentials and cards are supported. The source file remains unchanged. Locking during import cancels the operation; an encrypted save already in progress may finish on disk. See </w:t>
+      </w:r>
+      <w:hyperlink w:anchor="SafeKB4">
+        <w:r>
+          <w:rPr>
+            <w:color w:val="7048A4"/>
+            <w:u w:val="single"/>
+          </w:rPr>
+          <w:t>Safe-KB4</w:t>
+        </w:r>
+      </w:hyperlink>
+      <w:r>
+        <w:t xml:space="preserve"> for recovery.</w:t>
+      </w:r>
+    </w:p>
+    <w:p>
+      <w:r>
+        <w:t>The main Settings screen offers Feature request, Bug report, Issue report and Crash report. The app prepares an app/version/platform draft with only fixed sanitised error categories. Raw messages and stacks may contain private data and are omitted. Review the native preview, open the GitHub draft and submit it yourself in the browser. No issue is silently submitted. You can edit the draft on GitHub before submitting it.</w:t>
+      </w:r>
+    </w:p>
+    <w:p>
+      <w:r>
+        <w:t>Support links require internet and GitHub may require you to sign in. The offline KB remains available without it. Never attach a vault, key file, browser CSV, private screenshots or pairing code. Security vulnerabilities belong in the private GitHub reporting flow, not a public issue.</w:t>
+      </w:r>
+    </w:p>
+    <w:p>
+      <w:r>
+        <w:t>Passkey hosting, generated-password signup capture, automatic login, payment-form filling and Travel Mode are still unavailable. Optional cryptographic MFA currently means a separately stored key file selected during vault creation; authenticator TOTP and Windows Hello have not been added.</w:t>
       </w:r>
     </w:p>
     <w:sectPr>
@@ -517,7 +969,7 @@
         <w:color w:val="7048A4"/>
         <w:sz w:val="18"/>
       </w:rPr>
-      <w:t xml:space="preserve">TMA-Safe 0.2.3  |  23 October 2026  |  </w:t>
+      <w:t xml:space="preserve">TMA-Safe 0.3.0  |  24 October 2026  |  </w:t>
     </w:r>
     <w:fldSimple w:instr="PAGE"/>
   </w:p>

</xml_diff>